<commit_message>
git project 1 > first try finish
</commit_message>
<xml_diff>
--- a/gsap/GSAP.docx
+++ b/gsap/GSAP.docx
@@ -4,23 +4,7 @@
   <w:body>
     <w:p>
       <w:r>
-        <w:t xml:space="preserve">&lt;script src="https://cdnjs.cloudflare.com/ajax/libs/gsap/3.13.0/gsap.min.js" integrity="sha512-NcZdtrT77bJr4STcmsGAESr06BYGE8woZdSdEgqnpyqac7sugNO+Tr4bGwGF3MsnEkGKhU2KL2xh6Ec+BqsaHA==" </w:t>
-      </w:r>
-      <w:proofErr w:type="spellStart"/>
-      <w:r>
-        <w:t>crossorigin</w:t>
-      </w:r>
-      <w:proofErr w:type="spellEnd"/>
-      <w:r>
-        <w:t xml:space="preserve">="anonymous" </w:t>
-      </w:r>
-      <w:proofErr w:type="spellStart"/>
-      <w:r>
-        <w:t>referrerpolicy</w:t>
-      </w:r>
-      <w:proofErr w:type="spellEnd"/>
-      <w:r>
-        <w:t>="no-referrer"&gt;&lt;/script&gt;</w:t>
+        <w:t>&lt;script src="https://cdnjs.cloudflare.com/ajax/libs/gsap/3.13.0/gsap.min.js" integrity="sha512-NcZdtrT77bJr4STcmsGAESr06BYGE8woZdSdEgqnpyqac7sugNO+Tr4bGwGF3MsnEkGKhU2KL2xh6Ec+BqsaHA==" crossorigin="anonymous" referrerpolicy="no-referrer"&gt;&lt;/script&gt;</w:t>
       </w:r>
     </w:p>
     <w:p>
@@ -43,7 +27,6 @@
         </w:rPr>
         <w:t xml:space="preserve">//rotate and move elements with a class of "box" ("x" is a shortcut for a </w:t>
       </w:r>
-      <w:proofErr w:type="spellStart"/>
       <w:proofErr w:type="gramStart"/>
       <w:r>
         <w:rPr>
@@ -54,9 +37,9 @@
           <w:color w:val="9C9C9C"/>
           <w:shd w:val="clear" w:color="auto" w:fill="28292B"/>
         </w:rPr>
-        <w:t>translateX</w:t>
-      </w:r>
-      <w:proofErr w:type="spellEnd"/>
+        <w:t>translateX(</w:t>
+      </w:r>
+      <w:proofErr w:type="gramEnd"/>
       <w:r>
         <w:rPr>
           <w:rStyle w:val="token"/>
@@ -66,9 +49,587 @@
           <w:color w:val="9C9C9C"/>
           <w:shd w:val="clear" w:color="auto" w:fill="28292B"/>
         </w:rPr>
+        <w:t>) transform) over the course of 1 second.</w:t>
+      </w:r>
+      <w:r>
+        <w:rPr>
+          <w:rFonts w:ascii="Fraktion Mono" w:hAnsi="Fraktion Mono"/>
+          <w:color w:val="BFC7D5"/>
+          <w:shd w:val="clear" w:color="auto" w:fill="28292B"/>
+        </w:rPr>
+        <w:br/>
+      </w:r>
+      <w:proofErr w:type="gramStart"/>
+      <w:r>
+        <w:rPr>
+          <w:rStyle w:val="token"/>
+          <w:rFonts w:ascii="Fraktion Mono" w:hAnsi="Fraktion Mono"/>
+          <w:color w:val="BFC7D5"/>
+          <w:shd w:val="clear" w:color="auto" w:fill="28292B"/>
+        </w:rPr>
+        <w:t>gsap</w:t>
+      </w:r>
+      <w:r>
+        <w:rPr>
+          <w:rStyle w:val="token"/>
+          <w:rFonts w:ascii="Fraktion Mono" w:hAnsi="Fraktion Mono"/>
+          <w:color w:val="C792EA"/>
+          <w:shd w:val="clear" w:color="auto" w:fill="28292B"/>
+        </w:rPr>
+        <w:t>.</w:t>
+      </w:r>
+      <w:r>
+        <w:rPr>
+          <w:rStyle w:val="token"/>
+          <w:rFonts w:ascii="Fraktion Mono" w:hAnsi="Fraktion Mono"/>
+          <w:color w:val="82AAFF"/>
+          <w:shd w:val="clear" w:color="auto" w:fill="28292B"/>
+        </w:rPr>
+        <w:t>to</w:t>
+      </w:r>
+      <w:r>
+        <w:rPr>
+          <w:rStyle w:val="token"/>
+          <w:rFonts w:ascii="Fraktion Mono" w:hAnsi="Fraktion Mono"/>
+          <w:color w:val="C792EA"/>
+          <w:shd w:val="clear" w:color="auto" w:fill="28292B"/>
+        </w:rPr>
         <w:t>(</w:t>
       </w:r>
       <w:proofErr w:type="gramEnd"/>
+      <w:r>
+        <w:rPr>
+          <w:rStyle w:val="token"/>
+          <w:rFonts w:ascii="Fraktion Mono" w:hAnsi="Fraktion Mono"/>
+          <w:color w:val="63D55A"/>
+          <w:shd w:val="clear" w:color="auto" w:fill="28292B"/>
+        </w:rPr>
+        <w:t>".box"</w:t>
+      </w:r>
+      <w:r>
+        <w:rPr>
+          <w:rStyle w:val="token"/>
+          <w:rFonts w:ascii="Fraktion Mono" w:hAnsi="Fraktion Mono"/>
+          <w:color w:val="C792EA"/>
+          <w:shd w:val="clear" w:color="auto" w:fill="28292B"/>
+        </w:rPr>
+        <w:t>,</w:t>
+      </w:r>
+      <w:r>
+        <w:rPr>
+          <w:rStyle w:val="token"/>
+          <w:rFonts w:ascii="Fraktion Mono" w:hAnsi="Fraktion Mono"/>
+          <w:color w:val="BFC7D5"/>
+          <w:shd w:val="clear" w:color="auto" w:fill="28292B"/>
+        </w:rPr>
+        <w:t xml:space="preserve"> </w:t>
+      </w:r>
+      <w:r>
+        <w:rPr>
+          <w:rStyle w:val="token"/>
+          <w:rFonts w:ascii="Fraktion Mono" w:hAnsi="Fraktion Mono"/>
+          <w:color w:val="C792EA"/>
+          <w:shd w:val="clear" w:color="auto" w:fill="28292B"/>
+        </w:rPr>
+        <w:t>{</w:t>
+      </w:r>
+      <w:r>
+        <w:rPr>
+          <w:rStyle w:val="token"/>
+          <w:rFonts w:ascii="Fraktion Mono" w:hAnsi="Fraktion Mono"/>
+          <w:color w:val="BFC7D5"/>
+          <w:shd w:val="clear" w:color="auto" w:fill="28292B"/>
+        </w:rPr>
+        <w:t xml:space="preserve"> rotation</w:t>
+      </w:r>
+      <w:r>
+        <w:rPr>
+          <w:rStyle w:val="token"/>
+          <w:rFonts w:ascii="Fraktion Mono" w:hAnsi="Fraktion Mono"/>
+          <w:color w:val="89DDFF"/>
+          <w:shd w:val="clear" w:color="auto" w:fill="28292B"/>
+        </w:rPr>
+        <w:t>:</w:t>
+      </w:r>
+      <w:r>
+        <w:rPr>
+          <w:rStyle w:val="token"/>
+          <w:rFonts w:ascii="Fraktion Mono" w:hAnsi="Fraktion Mono"/>
+          <w:color w:val="BFC7D5"/>
+          <w:shd w:val="clear" w:color="auto" w:fill="28292B"/>
+        </w:rPr>
+        <w:t xml:space="preserve"> </w:t>
+      </w:r>
+      <w:r>
+        <w:rPr>
+          <w:rStyle w:val="token"/>
+          <w:rFonts w:ascii="Fraktion Mono" w:hAnsi="Fraktion Mono"/>
+          <w:color w:val="F78C6C"/>
+          <w:shd w:val="clear" w:color="auto" w:fill="28292B"/>
+        </w:rPr>
+        <w:t>27</w:t>
+      </w:r>
+      <w:r>
+        <w:rPr>
+          <w:rStyle w:val="token"/>
+          <w:rFonts w:ascii="Fraktion Mono" w:hAnsi="Fraktion Mono"/>
+          <w:color w:val="C792EA"/>
+          <w:shd w:val="clear" w:color="auto" w:fill="28292B"/>
+        </w:rPr>
+        <w:t>,</w:t>
+      </w:r>
+      <w:r>
+        <w:rPr>
+          <w:rStyle w:val="token"/>
+          <w:rFonts w:ascii="Fraktion Mono" w:hAnsi="Fraktion Mono"/>
+          <w:color w:val="BFC7D5"/>
+          <w:shd w:val="clear" w:color="auto" w:fill="28292B"/>
+        </w:rPr>
+        <w:t xml:space="preserve"> x</w:t>
+      </w:r>
+      <w:r>
+        <w:rPr>
+          <w:rStyle w:val="token"/>
+          <w:rFonts w:ascii="Fraktion Mono" w:hAnsi="Fraktion Mono"/>
+          <w:color w:val="89DDFF"/>
+          <w:shd w:val="clear" w:color="auto" w:fill="28292B"/>
+        </w:rPr>
+        <w:t>:</w:t>
+      </w:r>
+      <w:r>
+        <w:rPr>
+          <w:rStyle w:val="token"/>
+          <w:rFonts w:ascii="Fraktion Mono" w:hAnsi="Fraktion Mono"/>
+          <w:color w:val="BFC7D5"/>
+          <w:shd w:val="clear" w:color="auto" w:fill="28292B"/>
+        </w:rPr>
+        <w:t xml:space="preserve"> </w:t>
+      </w:r>
+      <w:r>
+        <w:rPr>
+          <w:rStyle w:val="token"/>
+          <w:rFonts w:ascii="Fraktion Mono" w:hAnsi="Fraktion Mono"/>
+          <w:color w:val="F78C6C"/>
+          <w:shd w:val="clear" w:color="auto" w:fill="28292B"/>
+        </w:rPr>
+        <w:t>100</w:t>
+      </w:r>
+      <w:r>
+        <w:rPr>
+          <w:rStyle w:val="token"/>
+          <w:rFonts w:ascii="Fraktion Mono" w:hAnsi="Fraktion Mono"/>
+          <w:color w:val="C792EA"/>
+          <w:shd w:val="clear" w:color="auto" w:fill="28292B"/>
+        </w:rPr>
+        <w:t>,</w:t>
+      </w:r>
+      <w:r>
+        <w:rPr>
+          <w:rStyle w:val="token"/>
+          <w:rFonts w:ascii="Fraktion Mono" w:hAnsi="Fraktion Mono"/>
+          <w:color w:val="BFC7D5"/>
+          <w:shd w:val="clear" w:color="auto" w:fill="28292B"/>
+        </w:rPr>
+        <w:t xml:space="preserve"> duration</w:t>
+      </w:r>
+      <w:r>
+        <w:rPr>
+          <w:rStyle w:val="token"/>
+          <w:rFonts w:ascii="Fraktion Mono" w:hAnsi="Fraktion Mono"/>
+          <w:color w:val="89DDFF"/>
+          <w:shd w:val="clear" w:color="auto" w:fill="28292B"/>
+        </w:rPr>
+        <w:t>:</w:t>
+      </w:r>
+      <w:r>
+        <w:rPr>
+          <w:rStyle w:val="token"/>
+          <w:rFonts w:ascii="Fraktion Mono" w:hAnsi="Fraktion Mono"/>
+          <w:color w:val="BFC7D5"/>
+          <w:shd w:val="clear" w:color="auto" w:fill="28292B"/>
+        </w:rPr>
+        <w:t xml:space="preserve"> </w:t>
+      </w:r>
+      <w:r>
+        <w:rPr>
+          <w:rStyle w:val="token"/>
+          <w:rFonts w:ascii="Fraktion Mono" w:hAnsi="Fraktion Mono"/>
+          <w:color w:val="F78C6C"/>
+          <w:shd w:val="clear" w:color="auto" w:fill="28292B"/>
+        </w:rPr>
+        <w:t>1</w:t>
+      </w:r>
+      <w:r>
+        <w:rPr>
+          <w:rStyle w:val="token"/>
+          <w:rFonts w:ascii="Fraktion Mono" w:hAnsi="Fraktion Mono"/>
+          <w:color w:val="F78C6C"/>
+          <w:shd w:val="clear" w:color="auto" w:fill="28292B"/>
+        </w:rPr>
+        <w:t>, rotate:360</w:t>
+      </w:r>
+      <w:r>
+        <w:rPr>
+          <w:rStyle w:val="token"/>
+          <w:rFonts w:ascii="Fraktion Mono" w:hAnsi="Fraktion Mono"/>
+          <w:color w:val="BFC7D5"/>
+          <w:shd w:val="clear" w:color="auto" w:fill="28292B"/>
+        </w:rPr>
+        <w:t xml:space="preserve"> </w:t>
+      </w:r>
+      <w:r>
+        <w:rPr>
+          <w:rStyle w:val="token"/>
+          <w:rFonts w:ascii="Fraktion Mono" w:hAnsi="Fraktion Mono"/>
+          <w:color w:val="C792EA"/>
+          <w:shd w:val="clear" w:color="auto" w:fill="28292B"/>
+        </w:rPr>
+        <w:t>});</w:t>
+      </w:r>
+    </w:p>
+    <w:p>
+      <w:r>
+        <w:t xml:space="preserve">Rotate </w:t>
+      </w:r>
+      <w:r>
+        <w:t>360 = 1 full circle, but it don’t need deg or other thing, same with x and y – x: 100 it is x axis 100px</w:t>
+      </w:r>
+    </w:p>
+    <w:p>
+      <w:r>
+        <w:t>And we can give css property also rotate, color, backgroundColor we can give all property just like this.</w:t>
+      </w:r>
+    </w:p>
+    <w:p>
+      <w:pPr>
+        <w:rPr>
+          <w:rStyle w:val="token"/>
+          <w:rFonts w:ascii="Fraktion Mono" w:hAnsi="Fraktion Mono"/>
+          <w:color w:val="C792EA"/>
+          <w:shd w:val="clear" w:color="auto" w:fill="28292B"/>
+        </w:rPr>
+      </w:pPr>
+      <w:proofErr w:type="gramStart"/>
+      <w:r>
+        <w:rPr>
+          <w:rStyle w:val="token"/>
+          <w:rFonts w:ascii="Fraktion Mono" w:hAnsi="Fraktion Mono"/>
+          <w:color w:val="BFC7D5"/>
+          <w:shd w:val="clear" w:color="auto" w:fill="28292B"/>
+        </w:rPr>
+        <w:t>gsap</w:t>
+      </w:r>
+      <w:r>
+        <w:rPr>
+          <w:rStyle w:val="token"/>
+          <w:rFonts w:ascii="Fraktion Mono" w:hAnsi="Fraktion Mono"/>
+          <w:color w:val="C792EA"/>
+          <w:shd w:val="clear" w:color="auto" w:fill="28292B"/>
+        </w:rPr>
+        <w:t>.</w:t>
+      </w:r>
+      <w:r>
+        <w:rPr>
+          <w:rStyle w:val="token"/>
+          <w:rFonts w:ascii="Fraktion Mono" w:hAnsi="Fraktion Mono"/>
+          <w:color w:val="82AAFF"/>
+          <w:shd w:val="clear" w:color="auto" w:fill="28292B"/>
+        </w:rPr>
+        <w:t>from</w:t>
+      </w:r>
+      <w:r>
+        <w:rPr>
+          <w:rStyle w:val="token"/>
+          <w:rFonts w:ascii="Fraktion Mono" w:hAnsi="Fraktion Mono"/>
+          <w:color w:val="C792EA"/>
+          <w:shd w:val="clear" w:color="auto" w:fill="28292B"/>
+        </w:rPr>
+        <w:t>(</w:t>
+      </w:r>
+      <w:proofErr w:type="gramEnd"/>
+      <w:r>
+        <w:rPr>
+          <w:rStyle w:val="token"/>
+          <w:rFonts w:ascii="Fraktion Mono" w:hAnsi="Fraktion Mono"/>
+          <w:color w:val="63D55A"/>
+          <w:shd w:val="clear" w:color="auto" w:fill="28292B"/>
+        </w:rPr>
+        <w:t>".box"</w:t>
+      </w:r>
+      <w:r>
+        <w:rPr>
+          <w:rStyle w:val="token"/>
+          <w:rFonts w:ascii="Fraktion Mono" w:hAnsi="Fraktion Mono"/>
+          <w:color w:val="C792EA"/>
+          <w:shd w:val="clear" w:color="auto" w:fill="28292B"/>
+        </w:rPr>
+        <w:t>,</w:t>
+      </w:r>
+      <w:r>
+        <w:rPr>
+          <w:rStyle w:val="token"/>
+          <w:rFonts w:ascii="Fraktion Mono" w:hAnsi="Fraktion Mono"/>
+          <w:color w:val="BFC7D5"/>
+          <w:shd w:val="clear" w:color="auto" w:fill="28292B"/>
+        </w:rPr>
+        <w:t xml:space="preserve"> </w:t>
+      </w:r>
+      <w:r>
+        <w:rPr>
+          <w:rStyle w:val="token"/>
+          <w:rFonts w:ascii="Fraktion Mono" w:hAnsi="Fraktion Mono"/>
+          <w:color w:val="C792EA"/>
+          <w:shd w:val="clear" w:color="auto" w:fill="28292B"/>
+        </w:rPr>
+        <w:t>{</w:t>
+      </w:r>
+      <w:r>
+        <w:rPr>
+          <w:rStyle w:val="token"/>
+          <w:rFonts w:ascii="Fraktion Mono" w:hAnsi="Fraktion Mono"/>
+          <w:color w:val="BFC7D5"/>
+          <w:shd w:val="clear" w:color="auto" w:fill="28292B"/>
+        </w:rPr>
+        <w:t xml:space="preserve"> rotation</w:t>
+      </w:r>
+      <w:r>
+        <w:rPr>
+          <w:rStyle w:val="token"/>
+          <w:rFonts w:ascii="Fraktion Mono" w:hAnsi="Fraktion Mono"/>
+          <w:color w:val="89DDFF"/>
+          <w:shd w:val="clear" w:color="auto" w:fill="28292B"/>
+        </w:rPr>
+        <w:t>:</w:t>
+      </w:r>
+      <w:r>
+        <w:rPr>
+          <w:rStyle w:val="token"/>
+          <w:rFonts w:ascii="Fraktion Mono" w:hAnsi="Fraktion Mono"/>
+          <w:color w:val="BFC7D5"/>
+          <w:shd w:val="clear" w:color="auto" w:fill="28292B"/>
+        </w:rPr>
+        <w:t xml:space="preserve"> </w:t>
+      </w:r>
+      <w:r>
+        <w:rPr>
+          <w:rStyle w:val="token"/>
+          <w:rFonts w:ascii="Fraktion Mono" w:hAnsi="Fraktion Mono"/>
+          <w:color w:val="F78C6C"/>
+          <w:shd w:val="clear" w:color="auto" w:fill="28292B"/>
+        </w:rPr>
+        <w:t>27</w:t>
+      </w:r>
+      <w:r>
+        <w:rPr>
+          <w:rStyle w:val="token"/>
+          <w:rFonts w:ascii="Fraktion Mono" w:hAnsi="Fraktion Mono"/>
+          <w:color w:val="C792EA"/>
+          <w:shd w:val="clear" w:color="auto" w:fill="28292B"/>
+        </w:rPr>
+        <w:t>,</w:t>
+      </w:r>
+      <w:r>
+        <w:rPr>
+          <w:rStyle w:val="token"/>
+          <w:rFonts w:ascii="Fraktion Mono" w:hAnsi="Fraktion Mono"/>
+          <w:color w:val="BFC7D5"/>
+          <w:shd w:val="clear" w:color="auto" w:fill="28292B"/>
+        </w:rPr>
+        <w:t xml:space="preserve"> x</w:t>
+      </w:r>
+      <w:r>
+        <w:rPr>
+          <w:rStyle w:val="token"/>
+          <w:rFonts w:ascii="Fraktion Mono" w:hAnsi="Fraktion Mono"/>
+          <w:color w:val="89DDFF"/>
+          <w:shd w:val="clear" w:color="auto" w:fill="28292B"/>
+        </w:rPr>
+        <w:t>:</w:t>
+      </w:r>
+      <w:r>
+        <w:rPr>
+          <w:rStyle w:val="token"/>
+          <w:rFonts w:ascii="Fraktion Mono" w:hAnsi="Fraktion Mono"/>
+          <w:color w:val="BFC7D5"/>
+          <w:shd w:val="clear" w:color="auto" w:fill="28292B"/>
+        </w:rPr>
+        <w:t xml:space="preserve"> </w:t>
+      </w:r>
+      <w:r>
+        <w:rPr>
+          <w:rStyle w:val="token"/>
+          <w:rFonts w:ascii="Fraktion Mono" w:hAnsi="Fraktion Mono"/>
+          <w:color w:val="F78C6C"/>
+          <w:shd w:val="clear" w:color="auto" w:fill="28292B"/>
+        </w:rPr>
+        <w:t>100</w:t>
+      </w:r>
+      <w:r>
+        <w:rPr>
+          <w:rStyle w:val="token"/>
+          <w:rFonts w:ascii="Fraktion Mono" w:hAnsi="Fraktion Mono"/>
+          <w:color w:val="C792EA"/>
+          <w:shd w:val="clear" w:color="auto" w:fill="28292B"/>
+        </w:rPr>
+        <w:t>,</w:t>
+      </w:r>
+      <w:r>
+        <w:rPr>
+          <w:rStyle w:val="token"/>
+          <w:rFonts w:ascii="Fraktion Mono" w:hAnsi="Fraktion Mono"/>
+          <w:color w:val="BFC7D5"/>
+          <w:shd w:val="clear" w:color="auto" w:fill="28292B"/>
+        </w:rPr>
+        <w:t xml:space="preserve"> duration</w:t>
+      </w:r>
+      <w:r>
+        <w:rPr>
+          <w:rStyle w:val="token"/>
+          <w:rFonts w:ascii="Fraktion Mono" w:hAnsi="Fraktion Mono"/>
+          <w:color w:val="89DDFF"/>
+          <w:shd w:val="clear" w:color="auto" w:fill="28292B"/>
+        </w:rPr>
+        <w:t>:</w:t>
+      </w:r>
+      <w:r>
+        <w:rPr>
+          <w:rStyle w:val="token"/>
+          <w:rFonts w:ascii="Fraktion Mono" w:hAnsi="Fraktion Mono"/>
+          <w:color w:val="BFC7D5"/>
+          <w:shd w:val="clear" w:color="auto" w:fill="28292B"/>
+        </w:rPr>
+        <w:t xml:space="preserve"> </w:t>
+      </w:r>
+      <w:r>
+        <w:rPr>
+          <w:rStyle w:val="token"/>
+          <w:rFonts w:ascii="Fraktion Mono" w:hAnsi="Fraktion Mono"/>
+          <w:color w:val="F78C6C"/>
+          <w:shd w:val="clear" w:color="auto" w:fill="28292B"/>
+        </w:rPr>
+        <w:t>1</w:t>
+      </w:r>
+      <w:r>
+        <w:rPr>
+          <w:rStyle w:val="token"/>
+          <w:rFonts w:ascii="Fraktion Mono" w:hAnsi="Fraktion Mono"/>
+          <w:color w:val="BFC7D5"/>
+          <w:shd w:val="clear" w:color="auto" w:fill="28292B"/>
+        </w:rPr>
+        <w:t xml:space="preserve"> </w:t>
+      </w:r>
+      <w:r>
+        <w:rPr>
+          <w:rStyle w:val="token"/>
+          <w:rFonts w:ascii="Fraktion Mono" w:hAnsi="Fraktion Mono"/>
+          <w:color w:val="C792EA"/>
+          <w:shd w:val="clear" w:color="auto" w:fill="28292B"/>
+        </w:rPr>
+        <w:t>});</w:t>
+      </w:r>
+    </w:p>
+    <w:p>
+      <w:proofErr w:type="gramStart"/>
+      <w:r>
+        <w:t>scale :</w:t>
+      </w:r>
+      <w:proofErr w:type="gramEnd"/>
+      <w:r>
+        <w:t xml:space="preserve"> .5 – ti is haf size scale :2 – it is dubble size</w:t>
+      </w:r>
+    </w:p>
+    <w:p/>
+    <w:p>
+      <w:proofErr w:type="gramStart"/>
+      <w:r>
+        <w:t>gsap.from(</w:t>
+      </w:r>
+      <w:proofErr w:type="gramEnd"/>
+      <w:r>
+        <w:t xml:space="preserve">‘h1’, {y:100, duration:2, </w:t>
+      </w:r>
+      <w:r>
+        <w:rPr>
+          <w:b/>
+        </w:rPr>
+        <w:t>stagger</w:t>
+      </w:r>
+      <w:r>
+        <w:t>: 1})</w:t>
+      </w:r>
+    </w:p>
+    <w:p>
+      <w:proofErr w:type="gramStart"/>
+      <w:r>
+        <w:t>stagger</w:t>
+      </w:r>
+      <w:proofErr w:type="gramEnd"/>
+      <w:r>
+        <w:t xml:space="preserve"> it paly one by one</w:t>
+      </w:r>
+    </w:p>
+    <w:p>
+      <w:proofErr w:type="gramStart"/>
+      <w:r>
+        <w:t>we</w:t>
+      </w:r>
+      <w:proofErr w:type="gramEnd"/>
+      <w:r>
+        <w:t xml:space="preserve"> can give stagger : -1 – it paly revers </w:t>
+      </w:r>
+    </w:p>
+    <w:p>
+      <w:r>
+        <w:rPr>
+          <w:b/>
+        </w:rPr>
+        <w:t>repeat</w:t>
+      </w:r>
+      <w:r>
+        <w:t>:1</w:t>
+      </w:r>
+    </w:p>
+    <w:p>
+      <w:r>
+        <w:t>repeat 1 mean 1 itme’s default and 1 more total 1 + 1 = 2 times</w:t>
+      </w:r>
+    </w:p>
+    <w:p>
+      <w:r>
+        <w:t>repeat: -1 it mean infinite</w:t>
+      </w:r>
+    </w:p>
+    <w:p>
+      <w:r>
+        <w:rPr>
+          <w:b/>
+        </w:rPr>
+        <w:t>yoyo:</w:t>
+      </w:r>
+      <w:r>
+        <w:t xml:space="preserve"> it is bollean </w:t>
+      </w:r>
+    </w:p>
+    <w:p>
+      <w:r>
+        <w:t>yoyo: true mean, it repest smoothely. It go and come back</w:t>
+      </w:r>
+    </w:p>
+    <w:p/>
+    <w:p>
+      <w:r>
+        <w:t>Timeline</w:t>
+      </w:r>
+    </w:p>
+    <w:p>
+      <w:pPr>
+        <w:rPr>
+          <w:rStyle w:val="token"/>
+          <w:rFonts w:ascii="Fraktion Mono" w:hAnsi="Fraktion Mono"/>
+          <w:color w:val="C792EA"/>
+          <w:shd w:val="clear" w:color="auto" w:fill="28292B"/>
+        </w:rPr>
+      </w:pPr>
       <w:r>
         <w:rPr>
           <w:rStyle w:val="token"/>
@@ -78,7 +639,7 @@
           <w:color w:val="9C9C9C"/>
           <w:shd w:val="clear" w:color="auto" w:fill="28292B"/>
         </w:rPr>
-        <w:t>) transform) over the course of 1 second.</w:t>
+        <w:t>//all tweens run in direct succession</w:t>
       </w:r>
       <w:r>
         <w:rPr>
@@ -88,717 +649,12 @@
         </w:rPr>
         <w:br/>
       </w:r>
-      <w:proofErr w:type="gramStart"/>
-      <w:r>
-        <w:rPr>
-          <w:rStyle w:val="token"/>
-          <w:rFonts w:ascii="Fraktion Mono" w:hAnsi="Fraktion Mono"/>
-          <w:color w:val="BFC7D5"/>
-          <w:shd w:val="clear" w:color="auto" w:fill="28292B"/>
-        </w:rPr>
-        <w:t>gsap</w:t>
-      </w:r>
-      <w:r>
-        <w:rPr>
-          <w:rStyle w:val="token"/>
-          <w:rFonts w:ascii="Fraktion Mono" w:hAnsi="Fraktion Mono"/>
-          <w:color w:val="C792EA"/>
-          <w:shd w:val="clear" w:color="auto" w:fill="28292B"/>
-        </w:rPr>
-        <w:t>.</w:t>
-      </w:r>
-      <w:r>
-        <w:rPr>
-          <w:rStyle w:val="token"/>
-          <w:rFonts w:ascii="Fraktion Mono" w:hAnsi="Fraktion Mono"/>
-          <w:color w:val="82AAFF"/>
-          <w:shd w:val="clear" w:color="auto" w:fill="28292B"/>
-        </w:rPr>
-        <w:t>to</w:t>
-      </w:r>
-      <w:r>
-        <w:rPr>
-          <w:rStyle w:val="token"/>
-          <w:rFonts w:ascii="Fraktion Mono" w:hAnsi="Fraktion Mono"/>
-          <w:color w:val="C792EA"/>
-          <w:shd w:val="clear" w:color="auto" w:fill="28292B"/>
-        </w:rPr>
-        <w:t>(</w:t>
-      </w:r>
-      <w:proofErr w:type="gramEnd"/>
-      <w:r>
-        <w:rPr>
-          <w:rStyle w:val="token"/>
-          <w:rFonts w:ascii="Fraktion Mono" w:hAnsi="Fraktion Mono"/>
-          <w:color w:val="63D55A"/>
-          <w:shd w:val="clear" w:color="auto" w:fill="28292B"/>
-        </w:rPr>
-        <w:t>".box"</w:t>
-      </w:r>
-      <w:r>
-        <w:rPr>
-          <w:rStyle w:val="token"/>
-          <w:rFonts w:ascii="Fraktion Mono" w:hAnsi="Fraktion Mono"/>
-          <w:color w:val="C792EA"/>
-          <w:shd w:val="clear" w:color="auto" w:fill="28292B"/>
-        </w:rPr>
-        <w:t>,</w:t>
-      </w:r>
-      <w:r>
-        <w:rPr>
-          <w:rStyle w:val="token"/>
-          <w:rFonts w:ascii="Fraktion Mono" w:hAnsi="Fraktion Mono"/>
-          <w:color w:val="BFC7D5"/>
-          <w:shd w:val="clear" w:color="auto" w:fill="28292B"/>
-        </w:rPr>
-        <w:t xml:space="preserve"> </w:t>
-      </w:r>
-      <w:r>
-        <w:rPr>
-          <w:rStyle w:val="token"/>
-          <w:rFonts w:ascii="Fraktion Mono" w:hAnsi="Fraktion Mono"/>
-          <w:color w:val="C792EA"/>
-          <w:shd w:val="clear" w:color="auto" w:fill="28292B"/>
-        </w:rPr>
-        <w:t>{</w:t>
-      </w:r>
-      <w:r>
-        <w:rPr>
-          <w:rStyle w:val="token"/>
-          <w:rFonts w:ascii="Fraktion Mono" w:hAnsi="Fraktion Mono"/>
-          <w:color w:val="BFC7D5"/>
-          <w:shd w:val="clear" w:color="auto" w:fill="28292B"/>
-        </w:rPr>
-        <w:t xml:space="preserve"> rotation</w:t>
-      </w:r>
-      <w:r>
-        <w:rPr>
-          <w:rStyle w:val="token"/>
-          <w:rFonts w:ascii="Fraktion Mono" w:hAnsi="Fraktion Mono"/>
-          <w:color w:val="89DDFF"/>
-          <w:shd w:val="clear" w:color="auto" w:fill="28292B"/>
-        </w:rPr>
-        <w:t>:</w:t>
-      </w:r>
-      <w:r>
-        <w:rPr>
-          <w:rStyle w:val="token"/>
-          <w:rFonts w:ascii="Fraktion Mono" w:hAnsi="Fraktion Mono"/>
-          <w:color w:val="BFC7D5"/>
-          <w:shd w:val="clear" w:color="auto" w:fill="28292B"/>
-        </w:rPr>
-        <w:t xml:space="preserve"> </w:t>
-      </w:r>
-      <w:r>
-        <w:rPr>
-          <w:rStyle w:val="token"/>
-          <w:rFonts w:ascii="Fraktion Mono" w:hAnsi="Fraktion Mono"/>
-          <w:color w:val="F78C6C"/>
-          <w:shd w:val="clear" w:color="auto" w:fill="28292B"/>
-        </w:rPr>
-        <w:t>27</w:t>
-      </w:r>
-      <w:r>
-        <w:rPr>
-          <w:rStyle w:val="token"/>
-          <w:rFonts w:ascii="Fraktion Mono" w:hAnsi="Fraktion Mono"/>
-          <w:color w:val="C792EA"/>
-          <w:shd w:val="clear" w:color="auto" w:fill="28292B"/>
-        </w:rPr>
-        <w:t>,</w:t>
-      </w:r>
-      <w:r>
-        <w:rPr>
-          <w:rStyle w:val="token"/>
-          <w:rFonts w:ascii="Fraktion Mono" w:hAnsi="Fraktion Mono"/>
-          <w:color w:val="BFC7D5"/>
-          <w:shd w:val="clear" w:color="auto" w:fill="28292B"/>
-        </w:rPr>
-        <w:t xml:space="preserve"> x</w:t>
-      </w:r>
-      <w:r>
-        <w:rPr>
-          <w:rStyle w:val="token"/>
-          <w:rFonts w:ascii="Fraktion Mono" w:hAnsi="Fraktion Mono"/>
-          <w:color w:val="89DDFF"/>
-          <w:shd w:val="clear" w:color="auto" w:fill="28292B"/>
-        </w:rPr>
-        <w:t>:</w:t>
-      </w:r>
-      <w:r>
-        <w:rPr>
-          <w:rStyle w:val="token"/>
-          <w:rFonts w:ascii="Fraktion Mono" w:hAnsi="Fraktion Mono"/>
-          <w:color w:val="BFC7D5"/>
-          <w:shd w:val="clear" w:color="auto" w:fill="28292B"/>
-        </w:rPr>
-        <w:t xml:space="preserve"> </w:t>
-      </w:r>
-      <w:r>
-        <w:rPr>
-          <w:rStyle w:val="token"/>
-          <w:rFonts w:ascii="Fraktion Mono" w:hAnsi="Fraktion Mono"/>
-          <w:color w:val="F78C6C"/>
-          <w:shd w:val="clear" w:color="auto" w:fill="28292B"/>
-        </w:rPr>
-        <w:t>100</w:t>
-      </w:r>
-      <w:r>
-        <w:rPr>
-          <w:rStyle w:val="token"/>
-          <w:rFonts w:ascii="Fraktion Mono" w:hAnsi="Fraktion Mono"/>
-          <w:color w:val="C792EA"/>
-          <w:shd w:val="clear" w:color="auto" w:fill="28292B"/>
-        </w:rPr>
-        <w:t>,</w:t>
-      </w:r>
-      <w:r>
-        <w:rPr>
-          <w:rStyle w:val="token"/>
-          <w:rFonts w:ascii="Fraktion Mono" w:hAnsi="Fraktion Mono"/>
-          <w:color w:val="BFC7D5"/>
-          <w:shd w:val="clear" w:color="auto" w:fill="28292B"/>
-        </w:rPr>
-        <w:t xml:space="preserve"> duration</w:t>
-      </w:r>
-      <w:r>
-        <w:rPr>
-          <w:rStyle w:val="token"/>
-          <w:rFonts w:ascii="Fraktion Mono" w:hAnsi="Fraktion Mono"/>
-          <w:color w:val="89DDFF"/>
-          <w:shd w:val="clear" w:color="auto" w:fill="28292B"/>
-        </w:rPr>
-        <w:t>:</w:t>
-      </w:r>
-      <w:r>
-        <w:rPr>
-          <w:rStyle w:val="token"/>
-          <w:rFonts w:ascii="Fraktion Mono" w:hAnsi="Fraktion Mono"/>
-          <w:color w:val="BFC7D5"/>
-          <w:shd w:val="clear" w:color="auto" w:fill="28292B"/>
-        </w:rPr>
-        <w:t xml:space="preserve"> </w:t>
-      </w:r>
-      <w:r>
-        <w:rPr>
-          <w:rStyle w:val="token"/>
-          <w:rFonts w:ascii="Fraktion Mono" w:hAnsi="Fraktion Mono"/>
-          <w:color w:val="F78C6C"/>
-          <w:shd w:val="clear" w:color="auto" w:fill="28292B"/>
-        </w:rPr>
-        <w:t>1</w:t>
-      </w:r>
-      <w:r>
-        <w:rPr>
-          <w:rStyle w:val="token"/>
-          <w:rFonts w:ascii="Fraktion Mono" w:hAnsi="Fraktion Mono"/>
-          <w:color w:val="F78C6C"/>
-          <w:shd w:val="clear" w:color="auto" w:fill="28292B"/>
-        </w:rPr>
-        <w:t>, rotate:360</w:t>
-      </w:r>
-      <w:r>
-        <w:rPr>
-          <w:rStyle w:val="token"/>
-          <w:rFonts w:ascii="Fraktion Mono" w:hAnsi="Fraktion Mono"/>
-          <w:color w:val="BFC7D5"/>
-          <w:shd w:val="clear" w:color="auto" w:fill="28292B"/>
-        </w:rPr>
-        <w:t xml:space="preserve"> </w:t>
-      </w:r>
-      <w:r>
-        <w:rPr>
-          <w:rStyle w:val="token"/>
-          <w:rFonts w:ascii="Fraktion Mono" w:hAnsi="Fraktion Mono"/>
-          <w:color w:val="C792EA"/>
-          <w:shd w:val="clear" w:color="auto" w:fill="28292B"/>
-        </w:rPr>
-        <w:t>});</w:t>
-      </w:r>
-    </w:p>
-    <w:p>
-      <w:r>
-        <w:t xml:space="preserve">Rotate </w:t>
-      </w:r>
-      <w:r>
-        <w:t xml:space="preserve">360 = 1 full circle, but it don’t need </w:t>
-      </w:r>
-      <w:proofErr w:type="spellStart"/>
-      <w:r>
-        <w:t>deg</w:t>
-      </w:r>
-      <w:proofErr w:type="spellEnd"/>
-      <w:r>
-        <w:t xml:space="preserve"> or other thing, same with x and y – x: 100 it is x axis 100px</w:t>
-      </w:r>
-    </w:p>
-    <w:p>
-      <w:r>
-        <w:t xml:space="preserve">And we can give </w:t>
-      </w:r>
-      <w:proofErr w:type="spellStart"/>
-      <w:r>
-        <w:t>css</w:t>
-      </w:r>
-      <w:proofErr w:type="spellEnd"/>
-      <w:r>
-        <w:t xml:space="preserve"> property also rotate, color, </w:t>
-      </w:r>
-      <w:proofErr w:type="spellStart"/>
-      <w:r>
-        <w:t>backgroundColor</w:t>
-      </w:r>
-      <w:proofErr w:type="spellEnd"/>
-      <w:r>
-        <w:t xml:space="preserve"> we can give all property just like this.</w:t>
-      </w:r>
-    </w:p>
-    <w:p>
-      <w:pPr>
-        <w:rPr>
-          <w:rStyle w:val="token"/>
-          <w:rFonts w:ascii="Fraktion Mono" w:hAnsi="Fraktion Mono"/>
-          <w:color w:val="C792EA"/>
-          <w:shd w:val="clear" w:color="auto" w:fill="28292B"/>
-        </w:rPr>
-      </w:pPr>
-      <w:proofErr w:type="spellStart"/>
-      <w:proofErr w:type="gramStart"/>
-      <w:r>
-        <w:rPr>
-          <w:rStyle w:val="token"/>
-          <w:rFonts w:ascii="Fraktion Mono" w:hAnsi="Fraktion Mono"/>
-          <w:color w:val="BFC7D5"/>
-          <w:shd w:val="clear" w:color="auto" w:fill="28292B"/>
-        </w:rPr>
-        <w:t>gsap</w:t>
-      </w:r>
-      <w:r>
-        <w:rPr>
-          <w:rStyle w:val="token"/>
-          <w:rFonts w:ascii="Fraktion Mono" w:hAnsi="Fraktion Mono"/>
-          <w:color w:val="C792EA"/>
-          <w:shd w:val="clear" w:color="auto" w:fill="28292B"/>
-        </w:rPr>
-        <w:t>.</w:t>
-      </w:r>
-      <w:r>
-        <w:rPr>
-          <w:rStyle w:val="token"/>
-          <w:rFonts w:ascii="Fraktion Mono" w:hAnsi="Fraktion Mono"/>
-          <w:color w:val="82AAFF"/>
-          <w:shd w:val="clear" w:color="auto" w:fill="28292B"/>
-        </w:rPr>
-        <w:t>from</w:t>
-      </w:r>
-      <w:proofErr w:type="spellEnd"/>
-      <w:r>
-        <w:rPr>
-          <w:rStyle w:val="token"/>
-          <w:rFonts w:ascii="Fraktion Mono" w:hAnsi="Fraktion Mono"/>
-          <w:color w:val="C792EA"/>
-          <w:shd w:val="clear" w:color="auto" w:fill="28292B"/>
-        </w:rPr>
-        <w:t>(</w:t>
-      </w:r>
-      <w:proofErr w:type="gramEnd"/>
-      <w:r>
-        <w:rPr>
-          <w:rStyle w:val="token"/>
-          <w:rFonts w:ascii="Fraktion Mono" w:hAnsi="Fraktion Mono"/>
-          <w:color w:val="63D55A"/>
-          <w:shd w:val="clear" w:color="auto" w:fill="28292B"/>
-        </w:rPr>
-        <w:t>".box"</w:t>
-      </w:r>
-      <w:r>
-        <w:rPr>
-          <w:rStyle w:val="token"/>
-          <w:rFonts w:ascii="Fraktion Mono" w:hAnsi="Fraktion Mono"/>
-          <w:color w:val="C792EA"/>
-          <w:shd w:val="clear" w:color="auto" w:fill="28292B"/>
-        </w:rPr>
-        <w:t>,</w:t>
-      </w:r>
-      <w:r>
-        <w:rPr>
-          <w:rStyle w:val="token"/>
-          <w:rFonts w:ascii="Fraktion Mono" w:hAnsi="Fraktion Mono"/>
-          <w:color w:val="BFC7D5"/>
-          <w:shd w:val="clear" w:color="auto" w:fill="28292B"/>
-        </w:rPr>
-        <w:t xml:space="preserve"> </w:t>
-      </w:r>
-      <w:r>
-        <w:rPr>
-          <w:rStyle w:val="token"/>
-          <w:rFonts w:ascii="Fraktion Mono" w:hAnsi="Fraktion Mono"/>
-          <w:color w:val="C792EA"/>
-          <w:shd w:val="clear" w:color="auto" w:fill="28292B"/>
-        </w:rPr>
-        <w:t>{</w:t>
-      </w:r>
-      <w:r>
-        <w:rPr>
-          <w:rStyle w:val="token"/>
-          <w:rFonts w:ascii="Fraktion Mono" w:hAnsi="Fraktion Mono"/>
-          <w:color w:val="BFC7D5"/>
-          <w:shd w:val="clear" w:color="auto" w:fill="28292B"/>
-        </w:rPr>
-        <w:t xml:space="preserve"> rotation</w:t>
-      </w:r>
-      <w:r>
-        <w:rPr>
-          <w:rStyle w:val="token"/>
-          <w:rFonts w:ascii="Fraktion Mono" w:hAnsi="Fraktion Mono"/>
-          <w:color w:val="89DDFF"/>
-          <w:shd w:val="clear" w:color="auto" w:fill="28292B"/>
-        </w:rPr>
-        <w:t>:</w:t>
-      </w:r>
-      <w:r>
-        <w:rPr>
-          <w:rStyle w:val="token"/>
-          <w:rFonts w:ascii="Fraktion Mono" w:hAnsi="Fraktion Mono"/>
-          <w:color w:val="BFC7D5"/>
-          <w:shd w:val="clear" w:color="auto" w:fill="28292B"/>
-        </w:rPr>
-        <w:t xml:space="preserve"> </w:t>
-      </w:r>
-      <w:r>
-        <w:rPr>
-          <w:rStyle w:val="token"/>
-          <w:rFonts w:ascii="Fraktion Mono" w:hAnsi="Fraktion Mono"/>
-          <w:color w:val="F78C6C"/>
-          <w:shd w:val="clear" w:color="auto" w:fill="28292B"/>
-        </w:rPr>
-        <w:t>27</w:t>
-      </w:r>
-      <w:r>
-        <w:rPr>
-          <w:rStyle w:val="token"/>
-          <w:rFonts w:ascii="Fraktion Mono" w:hAnsi="Fraktion Mono"/>
-          <w:color w:val="C792EA"/>
-          <w:shd w:val="clear" w:color="auto" w:fill="28292B"/>
-        </w:rPr>
-        <w:t>,</w:t>
-      </w:r>
-      <w:r>
-        <w:rPr>
-          <w:rStyle w:val="token"/>
-          <w:rFonts w:ascii="Fraktion Mono" w:hAnsi="Fraktion Mono"/>
-          <w:color w:val="BFC7D5"/>
-          <w:shd w:val="clear" w:color="auto" w:fill="28292B"/>
-        </w:rPr>
-        <w:t xml:space="preserve"> x</w:t>
-      </w:r>
-      <w:r>
-        <w:rPr>
-          <w:rStyle w:val="token"/>
-          <w:rFonts w:ascii="Fraktion Mono" w:hAnsi="Fraktion Mono"/>
-          <w:color w:val="89DDFF"/>
-          <w:shd w:val="clear" w:color="auto" w:fill="28292B"/>
-        </w:rPr>
-        <w:t>:</w:t>
-      </w:r>
-      <w:r>
-        <w:rPr>
-          <w:rStyle w:val="token"/>
-          <w:rFonts w:ascii="Fraktion Mono" w:hAnsi="Fraktion Mono"/>
-          <w:color w:val="BFC7D5"/>
-          <w:shd w:val="clear" w:color="auto" w:fill="28292B"/>
-        </w:rPr>
-        <w:t xml:space="preserve"> </w:t>
-      </w:r>
-      <w:r>
-        <w:rPr>
-          <w:rStyle w:val="token"/>
-          <w:rFonts w:ascii="Fraktion Mono" w:hAnsi="Fraktion Mono"/>
-          <w:color w:val="F78C6C"/>
-          <w:shd w:val="clear" w:color="auto" w:fill="28292B"/>
-        </w:rPr>
-        <w:t>100</w:t>
-      </w:r>
-      <w:r>
-        <w:rPr>
-          <w:rStyle w:val="token"/>
-          <w:rFonts w:ascii="Fraktion Mono" w:hAnsi="Fraktion Mono"/>
-          <w:color w:val="C792EA"/>
-          <w:shd w:val="clear" w:color="auto" w:fill="28292B"/>
-        </w:rPr>
-        <w:t>,</w:t>
-      </w:r>
-      <w:r>
-        <w:rPr>
-          <w:rStyle w:val="token"/>
-          <w:rFonts w:ascii="Fraktion Mono" w:hAnsi="Fraktion Mono"/>
-          <w:color w:val="BFC7D5"/>
-          <w:shd w:val="clear" w:color="auto" w:fill="28292B"/>
-        </w:rPr>
-        <w:t xml:space="preserve"> duration</w:t>
-      </w:r>
-      <w:r>
-        <w:rPr>
-          <w:rStyle w:val="token"/>
-          <w:rFonts w:ascii="Fraktion Mono" w:hAnsi="Fraktion Mono"/>
-          <w:color w:val="89DDFF"/>
-          <w:shd w:val="clear" w:color="auto" w:fill="28292B"/>
-        </w:rPr>
-        <w:t>:</w:t>
-      </w:r>
-      <w:r>
-        <w:rPr>
-          <w:rStyle w:val="token"/>
-          <w:rFonts w:ascii="Fraktion Mono" w:hAnsi="Fraktion Mono"/>
-          <w:color w:val="BFC7D5"/>
-          <w:shd w:val="clear" w:color="auto" w:fill="28292B"/>
-        </w:rPr>
-        <w:t xml:space="preserve"> </w:t>
-      </w:r>
-      <w:r>
-        <w:rPr>
-          <w:rStyle w:val="token"/>
-          <w:rFonts w:ascii="Fraktion Mono" w:hAnsi="Fraktion Mono"/>
-          <w:color w:val="F78C6C"/>
-          <w:shd w:val="clear" w:color="auto" w:fill="28292B"/>
-        </w:rPr>
-        <w:t>1</w:t>
-      </w:r>
-      <w:r>
-        <w:rPr>
-          <w:rStyle w:val="token"/>
-          <w:rFonts w:ascii="Fraktion Mono" w:hAnsi="Fraktion Mono"/>
-          <w:color w:val="BFC7D5"/>
-          <w:shd w:val="clear" w:color="auto" w:fill="28292B"/>
-        </w:rPr>
-        <w:t xml:space="preserve"> </w:t>
-      </w:r>
-      <w:r>
-        <w:rPr>
-          <w:rStyle w:val="token"/>
-          <w:rFonts w:ascii="Fraktion Mono" w:hAnsi="Fraktion Mono"/>
-          <w:color w:val="C792EA"/>
-          <w:shd w:val="clear" w:color="auto" w:fill="28292B"/>
-        </w:rPr>
-        <w:t>});</w:t>
-      </w:r>
-    </w:p>
-    <w:p>
-      <w:proofErr w:type="gramStart"/>
-      <w:r>
-        <w:t>scale :</w:t>
-      </w:r>
-      <w:proofErr w:type="gramEnd"/>
-      <w:r>
-        <w:t xml:space="preserve"> .5 – </w:t>
-      </w:r>
-      <w:proofErr w:type="spellStart"/>
-      <w:r>
-        <w:t>ti</w:t>
-      </w:r>
-      <w:proofErr w:type="spellEnd"/>
-      <w:r>
-        <w:t xml:space="preserve"> is </w:t>
-      </w:r>
-      <w:proofErr w:type="spellStart"/>
-      <w:r>
-        <w:t>haf</w:t>
-      </w:r>
-      <w:proofErr w:type="spellEnd"/>
-      <w:r>
-        <w:t xml:space="preserve"> size scale :2 – it is </w:t>
-      </w:r>
-      <w:proofErr w:type="spellStart"/>
-      <w:r>
-        <w:t>dubble</w:t>
-      </w:r>
-      <w:proofErr w:type="spellEnd"/>
-      <w:r>
-        <w:t xml:space="preserve"> size</w:t>
-      </w:r>
-    </w:p>
-    <w:p/>
-    <w:p>
-      <w:proofErr w:type="spellStart"/>
-      <w:proofErr w:type="gramStart"/>
-      <w:r>
-        <w:t>gsap.from</w:t>
-      </w:r>
-      <w:proofErr w:type="spellEnd"/>
-      <w:r>
-        <w:t>(</w:t>
-      </w:r>
-      <w:proofErr w:type="gramEnd"/>
-      <w:r>
-        <w:t xml:space="preserve">‘h1’, {y:100, duration:2, </w:t>
-      </w:r>
-      <w:r>
-        <w:rPr>
-          <w:b/>
-        </w:rPr>
-        <w:t>stagger</w:t>
-      </w:r>
-      <w:r>
-        <w:t>: 1})</w:t>
-      </w:r>
-    </w:p>
-    <w:p>
-      <w:proofErr w:type="gramStart"/>
-      <w:r>
-        <w:t>stagger</w:t>
-      </w:r>
-      <w:proofErr w:type="gramEnd"/>
-      <w:r>
-        <w:t xml:space="preserve"> it paly one by one</w:t>
-      </w:r>
-    </w:p>
-    <w:p>
-      <w:proofErr w:type="gramStart"/>
-      <w:r>
-        <w:t>we</w:t>
-      </w:r>
-      <w:proofErr w:type="gramEnd"/>
-      <w:r>
-        <w:t xml:space="preserve"> can give stagger : -1 – it paly revers </w:t>
-      </w:r>
-    </w:p>
-    <w:p>
-      <w:proofErr w:type="gramStart"/>
-      <w:r>
-        <w:rPr>
-          <w:b/>
-        </w:rPr>
-        <w:t>repeat</w:t>
-      </w:r>
-      <w:r>
-        <w:t>:</w:t>
-      </w:r>
-      <w:proofErr w:type="gramEnd"/>
-      <w:r>
-        <w:t>1</w:t>
-      </w:r>
-    </w:p>
-    <w:p>
-      <w:proofErr w:type="gramStart"/>
-      <w:r>
-        <w:t>repeat</w:t>
-      </w:r>
-      <w:proofErr w:type="gramEnd"/>
-      <w:r>
-        <w:t xml:space="preserve"> 1 mean 1 </w:t>
-      </w:r>
-      <w:proofErr w:type="spellStart"/>
-      <w:r>
-        <w:t>itme’s</w:t>
-      </w:r>
-      <w:proofErr w:type="spellEnd"/>
-      <w:r>
-        <w:t xml:space="preserve"> default and 1 more total 1 + 1 = 2 times</w:t>
-      </w:r>
-    </w:p>
-    <w:p>
-      <w:proofErr w:type="gramStart"/>
-      <w:r>
-        <w:t>repeat</w:t>
-      </w:r>
-      <w:proofErr w:type="gramEnd"/>
-      <w:r>
-        <w:t>: -1 it mean infinite</w:t>
-      </w:r>
-    </w:p>
-    <w:p>
-      <w:proofErr w:type="gramStart"/>
-      <w:r>
-        <w:rPr>
-          <w:b/>
-        </w:rPr>
-        <w:t>yoyo</w:t>
-      </w:r>
-      <w:proofErr w:type="gramEnd"/>
-      <w:r>
-        <w:rPr>
-          <w:b/>
-        </w:rPr>
-        <w:t>:</w:t>
-      </w:r>
-      <w:r>
-        <w:t xml:space="preserve"> it is </w:t>
-      </w:r>
-      <w:proofErr w:type="spellStart"/>
-      <w:r>
-        <w:t>bollean</w:t>
-      </w:r>
-      <w:proofErr w:type="spellEnd"/>
-      <w:r>
-        <w:t xml:space="preserve"> </w:t>
-      </w:r>
-    </w:p>
-    <w:p>
-      <w:proofErr w:type="gramStart"/>
-      <w:r>
-        <w:t>yoyo</w:t>
-      </w:r>
-      <w:proofErr w:type="gramEnd"/>
-      <w:r>
-        <w:t xml:space="preserve">: true mean, it </w:t>
-      </w:r>
-      <w:proofErr w:type="spellStart"/>
-      <w:r>
-        <w:t>repest</w:t>
-      </w:r>
-      <w:proofErr w:type="spellEnd"/>
-      <w:r>
-        <w:t xml:space="preserve"> </w:t>
-      </w:r>
-      <w:proofErr w:type="spellStart"/>
-      <w:r>
-        <w:t>smoothely</w:t>
-      </w:r>
-      <w:proofErr w:type="spellEnd"/>
-      <w:r>
-        <w:t>. It go and come back</w:t>
-      </w:r>
-    </w:p>
-    <w:p/>
-    <w:p>
-      <w:r>
-        <w:t>Timeline</w:t>
-      </w:r>
-    </w:p>
-    <w:p>
-      <w:pPr>
-        <w:rPr>
-          <w:rStyle w:val="token"/>
-          <w:rFonts w:ascii="Fraktion Mono" w:hAnsi="Fraktion Mono"/>
-          <w:color w:val="C792EA"/>
-          <w:shd w:val="clear" w:color="auto" w:fill="28292B"/>
-        </w:rPr>
-      </w:pPr>
       <w:r>
         <w:rPr>
           <w:rStyle w:val="token"/>
           <w:rFonts w:ascii="Fraktion Mono" w:hAnsi="Fraktion Mono"/>
           <w:i/>
           <w:iCs/>
-          <w:color w:val="9C9C9C"/>
-          <w:shd w:val="clear" w:color="auto" w:fill="28292B"/>
-        </w:rPr>
-        <w:t>//all tweens run in direct succession</w:t>
-      </w:r>
-      <w:r>
-        <w:rPr>
-          <w:rFonts w:ascii="Fraktion Mono" w:hAnsi="Fraktion Mono"/>
-          <w:color w:val="BFC7D5"/>
-          <w:shd w:val="clear" w:color="auto" w:fill="28292B"/>
-        </w:rPr>
-        <w:br/>
-      </w:r>
-      <w:r>
-        <w:rPr>
-          <w:rStyle w:val="token"/>
-          <w:rFonts w:ascii="Fraktion Mono" w:hAnsi="Fraktion Mono"/>
-          <w:i/>
-          <w:iCs/>
           <w:color w:val="BFC7D5"/>
           <w:shd w:val="clear" w:color="auto" w:fill="28292B"/>
         </w:rPr>
@@ -811,27 +667,7 @@
           <w:color w:val="BFC7D5"/>
           <w:shd w:val="clear" w:color="auto" w:fill="28292B"/>
         </w:rPr>
-        <w:t xml:space="preserve"> </w:t>
-      </w:r>
-      <w:proofErr w:type="spellStart"/>
-      <w:r>
-        <w:rPr>
-          <w:rStyle w:val="token"/>
-          <w:rFonts w:ascii="Fraktion Mono" w:hAnsi="Fraktion Mono"/>
-          <w:color w:val="BFC7D5"/>
-          <w:shd w:val="clear" w:color="auto" w:fill="28292B"/>
-        </w:rPr>
-        <w:t>tl</w:t>
-      </w:r>
-      <w:proofErr w:type="spellEnd"/>
-      <w:r>
-        <w:rPr>
-          <w:rStyle w:val="token"/>
-          <w:rFonts w:ascii="Fraktion Mono" w:hAnsi="Fraktion Mono"/>
-          <w:color w:val="BFC7D5"/>
-          <w:shd w:val="clear" w:color="auto" w:fill="28292B"/>
-        </w:rPr>
-        <w:t xml:space="preserve"> </w:t>
+        <w:t xml:space="preserve"> tl </w:t>
       </w:r>
       <w:r>
         <w:rPr>
@@ -849,18 +685,7 @@
           <w:color w:val="BFC7D5"/>
           <w:shd w:val="clear" w:color="auto" w:fill="28292B"/>
         </w:rPr>
-        <w:t xml:space="preserve"> </w:t>
-      </w:r>
-      <w:proofErr w:type="spellStart"/>
-      <w:proofErr w:type="gramStart"/>
-      <w:r>
-        <w:rPr>
-          <w:rStyle w:val="token"/>
-          <w:rFonts w:ascii="Fraktion Mono" w:hAnsi="Fraktion Mono"/>
-          <w:color w:val="BFC7D5"/>
-          <w:shd w:val="clear" w:color="auto" w:fill="28292B"/>
-        </w:rPr>
-        <w:t>gsap</w:t>
+        <w:t xml:space="preserve"> gsap</w:t>
       </w:r>
       <w:r>
         <w:rPr>
@@ -880,25 +705,14 @@
         </w:rPr>
         <w:t>timeline</w:t>
       </w:r>
-      <w:proofErr w:type="spellEnd"/>
-      <w:r>
-        <w:rPr>
-          <w:rStyle w:val="token"/>
-          <w:rFonts w:ascii="Fraktion Mono" w:hAnsi="Fraktion Mono"/>
-          <w:color w:val="C792EA"/>
-          <w:shd w:val="clear" w:color="auto" w:fill="28292B"/>
-        </w:rPr>
-        <w:t>(</w:t>
-      </w:r>
-      <w:proofErr w:type="gramEnd"/>
-      <w:r>
-        <w:rPr>
-          <w:rStyle w:val="token"/>
-          <w:rFonts w:ascii="Fraktion Mono" w:hAnsi="Fraktion Mono"/>
-          <w:color w:val="C792EA"/>
-          <w:shd w:val="clear" w:color="auto" w:fill="28292B"/>
-        </w:rPr>
-        <w:t>);</w:t>
+      <w:r>
+        <w:rPr>
+          <w:rStyle w:val="token"/>
+          <w:rFonts w:ascii="Fraktion Mono" w:hAnsi="Fraktion Mono"/>
+          <w:color w:val="C792EA"/>
+          <w:shd w:val="clear" w:color="auto" w:fill="28292B"/>
+        </w:rPr>
+        <w:t>();</w:t>
       </w:r>
       <w:r>
         <w:rPr>
@@ -1441,35 +1255,22 @@
           <w:color w:val="9C9C9C"/>
           <w:shd w:val="clear" w:color="auto" w:fill="28292B"/>
         </w:rPr>
-        <w:t>//starts at EXACTLY .5 seconds from the start of the Timeline</w:t>
-      </w:r>
-      <w:proofErr w:type="gramStart"/>
+        <w:t>//starts at EXACTLY .5 seconds from the start of the Timeline:</w:t>
+      </w:r>
+      <w:r>
+        <w:rPr>
+          <w:rFonts w:ascii="Fraktion Mono" w:hAnsi="Fraktion Mono"/>
+          <w:color w:val="BFC7D5"/>
+          <w:shd w:val="clear" w:color="auto" w:fill="28292B"/>
+        </w:rPr>
+        <w:br/>
+      </w:r>
       <w:r>
         <w:rPr>
           <w:rStyle w:val="token"/>
           <w:rFonts w:ascii="Fraktion Mono" w:hAnsi="Fraktion Mono"/>
           <w:i/>
           <w:iCs/>
-          <w:color w:val="9C9C9C"/>
-          <w:shd w:val="clear" w:color="auto" w:fill="28292B"/>
-        </w:rPr>
-        <w:t>:</w:t>
-      </w:r>
-      <w:proofErr w:type="gramEnd"/>
-      <w:r>
-        <w:rPr>
-          <w:rFonts w:ascii="Fraktion Mono" w:hAnsi="Fraktion Mono"/>
-          <w:color w:val="BFC7D5"/>
-          <w:shd w:val="clear" w:color="auto" w:fill="28292B"/>
-        </w:rPr>
-        <w:br/>
-      </w:r>
-      <w:r>
-        <w:rPr>
-          <w:rStyle w:val="token"/>
-          <w:rFonts w:ascii="Fraktion Mono" w:hAnsi="Fraktion Mono"/>
-          <w:i/>
-          <w:iCs/>
           <w:color w:val="BFC7D5"/>
           <w:shd w:val="clear" w:color="auto" w:fill="28292B"/>
         </w:rPr>
@@ -1482,27 +1283,7 @@
           <w:color w:val="BFC7D5"/>
           <w:shd w:val="clear" w:color="auto" w:fill="28292B"/>
         </w:rPr>
-        <w:t xml:space="preserve"> </w:t>
-      </w:r>
-      <w:proofErr w:type="spellStart"/>
-      <w:r>
-        <w:rPr>
-          <w:rStyle w:val="token"/>
-          <w:rFonts w:ascii="Fraktion Mono" w:hAnsi="Fraktion Mono"/>
-          <w:color w:val="BFC7D5"/>
-          <w:shd w:val="clear" w:color="auto" w:fill="28292B"/>
-        </w:rPr>
-        <w:t>tl</w:t>
-      </w:r>
-      <w:proofErr w:type="spellEnd"/>
-      <w:r>
-        <w:rPr>
-          <w:rStyle w:val="token"/>
-          <w:rFonts w:ascii="Fraktion Mono" w:hAnsi="Fraktion Mono"/>
-          <w:color w:val="BFC7D5"/>
-          <w:shd w:val="clear" w:color="auto" w:fill="28292B"/>
-        </w:rPr>
-        <w:t xml:space="preserve"> </w:t>
+        <w:t xml:space="preserve"> tl </w:t>
       </w:r>
       <w:r>
         <w:rPr>
@@ -1520,17 +1301,7 @@
           <w:color w:val="BFC7D5"/>
           <w:shd w:val="clear" w:color="auto" w:fill="28292B"/>
         </w:rPr>
-        <w:t xml:space="preserve"> </w:t>
-      </w:r>
-      <w:proofErr w:type="spellStart"/>
-      <w:r>
-        <w:rPr>
-          <w:rStyle w:val="token"/>
-          <w:rFonts w:ascii="Fraktion Mono" w:hAnsi="Fraktion Mono"/>
-          <w:color w:val="BFC7D5"/>
-          <w:shd w:val="clear" w:color="auto" w:fill="28292B"/>
-        </w:rPr>
-        <w:t>gsap</w:t>
+        <w:t xml:space="preserve"> gsap</w:t>
       </w:r>
       <w:r>
         <w:rPr>
@@ -1550,7 +1321,6 @@
         </w:rPr>
         <w:t>timeline</w:t>
       </w:r>
-      <w:proofErr w:type="spellEnd"/>
       <w:r>
         <w:rPr>
           <w:rStyle w:val="token"/>
@@ -2279,27 +2049,7 @@
           <w:sz w:val="21"/>
           <w:szCs w:val="21"/>
         </w:rPr>
-        <w:t>"</w:t>
-      </w:r>
-      <w:proofErr w:type="spellStart"/>
-      <w:r>
-        <w:rPr>
-          <w:rFonts w:ascii="Consolas" w:eastAsia="Times New Roman" w:hAnsi="Consolas" w:cs="Times New Roman"/>
-          <w:color w:val="A5D6FF"/>
-          <w:sz w:val="21"/>
-          <w:szCs w:val="21"/>
-        </w:rPr>
-        <w:t>bg</w:t>
-      </w:r>
-      <w:proofErr w:type="spellEnd"/>
-      <w:r>
-        <w:rPr>
-          <w:rFonts w:ascii="Consolas" w:eastAsia="Times New Roman" w:hAnsi="Consolas" w:cs="Times New Roman"/>
-          <w:color w:val="A5D6FF"/>
-          <w:sz w:val="21"/>
-          <w:szCs w:val="21"/>
-        </w:rPr>
-        <w:t>-black text-white"</w:t>
+        <w:t>"bg-black text-white"</w:t>
       </w:r>
       <w:r>
         <w:rPr>
@@ -2340,7 +2090,6 @@
         </w:rPr>
         <w:t>&lt;</w:t>
       </w:r>
-      <w:proofErr w:type="gramStart"/>
       <w:r>
         <w:rPr>
           <w:rFonts w:ascii="Consolas" w:eastAsia="Times New Roman" w:hAnsi="Consolas" w:cs="Times New Roman"/>
@@ -2350,7 +2099,6 @@
         </w:rPr>
         <w:t>div</w:t>
       </w:r>
-      <w:proofErr w:type="gramEnd"/>
       <w:r>
         <w:rPr>
           <w:rFonts w:ascii="Consolas" w:eastAsia="Times New Roman" w:hAnsi="Consolas" w:cs="Times New Roman"/>
@@ -2744,7 +2492,6 @@
         </w:rPr>
         <w:t>&lt;</w:t>
       </w:r>
-      <w:proofErr w:type="spellStart"/>
       <w:r>
         <w:rPr>
           <w:rFonts w:ascii="Consolas" w:eastAsia="Times New Roman" w:hAnsi="Consolas" w:cs="Times New Roman"/>
@@ -2754,7 +2501,6 @@
         </w:rPr>
         <w:t>br</w:t>
       </w:r>
-      <w:proofErr w:type="spellEnd"/>
       <w:r>
         <w:rPr>
           <w:rFonts w:ascii="Consolas" w:eastAsia="Times New Roman" w:hAnsi="Consolas" w:cs="Times New Roman"/>
@@ -2803,7 +2549,6 @@
         </w:rPr>
         <w:t>&lt;</w:t>
       </w:r>
-      <w:proofErr w:type="spellStart"/>
       <w:r>
         <w:rPr>
           <w:rFonts w:ascii="Consolas" w:eastAsia="Times New Roman" w:hAnsi="Consolas" w:cs="Times New Roman"/>
@@ -2813,7 +2558,6 @@
         </w:rPr>
         <w:t>br</w:t>
       </w:r>
-      <w:proofErr w:type="spellEnd"/>
       <w:r>
         <w:rPr>
           <w:rFonts w:ascii="Consolas" w:eastAsia="Times New Roman" w:hAnsi="Consolas" w:cs="Times New Roman"/>
@@ -2905,27 +2649,7 @@
           <w:sz w:val="21"/>
           <w:szCs w:val="21"/>
         </w:rPr>
-        <w:t>"</w:t>
-      </w:r>
-      <w:proofErr w:type="spellStart"/>
-      <w:r>
-        <w:rPr>
-          <w:rFonts w:ascii="Consolas" w:eastAsia="Times New Roman" w:hAnsi="Consolas" w:cs="Times New Roman"/>
-          <w:color w:val="A5D6FF"/>
-          <w:sz w:val="21"/>
-          <w:szCs w:val="21"/>
-        </w:rPr>
-        <w:t>nav</w:t>
-      </w:r>
-      <w:proofErr w:type="spellEnd"/>
-      <w:r>
-        <w:rPr>
-          <w:rFonts w:ascii="Consolas" w:eastAsia="Times New Roman" w:hAnsi="Consolas" w:cs="Times New Roman"/>
-          <w:color w:val="A5D6FF"/>
-          <w:sz w:val="21"/>
-          <w:szCs w:val="21"/>
-        </w:rPr>
-        <w:t xml:space="preserve"> light"</w:t>
+        <w:t>"nav light"</w:t>
       </w:r>
       <w:r>
         <w:rPr>
@@ -3020,25 +2744,14 @@
         </w:rPr>
         <w:t>&gt;</w:t>
       </w:r>
-      <w:proofErr w:type="gramStart"/>
-      <w:r>
-        <w:rPr>
-          <w:rFonts w:ascii="Consolas" w:eastAsia="Times New Roman" w:hAnsi="Consolas" w:cs="Times New Roman"/>
-          <w:color w:val="BBBEBF"/>
-          <w:sz w:val="21"/>
-          <w:szCs w:val="21"/>
-        </w:rPr>
-        <w:t>play(</w:t>
-      </w:r>
-      <w:proofErr w:type="gramEnd"/>
-      <w:r>
-        <w:rPr>
-          <w:rFonts w:ascii="Consolas" w:eastAsia="Times New Roman" w:hAnsi="Consolas" w:cs="Times New Roman"/>
-          <w:color w:val="BBBEBF"/>
-          <w:sz w:val="21"/>
-          <w:szCs w:val="21"/>
-        </w:rPr>
-        <w:t>)</w:t>
+      <w:r>
+        <w:rPr>
+          <w:rFonts w:ascii="Consolas" w:eastAsia="Times New Roman" w:hAnsi="Consolas" w:cs="Times New Roman"/>
+          <w:color w:val="BBBEBF"/>
+          <w:sz w:val="21"/>
+          <w:szCs w:val="21"/>
+        </w:rPr>
+        <w:t>play()</w:t>
       </w:r>
       <w:r>
         <w:rPr>
@@ -3151,25 +2864,14 @@
         </w:rPr>
         <w:t>&gt;</w:t>
       </w:r>
-      <w:proofErr w:type="gramStart"/>
-      <w:r>
-        <w:rPr>
-          <w:rFonts w:ascii="Consolas" w:eastAsia="Times New Roman" w:hAnsi="Consolas" w:cs="Times New Roman"/>
-          <w:color w:val="BBBEBF"/>
-          <w:sz w:val="21"/>
-          <w:szCs w:val="21"/>
-        </w:rPr>
-        <w:t>pause(</w:t>
-      </w:r>
-      <w:proofErr w:type="gramEnd"/>
-      <w:r>
-        <w:rPr>
-          <w:rFonts w:ascii="Consolas" w:eastAsia="Times New Roman" w:hAnsi="Consolas" w:cs="Times New Roman"/>
-          <w:color w:val="BBBEBF"/>
-          <w:sz w:val="21"/>
-          <w:szCs w:val="21"/>
-        </w:rPr>
-        <w:t>)</w:t>
+      <w:r>
+        <w:rPr>
+          <w:rFonts w:ascii="Consolas" w:eastAsia="Times New Roman" w:hAnsi="Consolas" w:cs="Times New Roman"/>
+          <w:color w:val="BBBEBF"/>
+          <w:sz w:val="21"/>
+          <w:szCs w:val="21"/>
+        </w:rPr>
+        <w:t>pause()</w:t>
       </w:r>
       <w:r>
         <w:rPr>
@@ -3282,25 +2984,14 @@
         </w:rPr>
         <w:t>&gt;</w:t>
       </w:r>
-      <w:proofErr w:type="gramStart"/>
-      <w:r>
-        <w:rPr>
-          <w:rFonts w:ascii="Consolas" w:eastAsia="Times New Roman" w:hAnsi="Consolas" w:cs="Times New Roman"/>
-          <w:color w:val="BBBEBF"/>
-          <w:sz w:val="21"/>
-          <w:szCs w:val="21"/>
-        </w:rPr>
-        <w:t>resume(</w:t>
-      </w:r>
-      <w:proofErr w:type="gramEnd"/>
-      <w:r>
-        <w:rPr>
-          <w:rFonts w:ascii="Consolas" w:eastAsia="Times New Roman" w:hAnsi="Consolas" w:cs="Times New Roman"/>
-          <w:color w:val="BBBEBF"/>
-          <w:sz w:val="21"/>
-          <w:szCs w:val="21"/>
-        </w:rPr>
-        <w:t>)</w:t>
+      <w:r>
+        <w:rPr>
+          <w:rFonts w:ascii="Consolas" w:eastAsia="Times New Roman" w:hAnsi="Consolas" w:cs="Times New Roman"/>
+          <w:color w:val="BBBEBF"/>
+          <w:sz w:val="21"/>
+          <w:szCs w:val="21"/>
+        </w:rPr>
+        <w:t>resume()</w:t>
       </w:r>
       <w:r>
         <w:rPr>
@@ -3413,25 +3104,14 @@
         </w:rPr>
         <w:t>&gt;</w:t>
       </w:r>
-      <w:proofErr w:type="gramStart"/>
-      <w:r>
-        <w:rPr>
-          <w:rFonts w:ascii="Consolas" w:eastAsia="Times New Roman" w:hAnsi="Consolas" w:cs="Times New Roman"/>
-          <w:color w:val="BBBEBF"/>
-          <w:sz w:val="21"/>
-          <w:szCs w:val="21"/>
-        </w:rPr>
-        <w:t>reverse(</w:t>
-      </w:r>
-      <w:proofErr w:type="gramEnd"/>
-      <w:r>
-        <w:rPr>
-          <w:rFonts w:ascii="Consolas" w:eastAsia="Times New Roman" w:hAnsi="Consolas" w:cs="Times New Roman"/>
-          <w:color w:val="BBBEBF"/>
-          <w:sz w:val="21"/>
-          <w:szCs w:val="21"/>
-        </w:rPr>
-        <w:t>)</w:t>
+      <w:r>
+        <w:rPr>
+          <w:rFonts w:ascii="Consolas" w:eastAsia="Times New Roman" w:hAnsi="Consolas" w:cs="Times New Roman"/>
+          <w:color w:val="BBBEBF"/>
+          <w:sz w:val="21"/>
+          <w:szCs w:val="21"/>
+        </w:rPr>
+        <w:t>reverse()</w:t>
       </w:r>
       <w:r>
         <w:rPr>
@@ -3544,25 +3224,14 @@
         </w:rPr>
         <w:t>&gt;</w:t>
       </w:r>
-      <w:proofErr w:type="gramStart"/>
-      <w:r>
-        <w:rPr>
-          <w:rFonts w:ascii="Consolas" w:eastAsia="Times New Roman" w:hAnsi="Consolas" w:cs="Times New Roman"/>
-          <w:color w:val="BBBEBF"/>
-          <w:sz w:val="21"/>
-          <w:szCs w:val="21"/>
-        </w:rPr>
-        <w:t>restart(</w:t>
-      </w:r>
-      <w:proofErr w:type="gramEnd"/>
-      <w:r>
-        <w:rPr>
-          <w:rFonts w:ascii="Consolas" w:eastAsia="Times New Roman" w:hAnsi="Consolas" w:cs="Times New Roman"/>
-          <w:color w:val="BBBEBF"/>
-          <w:sz w:val="21"/>
-          <w:szCs w:val="21"/>
-        </w:rPr>
-        <w:t>)</w:t>
+      <w:r>
+        <w:rPr>
+          <w:rFonts w:ascii="Consolas" w:eastAsia="Times New Roman" w:hAnsi="Consolas" w:cs="Times New Roman"/>
+          <w:color w:val="BBBEBF"/>
+          <w:sz w:val="21"/>
+          <w:szCs w:val="21"/>
+        </w:rPr>
+        <w:t>restart()</w:t>
       </w:r>
       <w:r>
         <w:rPr>
@@ -3747,7 +3416,6 @@
         </w:rPr>
         <w:t xml:space="preserve">      </w:t>
       </w:r>
-      <w:proofErr w:type="gramStart"/>
       <w:r>
         <w:rPr>
           <w:rFonts w:ascii="Consolas" w:eastAsia="Times New Roman" w:hAnsi="Consolas" w:cs="Times New Roman"/>
@@ -3757,7 +3425,6 @@
         </w:rPr>
         <w:t>integrity</w:t>
       </w:r>
-      <w:proofErr w:type="gramEnd"/>
       <w:r>
         <w:rPr>
           <w:rFonts w:ascii="Consolas" w:eastAsia="Times New Roman" w:hAnsi="Consolas" w:cs="Times New Roman"/>
@@ -3797,8 +3464,6 @@
         </w:rPr>
         <w:t xml:space="preserve">      </w:t>
       </w:r>
-      <w:proofErr w:type="spellStart"/>
-      <w:proofErr w:type="gramStart"/>
       <w:r>
         <w:rPr>
           <w:rFonts w:ascii="Consolas" w:eastAsia="Times New Roman" w:hAnsi="Consolas" w:cs="Times New Roman"/>
@@ -3808,8 +3473,6 @@
         </w:rPr>
         <w:t>crossorigin</w:t>
       </w:r>
-      <w:proofErr w:type="spellEnd"/>
-      <w:proofErr w:type="gramEnd"/>
       <w:r>
         <w:rPr>
           <w:rFonts w:ascii="Consolas" w:eastAsia="Times New Roman" w:hAnsi="Consolas" w:cs="Times New Roman"/>
@@ -3849,8 +3512,6 @@
         </w:rPr>
         <w:t xml:space="preserve">      </w:t>
       </w:r>
-      <w:proofErr w:type="spellStart"/>
-      <w:proofErr w:type="gramStart"/>
       <w:r>
         <w:rPr>
           <w:rFonts w:ascii="Consolas" w:eastAsia="Times New Roman" w:hAnsi="Consolas" w:cs="Times New Roman"/>
@@ -3860,8 +3521,6 @@
         </w:rPr>
         <w:t>referrerpolicy</w:t>
       </w:r>
-      <w:proofErr w:type="spellEnd"/>
-      <w:proofErr w:type="gramEnd"/>
       <w:r>
         <w:rPr>
           <w:rFonts w:ascii="Consolas" w:eastAsia="Times New Roman" w:hAnsi="Consolas" w:cs="Times New Roman"/>
@@ -3958,7 +3617,6 @@
         </w:rPr>
         <w:t>&lt;</w:t>
       </w:r>
-      <w:proofErr w:type="gramStart"/>
       <w:r>
         <w:rPr>
           <w:rFonts w:ascii="Consolas" w:eastAsia="Times New Roman" w:hAnsi="Consolas" w:cs="Times New Roman"/>
@@ -3968,7 +3626,6 @@
         </w:rPr>
         <w:t>script</w:t>
       </w:r>
-      <w:proofErr w:type="gramEnd"/>
       <w:r>
         <w:rPr>
           <w:rFonts w:ascii="Consolas" w:eastAsia="Times New Roman" w:hAnsi="Consolas" w:cs="Times New Roman"/>
@@ -4029,7 +3686,6 @@
         </w:rPr>
         <w:t xml:space="preserve">      </w:t>
       </w:r>
-      <w:proofErr w:type="gramStart"/>
       <w:r>
         <w:rPr>
           <w:rFonts w:ascii="Consolas" w:eastAsia="Times New Roman" w:hAnsi="Consolas" w:cs="Times New Roman"/>
@@ -4039,17 +3695,15 @@
         </w:rPr>
         <w:t>let</w:t>
       </w:r>
-      <w:proofErr w:type="gramEnd"/>
-      <w:r>
-        <w:rPr>
-          <w:rFonts w:ascii="Consolas" w:eastAsia="Times New Roman" w:hAnsi="Consolas" w:cs="Times New Roman"/>
-          <w:color w:val="D4D4D4"/>
-          <w:sz w:val="21"/>
-          <w:szCs w:val="21"/>
-        </w:rPr>
-        <w:t xml:space="preserve"> </w:t>
-      </w:r>
-      <w:proofErr w:type="spellStart"/>
+      <w:r>
+        <w:rPr>
+          <w:rFonts w:ascii="Consolas" w:eastAsia="Times New Roman" w:hAnsi="Consolas" w:cs="Times New Roman"/>
+          <w:color w:val="D4D4D4"/>
+          <w:sz w:val="21"/>
+          <w:szCs w:val="21"/>
+        </w:rPr>
+        <w:t xml:space="preserve"> </w:t>
+      </w:r>
       <w:r>
         <w:rPr>
           <w:rFonts w:ascii="Consolas" w:eastAsia="Times New Roman" w:hAnsi="Consolas" w:cs="Times New Roman"/>
@@ -4059,7 +3713,6 @@
         </w:rPr>
         <w:t>tl</w:t>
       </w:r>
-      <w:proofErr w:type="spellEnd"/>
       <w:r>
         <w:rPr>
           <w:rFonts w:ascii="Consolas" w:eastAsia="Times New Roman" w:hAnsi="Consolas" w:cs="Times New Roman"/>
@@ -4069,7 +3722,6 @@
         </w:rPr>
         <w:t xml:space="preserve"> = </w:t>
       </w:r>
-      <w:proofErr w:type="spellStart"/>
       <w:r>
         <w:rPr>
           <w:rFonts w:ascii="Consolas" w:eastAsia="Times New Roman" w:hAnsi="Consolas" w:cs="Times New Roman"/>
@@ -4097,7 +3749,6 @@
         </w:rPr>
         <w:t>timeline</w:t>
       </w:r>
-      <w:proofErr w:type="spellEnd"/>
       <w:r>
         <w:rPr>
           <w:rFonts w:ascii="Consolas" w:eastAsia="Times New Roman" w:hAnsi="Consolas" w:cs="Times New Roman"/>
@@ -4128,7 +3779,6 @@
         </w:rPr>
         <w:t xml:space="preserve">      </w:t>
       </w:r>
-      <w:proofErr w:type="gramStart"/>
       <w:r>
         <w:rPr>
           <w:rFonts w:ascii="Consolas" w:eastAsia="Times New Roman" w:hAnsi="Consolas" w:cs="Times New Roman"/>
@@ -4138,7 +3788,6 @@
         </w:rPr>
         <w:t>let</w:t>
       </w:r>
-      <w:proofErr w:type="gramEnd"/>
       <w:r>
         <w:rPr>
           <w:rFonts w:ascii="Consolas" w:eastAsia="Times New Roman" w:hAnsi="Consolas" w:cs="Times New Roman"/>
@@ -4166,7 +3815,6 @@
         </w:rPr>
         <w:t xml:space="preserve"> = </w:t>
       </w:r>
-      <w:proofErr w:type="spellStart"/>
       <w:r>
         <w:rPr>
           <w:rFonts w:ascii="Consolas" w:eastAsia="Times New Roman" w:hAnsi="Consolas" w:cs="Times New Roman"/>
@@ -4176,7 +3824,6 @@
         </w:rPr>
         <w:t>tl</w:t>
       </w:r>
-      <w:proofErr w:type="spellEnd"/>
     </w:p>
     <w:p>
       <w:pPr>
@@ -4198,7 +3845,6 @@
         </w:rPr>
         <w:t>        .</w:t>
       </w:r>
-      <w:proofErr w:type="gramStart"/>
       <w:r>
         <w:rPr>
           <w:rFonts w:ascii="Consolas" w:eastAsia="Times New Roman" w:hAnsi="Consolas" w:cs="Times New Roman"/>
@@ -4217,7 +3863,6 @@
         </w:rPr>
         <w:t>(</w:t>
       </w:r>
-      <w:proofErr w:type="gramEnd"/>
       <w:r>
         <w:rPr>
           <w:rFonts w:ascii="Consolas" w:eastAsia="Times New Roman" w:hAnsi="Consolas" w:cs="Times New Roman"/>
@@ -4363,27 +4008,7 @@
           <w:sz w:val="21"/>
           <w:szCs w:val="21"/>
         </w:rPr>
-        <w:t xml:space="preserve">//add </w:t>
-      </w:r>
-      <w:proofErr w:type="spellStart"/>
-      <w:r>
-        <w:rPr>
-          <w:rFonts w:ascii="Consolas" w:eastAsia="Times New Roman" w:hAnsi="Consolas" w:cs="Times New Roman"/>
-          <w:color w:val="8B949E"/>
-          <w:sz w:val="21"/>
-          <w:szCs w:val="21"/>
-        </w:rPr>
-        <w:t>blueSpin</w:t>
-      </w:r>
-      <w:proofErr w:type="spellEnd"/>
-      <w:r>
-        <w:rPr>
-          <w:rFonts w:ascii="Consolas" w:eastAsia="Times New Roman" w:hAnsi="Consolas" w:cs="Times New Roman"/>
-          <w:color w:val="8B949E"/>
-          <w:sz w:val="21"/>
-          <w:szCs w:val="21"/>
-        </w:rPr>
-        <w:t xml:space="preserve"> label 1 second after end of timeline</w:t>
+        <w:t>//add blueSpin label 1 second after end of timeline</w:t>
       </w:r>
     </w:p>
     <w:p>
@@ -4406,7 +4031,6 @@
         </w:rPr>
         <w:t>        .</w:t>
       </w:r>
-      <w:proofErr w:type="gramStart"/>
       <w:r>
         <w:rPr>
           <w:rFonts w:ascii="Consolas" w:eastAsia="Times New Roman" w:hAnsi="Consolas" w:cs="Times New Roman"/>
@@ -4425,7 +4049,6 @@
         </w:rPr>
         <w:t>(</w:t>
       </w:r>
-      <w:proofErr w:type="gramEnd"/>
       <w:r>
         <w:rPr>
           <w:rFonts w:ascii="Consolas" w:eastAsia="Times New Roman" w:hAnsi="Consolas" w:cs="Times New Roman"/>
@@ -4433,27 +4056,7 @@
           <w:sz w:val="21"/>
           <w:szCs w:val="21"/>
         </w:rPr>
-        <w:t>"</w:t>
-      </w:r>
-      <w:proofErr w:type="spellStart"/>
-      <w:r>
-        <w:rPr>
-          <w:rFonts w:ascii="Consolas" w:eastAsia="Times New Roman" w:hAnsi="Consolas" w:cs="Times New Roman"/>
-          <w:color w:val="A5D6FF"/>
-          <w:sz w:val="21"/>
-          <w:szCs w:val="21"/>
-        </w:rPr>
-        <w:t>blueSpin</w:t>
-      </w:r>
-      <w:proofErr w:type="spellEnd"/>
-      <w:r>
-        <w:rPr>
-          <w:rFonts w:ascii="Consolas" w:eastAsia="Times New Roman" w:hAnsi="Consolas" w:cs="Times New Roman"/>
-          <w:color w:val="A5D6FF"/>
-          <w:sz w:val="21"/>
-          <w:szCs w:val="21"/>
-        </w:rPr>
-        <w:t>"</w:t>
+        <w:t>"blueSpin"</w:t>
       </w:r>
       <w:r>
         <w:rPr>
@@ -4510,27 +4113,7 @@
           <w:sz w:val="21"/>
           <w:szCs w:val="21"/>
         </w:rPr>
-        <w:t xml:space="preserve">//add tween at </w:t>
-      </w:r>
-      <w:proofErr w:type="spellStart"/>
-      <w:r>
-        <w:rPr>
-          <w:rFonts w:ascii="Consolas" w:eastAsia="Times New Roman" w:hAnsi="Consolas" w:cs="Times New Roman"/>
-          <w:color w:val="8B949E"/>
-          <w:sz w:val="21"/>
-          <w:szCs w:val="21"/>
-        </w:rPr>
-        <w:t>blueSpin</w:t>
-      </w:r>
-      <w:proofErr w:type="spellEnd"/>
-      <w:r>
-        <w:rPr>
-          <w:rFonts w:ascii="Consolas" w:eastAsia="Times New Roman" w:hAnsi="Consolas" w:cs="Times New Roman"/>
-          <w:color w:val="8B949E"/>
-          <w:sz w:val="21"/>
-          <w:szCs w:val="21"/>
-        </w:rPr>
-        <w:t xml:space="preserve"> label</w:t>
+        <w:t>//add tween at blueSpin label</w:t>
       </w:r>
     </w:p>
     <w:p>
@@ -4553,7 +4136,6 @@
         </w:rPr>
         <w:t>        .</w:t>
       </w:r>
-      <w:proofErr w:type="gramStart"/>
       <w:r>
         <w:rPr>
           <w:rFonts w:ascii="Consolas" w:eastAsia="Times New Roman" w:hAnsi="Consolas" w:cs="Times New Roman"/>
@@ -4572,7 +4154,6 @@
         </w:rPr>
         <w:t>(</w:t>
       </w:r>
-      <w:proofErr w:type="gramEnd"/>
       <w:r>
         <w:rPr>
           <w:rFonts w:ascii="Consolas" w:eastAsia="Times New Roman" w:hAnsi="Consolas" w:cs="Times New Roman"/>
@@ -4742,27 +4323,7 @@
           <w:sz w:val="21"/>
           <w:szCs w:val="21"/>
         </w:rPr>
-        <w:t>"</w:t>
-      </w:r>
-      <w:proofErr w:type="spellStart"/>
-      <w:r>
-        <w:rPr>
-          <w:rFonts w:ascii="Consolas" w:eastAsia="Times New Roman" w:hAnsi="Consolas" w:cs="Times New Roman"/>
-          <w:color w:val="A5D6FF"/>
-          <w:sz w:val="21"/>
-          <w:szCs w:val="21"/>
-        </w:rPr>
-        <w:t>blueSpin</w:t>
-      </w:r>
-      <w:proofErr w:type="spellEnd"/>
-      <w:r>
-        <w:rPr>
-          <w:rFonts w:ascii="Consolas" w:eastAsia="Times New Roman" w:hAnsi="Consolas" w:cs="Times New Roman"/>
-          <w:color w:val="A5D6FF"/>
-          <w:sz w:val="21"/>
-          <w:szCs w:val="21"/>
-        </w:rPr>
-        <w:t>"</w:t>
+        <w:t>"blueSpin"</w:t>
       </w:r>
       <w:r>
         <w:rPr>
@@ -4801,27 +4362,7 @@
           <w:sz w:val="21"/>
           <w:szCs w:val="21"/>
         </w:rPr>
-        <w:t xml:space="preserve">//insert tween 0.5 seconds after </w:t>
-      </w:r>
-      <w:proofErr w:type="spellStart"/>
-      <w:r>
-        <w:rPr>
-          <w:rFonts w:ascii="Consolas" w:eastAsia="Times New Roman" w:hAnsi="Consolas" w:cs="Times New Roman"/>
-          <w:color w:val="8B949E"/>
-          <w:sz w:val="21"/>
-          <w:szCs w:val="21"/>
-        </w:rPr>
-        <w:t>blueSpin</w:t>
-      </w:r>
-      <w:proofErr w:type="spellEnd"/>
-      <w:r>
-        <w:rPr>
-          <w:rFonts w:ascii="Consolas" w:eastAsia="Times New Roman" w:hAnsi="Consolas" w:cs="Times New Roman"/>
-          <w:color w:val="8B949E"/>
-          <w:sz w:val="21"/>
-          <w:szCs w:val="21"/>
-        </w:rPr>
-        <w:t xml:space="preserve"> label</w:t>
+        <w:t>//insert tween 0.5 seconds after blueSpin label</w:t>
       </w:r>
     </w:p>
     <w:p>
@@ -4844,7 +4385,6 @@
         </w:rPr>
         <w:t>        .</w:t>
       </w:r>
-      <w:proofErr w:type="gramStart"/>
       <w:r>
         <w:rPr>
           <w:rFonts w:ascii="Consolas" w:eastAsia="Times New Roman" w:hAnsi="Consolas" w:cs="Times New Roman"/>
@@ -4863,7 +4403,6 @@
         </w:rPr>
         <w:t>(</w:t>
       </w:r>
-      <w:proofErr w:type="gramEnd"/>
       <w:r>
         <w:rPr>
           <w:rFonts w:ascii="Consolas" w:eastAsia="Times New Roman" w:hAnsi="Consolas" w:cs="Times New Roman"/>
@@ -5033,27 +4572,7 @@
           <w:sz w:val="21"/>
           <w:szCs w:val="21"/>
         </w:rPr>
-        <w:t>"</w:t>
-      </w:r>
-      <w:proofErr w:type="spellStart"/>
-      <w:r>
-        <w:rPr>
-          <w:rFonts w:ascii="Consolas" w:eastAsia="Times New Roman" w:hAnsi="Consolas" w:cs="Times New Roman"/>
-          <w:color w:val="A5D6FF"/>
-          <w:sz w:val="21"/>
-          <w:szCs w:val="21"/>
-        </w:rPr>
-        <w:t>blueSpin</w:t>
-      </w:r>
-      <w:proofErr w:type="spellEnd"/>
-      <w:r>
-        <w:rPr>
-          <w:rFonts w:ascii="Consolas" w:eastAsia="Times New Roman" w:hAnsi="Consolas" w:cs="Times New Roman"/>
-          <w:color w:val="A5D6FF"/>
-          <w:sz w:val="21"/>
-          <w:szCs w:val="21"/>
-        </w:rPr>
-        <w:t>+=0.5"</w:t>
+        <w:t>"blueSpin+=0.5"</w:t>
       </w:r>
       <w:r>
         <w:rPr>
@@ -5127,8 +4646,6 @@
         </w:rPr>
         <w:t xml:space="preserve">      </w:t>
       </w:r>
-      <w:proofErr w:type="spellStart"/>
-      <w:proofErr w:type="gramStart"/>
       <w:r>
         <w:rPr>
           <w:rFonts w:ascii="Consolas" w:eastAsia="Times New Roman" w:hAnsi="Consolas" w:cs="Times New Roman"/>
@@ -5156,7 +4673,6 @@
         </w:rPr>
         <w:t>querySelector</w:t>
       </w:r>
-      <w:proofErr w:type="spellEnd"/>
       <w:r>
         <w:rPr>
           <w:rFonts w:ascii="Consolas" w:eastAsia="Times New Roman" w:hAnsi="Consolas" w:cs="Times New Roman"/>
@@ -5166,7 +4682,6 @@
         </w:rPr>
         <w:t>(</w:t>
       </w:r>
-      <w:proofErr w:type="gramEnd"/>
       <w:r>
         <w:rPr>
           <w:rFonts w:ascii="Consolas" w:eastAsia="Times New Roman" w:hAnsi="Consolas" w:cs="Times New Roman"/>
@@ -5185,7 +4700,6 @@
         </w:rPr>
         <w:t>).</w:t>
       </w:r>
-      <w:proofErr w:type="spellStart"/>
       <w:r>
         <w:rPr>
           <w:rFonts w:ascii="Consolas" w:eastAsia="Times New Roman" w:hAnsi="Consolas" w:cs="Times New Roman"/>
@@ -5195,7 +4709,6 @@
         </w:rPr>
         <w:t>onclick</w:t>
       </w:r>
-      <w:proofErr w:type="spellEnd"/>
       <w:r>
         <w:rPr>
           <w:rFonts w:ascii="Consolas" w:eastAsia="Times New Roman" w:hAnsi="Consolas" w:cs="Times New Roman"/>
@@ -5223,7 +4736,6 @@
         </w:rPr>
         <w:t xml:space="preserve"> </w:t>
       </w:r>
-      <w:proofErr w:type="spellStart"/>
       <w:r>
         <w:rPr>
           <w:rFonts w:ascii="Consolas" w:eastAsia="Times New Roman" w:hAnsi="Consolas" w:cs="Times New Roman"/>
@@ -5251,7 +4763,6 @@
         </w:rPr>
         <w:t>play</w:t>
       </w:r>
-      <w:proofErr w:type="spellEnd"/>
       <w:r>
         <w:rPr>
           <w:rFonts w:ascii="Consolas" w:eastAsia="Times New Roman" w:hAnsi="Consolas" w:cs="Times New Roman"/>
@@ -5282,8 +4793,6 @@
         </w:rPr>
         <w:t xml:space="preserve">      </w:t>
       </w:r>
-      <w:proofErr w:type="spellStart"/>
-      <w:proofErr w:type="gramStart"/>
       <w:r>
         <w:rPr>
           <w:rFonts w:ascii="Consolas" w:eastAsia="Times New Roman" w:hAnsi="Consolas" w:cs="Times New Roman"/>
@@ -5311,7 +4820,6 @@
         </w:rPr>
         <w:t>querySelector</w:t>
       </w:r>
-      <w:proofErr w:type="spellEnd"/>
       <w:r>
         <w:rPr>
           <w:rFonts w:ascii="Consolas" w:eastAsia="Times New Roman" w:hAnsi="Consolas" w:cs="Times New Roman"/>
@@ -5321,7 +4829,6 @@
         </w:rPr>
         <w:t>(</w:t>
       </w:r>
-      <w:proofErr w:type="gramEnd"/>
       <w:r>
         <w:rPr>
           <w:rFonts w:ascii="Consolas" w:eastAsia="Times New Roman" w:hAnsi="Consolas" w:cs="Times New Roman"/>
@@ -5340,7 +4847,6 @@
         </w:rPr>
         <w:t>).</w:t>
       </w:r>
-      <w:proofErr w:type="spellStart"/>
       <w:r>
         <w:rPr>
           <w:rFonts w:ascii="Consolas" w:eastAsia="Times New Roman" w:hAnsi="Consolas" w:cs="Times New Roman"/>
@@ -5350,7 +4856,6 @@
         </w:rPr>
         <w:t>onclick</w:t>
       </w:r>
-      <w:proofErr w:type="spellEnd"/>
       <w:r>
         <w:rPr>
           <w:rFonts w:ascii="Consolas" w:eastAsia="Times New Roman" w:hAnsi="Consolas" w:cs="Times New Roman"/>
@@ -5378,7 +4883,6 @@
         </w:rPr>
         <w:t xml:space="preserve"> </w:t>
       </w:r>
-      <w:proofErr w:type="spellStart"/>
       <w:r>
         <w:rPr>
           <w:rFonts w:ascii="Consolas" w:eastAsia="Times New Roman" w:hAnsi="Consolas" w:cs="Times New Roman"/>
@@ -5406,7 +4910,6 @@
         </w:rPr>
         <w:t>pause</w:t>
       </w:r>
-      <w:proofErr w:type="spellEnd"/>
       <w:r>
         <w:rPr>
           <w:rFonts w:ascii="Consolas" w:eastAsia="Times New Roman" w:hAnsi="Consolas" w:cs="Times New Roman"/>
@@ -5437,8 +4940,6 @@
         </w:rPr>
         <w:t xml:space="preserve">      </w:t>
       </w:r>
-      <w:proofErr w:type="spellStart"/>
-      <w:proofErr w:type="gramStart"/>
       <w:r>
         <w:rPr>
           <w:rFonts w:ascii="Consolas" w:eastAsia="Times New Roman" w:hAnsi="Consolas" w:cs="Times New Roman"/>
@@ -5466,7 +4967,6 @@
         </w:rPr>
         <w:t>querySelector</w:t>
       </w:r>
-      <w:proofErr w:type="spellEnd"/>
       <w:r>
         <w:rPr>
           <w:rFonts w:ascii="Consolas" w:eastAsia="Times New Roman" w:hAnsi="Consolas" w:cs="Times New Roman"/>
@@ -5476,7 +4976,6 @@
         </w:rPr>
         <w:t>(</w:t>
       </w:r>
-      <w:proofErr w:type="gramEnd"/>
       <w:r>
         <w:rPr>
           <w:rFonts w:ascii="Consolas" w:eastAsia="Times New Roman" w:hAnsi="Consolas" w:cs="Times New Roman"/>
@@ -5495,7 +4994,6 @@
         </w:rPr>
         <w:t>).</w:t>
       </w:r>
-      <w:proofErr w:type="spellStart"/>
       <w:r>
         <w:rPr>
           <w:rFonts w:ascii="Consolas" w:eastAsia="Times New Roman" w:hAnsi="Consolas" w:cs="Times New Roman"/>
@@ -5505,7 +5003,6 @@
         </w:rPr>
         <w:t>onclick</w:t>
       </w:r>
-      <w:proofErr w:type="spellEnd"/>
       <w:r>
         <w:rPr>
           <w:rFonts w:ascii="Consolas" w:eastAsia="Times New Roman" w:hAnsi="Consolas" w:cs="Times New Roman"/>
@@ -5533,7 +5030,6 @@
         </w:rPr>
         <w:t xml:space="preserve"> </w:t>
       </w:r>
-      <w:proofErr w:type="spellStart"/>
       <w:r>
         <w:rPr>
           <w:rFonts w:ascii="Consolas" w:eastAsia="Times New Roman" w:hAnsi="Consolas" w:cs="Times New Roman"/>
@@ -5561,7 +5057,6 @@
         </w:rPr>
         <w:t>resume</w:t>
       </w:r>
-      <w:proofErr w:type="spellEnd"/>
       <w:r>
         <w:rPr>
           <w:rFonts w:ascii="Consolas" w:eastAsia="Times New Roman" w:hAnsi="Consolas" w:cs="Times New Roman"/>
@@ -5592,8 +5087,6 @@
         </w:rPr>
         <w:t xml:space="preserve">      </w:t>
       </w:r>
-      <w:proofErr w:type="spellStart"/>
-      <w:proofErr w:type="gramStart"/>
       <w:r>
         <w:rPr>
           <w:rFonts w:ascii="Consolas" w:eastAsia="Times New Roman" w:hAnsi="Consolas" w:cs="Times New Roman"/>
@@ -5621,7 +5114,6 @@
         </w:rPr>
         <w:t>querySelector</w:t>
       </w:r>
-      <w:proofErr w:type="spellEnd"/>
       <w:r>
         <w:rPr>
           <w:rFonts w:ascii="Consolas" w:eastAsia="Times New Roman" w:hAnsi="Consolas" w:cs="Times New Roman"/>
@@ -5631,7 +5123,6 @@
         </w:rPr>
         <w:t>(</w:t>
       </w:r>
-      <w:proofErr w:type="gramEnd"/>
       <w:r>
         <w:rPr>
           <w:rFonts w:ascii="Consolas" w:eastAsia="Times New Roman" w:hAnsi="Consolas" w:cs="Times New Roman"/>
@@ -5650,7 +5141,6 @@
         </w:rPr>
         <w:t>).</w:t>
       </w:r>
-      <w:proofErr w:type="spellStart"/>
       <w:r>
         <w:rPr>
           <w:rFonts w:ascii="Consolas" w:eastAsia="Times New Roman" w:hAnsi="Consolas" w:cs="Times New Roman"/>
@@ -5660,7 +5150,6 @@
         </w:rPr>
         <w:t>onclick</w:t>
       </w:r>
-      <w:proofErr w:type="spellEnd"/>
       <w:r>
         <w:rPr>
           <w:rFonts w:ascii="Consolas" w:eastAsia="Times New Roman" w:hAnsi="Consolas" w:cs="Times New Roman"/>
@@ -5688,7 +5177,6 @@
         </w:rPr>
         <w:t xml:space="preserve"> </w:t>
       </w:r>
-      <w:proofErr w:type="spellStart"/>
       <w:r>
         <w:rPr>
           <w:rFonts w:ascii="Consolas" w:eastAsia="Times New Roman" w:hAnsi="Consolas" w:cs="Times New Roman"/>
@@ -5716,7 +5204,6 @@
         </w:rPr>
         <w:t>reverse</w:t>
       </w:r>
-      <w:proofErr w:type="spellEnd"/>
       <w:r>
         <w:rPr>
           <w:rFonts w:ascii="Consolas" w:eastAsia="Times New Roman" w:hAnsi="Consolas" w:cs="Times New Roman"/>
@@ -5747,8 +5234,6 @@
         </w:rPr>
         <w:t xml:space="preserve">      </w:t>
       </w:r>
-      <w:proofErr w:type="spellStart"/>
-      <w:proofErr w:type="gramStart"/>
       <w:r>
         <w:rPr>
           <w:rFonts w:ascii="Consolas" w:eastAsia="Times New Roman" w:hAnsi="Consolas" w:cs="Times New Roman"/>
@@ -5776,7 +5261,6 @@
         </w:rPr>
         <w:t>querySelector</w:t>
       </w:r>
-      <w:proofErr w:type="spellEnd"/>
       <w:r>
         <w:rPr>
           <w:rFonts w:ascii="Consolas" w:eastAsia="Times New Roman" w:hAnsi="Consolas" w:cs="Times New Roman"/>
@@ -5786,7 +5270,6 @@
         </w:rPr>
         <w:t>(</w:t>
       </w:r>
-      <w:proofErr w:type="gramEnd"/>
       <w:r>
         <w:rPr>
           <w:rFonts w:ascii="Consolas" w:eastAsia="Times New Roman" w:hAnsi="Consolas" w:cs="Times New Roman"/>
@@ -5805,7 +5288,6 @@
         </w:rPr>
         <w:t>).</w:t>
       </w:r>
-      <w:proofErr w:type="spellStart"/>
       <w:r>
         <w:rPr>
           <w:rFonts w:ascii="Consolas" w:eastAsia="Times New Roman" w:hAnsi="Consolas" w:cs="Times New Roman"/>
@@ -5815,7 +5297,6 @@
         </w:rPr>
         <w:t>onclick</w:t>
       </w:r>
-      <w:proofErr w:type="spellEnd"/>
       <w:r>
         <w:rPr>
           <w:rFonts w:ascii="Consolas" w:eastAsia="Times New Roman" w:hAnsi="Consolas" w:cs="Times New Roman"/>
@@ -5843,7 +5324,6 @@
         </w:rPr>
         <w:t xml:space="preserve"> </w:t>
       </w:r>
-      <w:proofErr w:type="spellStart"/>
       <w:r>
         <w:rPr>
           <w:rFonts w:ascii="Consolas" w:eastAsia="Times New Roman" w:hAnsi="Consolas" w:cs="Times New Roman"/>
@@ -5871,7 +5351,6 @@
         </w:rPr>
         <w:t>restart</w:t>
       </w:r>
-      <w:proofErr w:type="spellEnd"/>
       <w:r>
         <w:rPr>
           <w:rFonts w:ascii="Consolas" w:eastAsia="Times New Roman" w:hAnsi="Consolas" w:cs="Times New Roman"/>
@@ -5950,7 +5429,6 @@
           <w:szCs w:val="30"/>
         </w:rPr>
       </w:pPr>
-      <w:proofErr w:type="spellStart"/>
       <w:r>
         <w:rPr>
           <w:rFonts w:ascii="Arial" w:eastAsia="Times New Roman" w:hAnsi="Arial" w:cs="Arial"/>
@@ -5962,23 +5440,1615 @@
           <w:szCs w:val="30"/>
         </w:rPr>
         <w:lastRenderedPageBreak/>
-        <w:t>ScrollTrigger</w:t>
-      </w:r>
-      <w:proofErr w:type="spellEnd"/>
-      <w:r>
-        <w:rPr>
-          <w:rFonts w:ascii="Arial" w:eastAsia="Times New Roman" w:hAnsi="Arial" w:cs="Arial"/>
-          <w:b/>
-          <w:bCs/>
-          <w:color w:val="F1F1F1"/>
-          <w:kern w:val="36"/>
-          <w:sz w:val="30"/>
-          <w:szCs w:val="30"/>
-        </w:rPr>
-        <w:t> </w:t>
+        <w:t>ScrollTrigger </w:t>
       </w:r>
     </w:p>
     <w:p>
+      <w:pPr>
+        <w:shd w:val="clear" w:color="auto" w:fill="121314"/>
+        <w:spacing w:after="0" w:line="285" w:lineRule="atLeast"/>
+        <w:rPr>
+          <w:rFonts w:ascii="Consolas" w:eastAsia="Times New Roman" w:hAnsi="Consolas" w:cs="Times New Roman"/>
+          <w:color w:val="BBBEBF"/>
+          <w:sz w:val="21"/>
+          <w:szCs w:val="21"/>
+        </w:rPr>
+      </w:pPr>
+      <w:r>
+        <w:rPr>
+          <w:rFonts w:ascii="Consolas" w:eastAsia="Times New Roman" w:hAnsi="Consolas" w:cs="Times New Roman"/>
+          <w:color w:val="808080"/>
+          <w:sz w:val="21"/>
+          <w:szCs w:val="21"/>
+        </w:rPr>
+        <w:t>&lt;</w:t>
+      </w:r>
+      <w:r>
+        <w:rPr>
+          <w:rFonts w:ascii="Consolas" w:eastAsia="Times New Roman" w:hAnsi="Consolas" w:cs="Times New Roman"/>
+          <w:color w:val="7EE787"/>
+          <w:sz w:val="21"/>
+          <w:szCs w:val="21"/>
+        </w:rPr>
+        <w:t>script</w:t>
+      </w:r>
+    </w:p>
+    <w:p>
+      <w:pPr>
+        <w:shd w:val="clear" w:color="auto" w:fill="121314"/>
+        <w:spacing w:after="0" w:line="285" w:lineRule="atLeast"/>
+        <w:rPr>
+          <w:rFonts w:ascii="Consolas" w:eastAsia="Times New Roman" w:hAnsi="Consolas" w:cs="Times New Roman"/>
+          <w:color w:val="BBBEBF"/>
+          <w:sz w:val="21"/>
+          <w:szCs w:val="21"/>
+        </w:rPr>
+      </w:pPr>
+      <w:r>
+        <w:rPr>
+          <w:rFonts w:ascii="Consolas" w:eastAsia="Times New Roman" w:hAnsi="Consolas" w:cs="Times New Roman"/>
+          <w:color w:val="D4D4D4"/>
+          <w:sz w:val="21"/>
+          <w:szCs w:val="21"/>
+        </w:rPr>
+        <w:t xml:space="preserve">      </w:t>
+      </w:r>
+      <w:r>
+        <w:rPr>
+          <w:rFonts w:ascii="Consolas" w:eastAsia="Times New Roman" w:hAnsi="Consolas" w:cs="Times New Roman"/>
+          <w:color w:val="9CDCFE"/>
+          <w:sz w:val="21"/>
+          <w:szCs w:val="21"/>
+        </w:rPr>
+        <w:t>src</w:t>
+      </w:r>
+      <w:r>
+        <w:rPr>
+          <w:rFonts w:ascii="Consolas" w:eastAsia="Times New Roman" w:hAnsi="Consolas" w:cs="Times New Roman"/>
+          <w:color w:val="D4D4D4"/>
+          <w:sz w:val="21"/>
+          <w:szCs w:val="21"/>
+        </w:rPr>
+        <w:t>=</w:t>
+      </w:r>
+      <w:r>
+        <w:rPr>
+          <w:rFonts w:ascii="Consolas" w:eastAsia="Times New Roman" w:hAnsi="Consolas" w:cs="Times New Roman"/>
+          <w:color w:val="A5D6FF"/>
+          <w:sz w:val="21"/>
+          <w:szCs w:val="21"/>
+        </w:rPr>
+        <w:t>"https://cdnjs.cloudflare.com/ajax/libs/gsap/3.13.0/ScrollTrigger.min.js"</w:t>
+      </w:r>
+    </w:p>
+    <w:p>
+      <w:pPr>
+        <w:shd w:val="clear" w:color="auto" w:fill="121314"/>
+        <w:spacing w:after="0" w:line="285" w:lineRule="atLeast"/>
+        <w:rPr>
+          <w:rFonts w:ascii="Consolas" w:eastAsia="Times New Roman" w:hAnsi="Consolas" w:cs="Times New Roman"/>
+          <w:color w:val="BBBEBF"/>
+          <w:sz w:val="21"/>
+          <w:szCs w:val="21"/>
+        </w:rPr>
+      </w:pPr>
+      <w:r>
+        <w:rPr>
+          <w:rFonts w:ascii="Consolas" w:eastAsia="Times New Roman" w:hAnsi="Consolas" w:cs="Times New Roman"/>
+          <w:color w:val="D4D4D4"/>
+          <w:sz w:val="21"/>
+          <w:szCs w:val="21"/>
+        </w:rPr>
+        <w:t xml:space="preserve">      </w:t>
+      </w:r>
+      <w:r>
+        <w:rPr>
+          <w:rFonts w:ascii="Consolas" w:eastAsia="Times New Roman" w:hAnsi="Consolas" w:cs="Times New Roman"/>
+          <w:color w:val="9CDCFE"/>
+          <w:sz w:val="21"/>
+          <w:szCs w:val="21"/>
+        </w:rPr>
+        <w:t>integrity</w:t>
+      </w:r>
+      <w:r>
+        <w:rPr>
+          <w:rFonts w:ascii="Consolas" w:eastAsia="Times New Roman" w:hAnsi="Consolas" w:cs="Times New Roman"/>
+          <w:color w:val="D4D4D4"/>
+          <w:sz w:val="21"/>
+          <w:szCs w:val="21"/>
+        </w:rPr>
+        <w:t>=</w:t>
+      </w:r>
+      <w:r>
+        <w:rPr>
+          <w:rFonts w:ascii="Consolas" w:eastAsia="Times New Roman" w:hAnsi="Consolas" w:cs="Times New Roman"/>
+          <w:color w:val="A5D6FF"/>
+          <w:sz w:val="21"/>
+          <w:szCs w:val="21"/>
+        </w:rPr>
+        <w:t>"sha512-P2IDYZfqSwjcSjX0BKeNhwRUH8zRPGlgcWl5n6gBLzdi4Y5/0O4zaXrtO4K9TZK6Hn1BenYpKowuCavNandERg=="</w:t>
+      </w:r>
+    </w:p>
+    <w:p>
+      <w:pPr>
+        <w:shd w:val="clear" w:color="auto" w:fill="121314"/>
+        <w:spacing w:after="0" w:line="285" w:lineRule="atLeast"/>
+        <w:rPr>
+          <w:rFonts w:ascii="Consolas" w:eastAsia="Times New Roman" w:hAnsi="Consolas" w:cs="Times New Roman"/>
+          <w:color w:val="BBBEBF"/>
+          <w:sz w:val="21"/>
+          <w:szCs w:val="21"/>
+        </w:rPr>
+      </w:pPr>
+      <w:r>
+        <w:rPr>
+          <w:rFonts w:ascii="Consolas" w:eastAsia="Times New Roman" w:hAnsi="Consolas" w:cs="Times New Roman"/>
+          <w:color w:val="D4D4D4"/>
+          <w:sz w:val="21"/>
+          <w:szCs w:val="21"/>
+        </w:rPr>
+        <w:t xml:space="preserve">      </w:t>
+      </w:r>
+      <w:r>
+        <w:rPr>
+          <w:rFonts w:ascii="Consolas" w:eastAsia="Times New Roman" w:hAnsi="Consolas" w:cs="Times New Roman"/>
+          <w:color w:val="9CDCFE"/>
+          <w:sz w:val="21"/>
+          <w:szCs w:val="21"/>
+        </w:rPr>
+        <w:t>crossorigin</w:t>
+      </w:r>
+      <w:r>
+        <w:rPr>
+          <w:rFonts w:ascii="Consolas" w:eastAsia="Times New Roman" w:hAnsi="Consolas" w:cs="Times New Roman"/>
+          <w:color w:val="D4D4D4"/>
+          <w:sz w:val="21"/>
+          <w:szCs w:val="21"/>
+        </w:rPr>
+        <w:t>=</w:t>
+      </w:r>
+      <w:r>
+        <w:rPr>
+          <w:rFonts w:ascii="Consolas" w:eastAsia="Times New Roman" w:hAnsi="Consolas" w:cs="Times New Roman"/>
+          <w:color w:val="A5D6FF"/>
+          <w:sz w:val="21"/>
+          <w:szCs w:val="21"/>
+        </w:rPr>
+        <w:t>"anonymous"</w:t>
+      </w:r>
+    </w:p>
+    <w:p>
+      <w:pPr>
+        <w:shd w:val="clear" w:color="auto" w:fill="121314"/>
+        <w:spacing w:after="0" w:line="285" w:lineRule="atLeast"/>
+        <w:rPr>
+          <w:rFonts w:ascii="Consolas" w:eastAsia="Times New Roman" w:hAnsi="Consolas" w:cs="Times New Roman"/>
+          <w:color w:val="BBBEBF"/>
+          <w:sz w:val="21"/>
+          <w:szCs w:val="21"/>
+        </w:rPr>
+      </w:pPr>
+      <w:r>
+        <w:rPr>
+          <w:rFonts w:ascii="Consolas" w:eastAsia="Times New Roman" w:hAnsi="Consolas" w:cs="Times New Roman"/>
+          <w:color w:val="D4D4D4"/>
+          <w:sz w:val="21"/>
+          <w:szCs w:val="21"/>
+        </w:rPr>
+        <w:t xml:space="preserve">      </w:t>
+      </w:r>
+      <w:r>
+        <w:rPr>
+          <w:rFonts w:ascii="Consolas" w:eastAsia="Times New Roman" w:hAnsi="Consolas" w:cs="Times New Roman"/>
+          <w:color w:val="9CDCFE"/>
+          <w:sz w:val="21"/>
+          <w:szCs w:val="21"/>
+        </w:rPr>
+        <w:t>referrerpolicy</w:t>
+      </w:r>
+      <w:r>
+        <w:rPr>
+          <w:rFonts w:ascii="Consolas" w:eastAsia="Times New Roman" w:hAnsi="Consolas" w:cs="Times New Roman"/>
+          <w:color w:val="D4D4D4"/>
+          <w:sz w:val="21"/>
+          <w:szCs w:val="21"/>
+        </w:rPr>
+        <w:t>=</w:t>
+      </w:r>
+      <w:r>
+        <w:rPr>
+          <w:rFonts w:ascii="Consolas" w:eastAsia="Times New Roman" w:hAnsi="Consolas" w:cs="Times New Roman"/>
+          <w:color w:val="A5D6FF"/>
+          <w:sz w:val="21"/>
+          <w:szCs w:val="21"/>
+        </w:rPr>
+        <w:t>"no-referrer"</w:t>
+      </w:r>
+    </w:p>
+    <w:p>
+      <w:pPr>
+        <w:shd w:val="clear" w:color="auto" w:fill="121314"/>
+        <w:spacing w:after="0" w:line="285" w:lineRule="atLeast"/>
+        <w:rPr>
+          <w:rFonts w:ascii="Consolas" w:eastAsia="Times New Roman" w:hAnsi="Consolas" w:cs="Times New Roman"/>
+          <w:color w:val="BBBEBF"/>
+          <w:sz w:val="21"/>
+          <w:szCs w:val="21"/>
+        </w:rPr>
+      </w:pPr>
+      <w:r>
+        <w:rPr>
+          <w:rFonts w:ascii="Consolas" w:eastAsia="Times New Roman" w:hAnsi="Consolas" w:cs="Times New Roman"/>
+          <w:color w:val="D4D4D4"/>
+          <w:sz w:val="21"/>
+          <w:szCs w:val="21"/>
+        </w:rPr>
+        <w:t xml:space="preserve">    </w:t>
+      </w:r>
+      <w:r>
+        <w:rPr>
+          <w:rFonts w:ascii="Consolas" w:eastAsia="Times New Roman" w:hAnsi="Consolas" w:cs="Times New Roman"/>
+          <w:color w:val="808080"/>
+          <w:sz w:val="21"/>
+          <w:szCs w:val="21"/>
+        </w:rPr>
+        <w:t>&gt;&lt;/</w:t>
+      </w:r>
+      <w:r>
+        <w:rPr>
+          <w:rFonts w:ascii="Consolas" w:eastAsia="Times New Roman" w:hAnsi="Consolas" w:cs="Times New Roman"/>
+          <w:color w:val="7EE787"/>
+          <w:sz w:val="21"/>
+          <w:szCs w:val="21"/>
+        </w:rPr>
+        <w:t>script</w:t>
+      </w:r>
+      <w:r>
+        <w:rPr>
+          <w:rFonts w:ascii="Consolas" w:eastAsia="Times New Roman" w:hAnsi="Consolas" w:cs="Times New Roman"/>
+          <w:color w:val="808080"/>
+          <w:sz w:val="21"/>
+          <w:szCs w:val="21"/>
+        </w:rPr>
+        <w:t>&gt;</w:t>
+      </w:r>
+    </w:p>
+    <w:p>
+      <w:pPr>
+        <w:pStyle w:val="Heading2"/>
+        <w:shd w:val="clear" w:color="auto" w:fill="0E100F"/>
+        <w:spacing w:before="600" w:after="300"/>
+        <w:rPr>
+          <w:rFonts w:ascii="Arial" w:hAnsi="Arial" w:cs="Arial"/>
+          <w:color w:val="FFFCE1"/>
+          <w:sz w:val="41"/>
+          <w:szCs w:val="41"/>
+        </w:rPr>
+      </w:pPr>
+      <w:r>
+        <w:rPr>
+          <w:rFonts w:ascii="Arial" w:hAnsi="Arial" w:cs="Arial"/>
+          <w:color w:val="FFFCE1"/>
+          <w:sz w:val="41"/>
+          <w:szCs w:val="41"/>
+        </w:rPr>
+        <w:t>Simple example</w:t>
+      </w:r>
+    </w:p>
+    <w:p>
+      <w:pPr>
+        <w:pStyle w:val="HTMLPreformatted"/>
+        <w:shd w:val="clear" w:color="auto" w:fill="28292B"/>
+        <w:rPr>
+          <w:rFonts w:ascii="Fraktion Mono" w:hAnsi="Fraktion Mono"/>
+          <w:color w:val="BFC7D5"/>
+          <w:sz w:val="22"/>
+          <w:szCs w:val="22"/>
+        </w:rPr>
+      </w:pPr>
+      <w:proofErr w:type="gramStart"/>
+      <w:r>
+        <w:rPr>
+          <w:rStyle w:val="token"/>
+          <w:color w:val="BFC7D5"/>
+          <w:bdr w:val="none" w:sz="0" w:space="0" w:color="auto" w:frame="1"/>
+        </w:rPr>
+        <w:t>gsap</w:t>
+      </w:r>
+      <w:r>
+        <w:rPr>
+          <w:rStyle w:val="token"/>
+          <w:color w:val="C792EA"/>
+          <w:bdr w:val="none" w:sz="0" w:space="0" w:color="auto" w:frame="1"/>
+        </w:rPr>
+        <w:t>.</w:t>
+      </w:r>
+      <w:r>
+        <w:rPr>
+          <w:rStyle w:val="token"/>
+          <w:color w:val="82AAFF"/>
+          <w:bdr w:val="none" w:sz="0" w:space="0" w:color="auto" w:frame="1"/>
+        </w:rPr>
+        <w:t>to</w:t>
+      </w:r>
+      <w:r>
+        <w:rPr>
+          <w:rStyle w:val="token"/>
+          <w:color w:val="C792EA"/>
+          <w:bdr w:val="none" w:sz="0" w:space="0" w:color="auto" w:frame="1"/>
+        </w:rPr>
+        <w:t>(</w:t>
+      </w:r>
+      <w:proofErr w:type="gramEnd"/>
+      <w:r>
+        <w:rPr>
+          <w:rStyle w:val="token"/>
+          <w:color w:val="63D55A"/>
+          <w:bdr w:val="none" w:sz="0" w:space="0" w:color="auto" w:frame="1"/>
+        </w:rPr>
+        <w:t>'.box'</w:t>
+      </w:r>
+      <w:r>
+        <w:rPr>
+          <w:rStyle w:val="token"/>
+          <w:color w:val="C792EA"/>
+          <w:bdr w:val="none" w:sz="0" w:space="0" w:color="auto" w:frame="1"/>
+        </w:rPr>
+        <w:t>,</w:t>
+      </w:r>
+      <w:r>
+        <w:rPr>
+          <w:rStyle w:val="token"/>
+          <w:color w:val="BFC7D5"/>
+          <w:bdr w:val="none" w:sz="0" w:space="0" w:color="auto" w:frame="1"/>
+        </w:rPr>
+        <w:t xml:space="preserve"> </w:t>
+      </w:r>
+      <w:r>
+        <w:rPr>
+          <w:rStyle w:val="token"/>
+          <w:color w:val="C792EA"/>
+          <w:bdr w:val="none" w:sz="0" w:space="0" w:color="auto" w:frame="1"/>
+        </w:rPr>
+        <w:t>{</w:t>
+      </w:r>
+      <w:r>
+        <w:rPr>
+          <w:color w:val="BFC7D5"/>
+          <w:bdr w:val="none" w:sz="0" w:space="0" w:color="auto" w:frame="1"/>
+        </w:rPr>
+        <w:br/>
+      </w:r>
+      <w:r>
+        <w:rPr>
+          <w:rStyle w:val="token"/>
+          <w:color w:val="BFC7D5"/>
+          <w:bdr w:val="none" w:sz="0" w:space="0" w:color="auto" w:frame="1"/>
+        </w:rPr>
+        <w:tab/>
+        <w:t>scrollTrigger</w:t>
+      </w:r>
+      <w:r>
+        <w:rPr>
+          <w:rStyle w:val="token"/>
+          <w:color w:val="89DDFF"/>
+          <w:bdr w:val="none" w:sz="0" w:space="0" w:color="auto" w:frame="1"/>
+        </w:rPr>
+        <w:t>:</w:t>
+      </w:r>
+      <w:r>
+        <w:rPr>
+          <w:rStyle w:val="token"/>
+          <w:color w:val="BFC7D5"/>
+          <w:bdr w:val="none" w:sz="0" w:space="0" w:color="auto" w:frame="1"/>
+        </w:rPr>
+        <w:t xml:space="preserve"> </w:t>
+      </w:r>
+      <w:r>
+        <w:rPr>
+          <w:rStyle w:val="token"/>
+          <w:color w:val="63D55A"/>
+          <w:bdr w:val="none" w:sz="0" w:space="0" w:color="auto" w:frame="1"/>
+        </w:rPr>
+        <w:t>'.box'</w:t>
+      </w:r>
+      <w:r>
+        <w:rPr>
+          <w:rStyle w:val="token"/>
+          <w:color w:val="C792EA"/>
+          <w:bdr w:val="none" w:sz="0" w:space="0" w:color="auto" w:frame="1"/>
+        </w:rPr>
+        <w:t>,</w:t>
+      </w:r>
+      <w:r>
+        <w:rPr>
+          <w:rStyle w:val="token"/>
+          <w:color w:val="BFC7D5"/>
+          <w:bdr w:val="none" w:sz="0" w:space="0" w:color="auto" w:frame="1"/>
+        </w:rPr>
+        <w:t xml:space="preserve"> </w:t>
+      </w:r>
+      <w:r>
+        <w:rPr>
+          <w:rStyle w:val="token"/>
+          <w:i/>
+          <w:iCs/>
+          <w:color w:val="9C9C9C"/>
+          <w:bdr w:val="none" w:sz="0" w:space="0" w:color="auto" w:frame="1"/>
+        </w:rPr>
+        <w:t>// start the animation when ".box" enters the viewport (once)</w:t>
+      </w:r>
+      <w:r>
+        <w:rPr>
+          <w:color w:val="BFC7D5"/>
+          <w:bdr w:val="none" w:sz="0" w:space="0" w:color="auto" w:frame="1"/>
+        </w:rPr>
+        <w:br/>
+      </w:r>
+      <w:r>
+        <w:rPr>
+          <w:rStyle w:val="token"/>
+          <w:color w:val="BFC7D5"/>
+          <w:bdr w:val="none" w:sz="0" w:space="0" w:color="auto" w:frame="1"/>
+        </w:rPr>
+        <w:tab/>
+        <w:t>x</w:t>
+      </w:r>
+      <w:r>
+        <w:rPr>
+          <w:rStyle w:val="token"/>
+          <w:color w:val="89DDFF"/>
+          <w:bdr w:val="none" w:sz="0" w:space="0" w:color="auto" w:frame="1"/>
+        </w:rPr>
+        <w:t>:</w:t>
+      </w:r>
+      <w:r>
+        <w:rPr>
+          <w:rStyle w:val="token"/>
+          <w:color w:val="BFC7D5"/>
+          <w:bdr w:val="none" w:sz="0" w:space="0" w:color="auto" w:frame="1"/>
+        </w:rPr>
+        <w:t xml:space="preserve"> </w:t>
+      </w:r>
+      <w:r>
+        <w:rPr>
+          <w:rStyle w:val="token"/>
+          <w:color w:val="F78C6C"/>
+          <w:bdr w:val="none" w:sz="0" w:space="0" w:color="auto" w:frame="1"/>
+        </w:rPr>
+        <w:t>500</w:t>
+      </w:r>
+      <w:r>
+        <w:rPr>
+          <w:color w:val="BFC7D5"/>
+          <w:bdr w:val="none" w:sz="0" w:space="0" w:color="auto" w:frame="1"/>
+        </w:rPr>
+        <w:br/>
+      </w:r>
+      <w:r>
+        <w:rPr>
+          <w:rStyle w:val="token"/>
+          <w:color w:val="C792EA"/>
+          <w:bdr w:val="none" w:sz="0" w:space="0" w:color="auto" w:frame="1"/>
+        </w:rPr>
+        <w:t>});</w:t>
+      </w:r>
+    </w:p>
+    <w:p>
+      <w:r>
+        <w:rPr>
+          <w:rStyle w:val="token"/>
+          <w:rFonts w:ascii="Fraktion Mono" w:hAnsi="Fraktion Mono"/>
+          <w:i/>
+          <w:iCs/>
+          <w:color w:val="BFC7D5"/>
+          <w:shd w:val="clear" w:color="auto" w:fill="28292B"/>
+        </w:rPr>
+        <w:t>let</w:t>
+      </w:r>
+      <w:r>
+        <w:rPr>
+          <w:rStyle w:val="token"/>
+          <w:rFonts w:ascii="Fraktion Mono" w:hAnsi="Fraktion Mono"/>
+          <w:color w:val="BFC7D5"/>
+          <w:shd w:val="clear" w:color="auto" w:fill="28292B"/>
+        </w:rPr>
+        <w:t xml:space="preserve"> tl </w:t>
+      </w:r>
+      <w:r>
+        <w:rPr>
+          <w:rStyle w:val="token"/>
+          <w:rFonts w:ascii="Fraktion Mono" w:hAnsi="Fraktion Mono"/>
+          <w:color w:val="89DDFF"/>
+          <w:shd w:val="clear" w:color="auto" w:fill="28292B"/>
+        </w:rPr>
+        <w:t>=</w:t>
+      </w:r>
+      <w:r>
+        <w:rPr>
+          <w:rStyle w:val="token"/>
+          <w:rFonts w:ascii="Fraktion Mono" w:hAnsi="Fraktion Mono"/>
+          <w:color w:val="BFC7D5"/>
+          <w:shd w:val="clear" w:color="auto" w:fill="28292B"/>
+        </w:rPr>
+        <w:t xml:space="preserve"> gsap</w:t>
+      </w:r>
+      <w:r>
+        <w:rPr>
+          <w:rStyle w:val="token"/>
+          <w:rFonts w:ascii="Fraktion Mono" w:hAnsi="Fraktion Mono"/>
+          <w:color w:val="C792EA"/>
+          <w:shd w:val="clear" w:color="auto" w:fill="28292B"/>
+        </w:rPr>
+        <w:t>.</w:t>
+      </w:r>
+      <w:r>
+        <w:rPr>
+          <w:rStyle w:val="token"/>
+          <w:rFonts w:ascii="Fraktion Mono" w:hAnsi="Fraktion Mono"/>
+          <w:color w:val="82AAFF"/>
+          <w:shd w:val="clear" w:color="auto" w:fill="28292B"/>
+        </w:rPr>
+        <w:t>timeline</w:t>
+      </w:r>
+      <w:r>
+        <w:rPr>
+          <w:rStyle w:val="token"/>
+          <w:rFonts w:ascii="Fraktion Mono" w:hAnsi="Fraktion Mono"/>
+          <w:color w:val="C792EA"/>
+          <w:shd w:val="clear" w:color="auto" w:fill="28292B"/>
+        </w:rPr>
+        <w:t>({</w:t>
+      </w:r>
+      <w:r>
+        <w:rPr>
+          <w:rFonts w:ascii="Fraktion Mono" w:hAnsi="Fraktion Mono"/>
+          <w:color w:val="BFC7D5"/>
+          <w:shd w:val="clear" w:color="auto" w:fill="28292B"/>
+        </w:rPr>
+        <w:br/>
+      </w:r>
+      <w:r>
+        <w:rPr>
+          <w:rStyle w:val="token"/>
+          <w:rFonts w:ascii="Fraktion Mono" w:hAnsi="Fraktion Mono"/>
+          <w:color w:val="BFC7D5"/>
+          <w:shd w:val="clear" w:color="auto" w:fill="28292B"/>
+        </w:rPr>
+        <w:tab/>
+      </w:r>
+      <w:r>
+        <w:rPr>
+          <w:rStyle w:val="token"/>
+          <w:rFonts w:ascii="Fraktion Mono" w:hAnsi="Fraktion Mono"/>
+          <w:i/>
+          <w:iCs/>
+          <w:color w:val="9C9C9C"/>
+          <w:shd w:val="clear" w:color="auto" w:fill="28292B"/>
+        </w:rPr>
+        <w:t>// yes, we can add it to an entire timeline!</w:t>
+      </w:r>
+      <w:r>
+        <w:rPr>
+          <w:rFonts w:ascii="Fraktion Mono" w:hAnsi="Fraktion Mono"/>
+          <w:color w:val="BFC7D5"/>
+          <w:shd w:val="clear" w:color="auto" w:fill="28292B"/>
+        </w:rPr>
+        <w:br/>
+      </w:r>
+      <w:r>
+        <w:rPr>
+          <w:rStyle w:val="token"/>
+          <w:rFonts w:ascii="Fraktion Mono" w:hAnsi="Fraktion Mono"/>
+          <w:color w:val="BFC7D5"/>
+          <w:shd w:val="clear" w:color="auto" w:fill="28292B"/>
+        </w:rPr>
+        <w:tab/>
+        <w:t>scrollTrigger</w:t>
+      </w:r>
+      <w:r>
+        <w:rPr>
+          <w:rStyle w:val="token"/>
+          <w:rFonts w:ascii="Fraktion Mono" w:hAnsi="Fraktion Mono"/>
+          <w:color w:val="89DDFF"/>
+          <w:shd w:val="clear" w:color="auto" w:fill="28292B"/>
+        </w:rPr>
+        <w:t>:</w:t>
+      </w:r>
+      <w:r>
+        <w:rPr>
+          <w:rStyle w:val="token"/>
+          <w:rFonts w:ascii="Fraktion Mono" w:hAnsi="Fraktion Mono"/>
+          <w:color w:val="BFC7D5"/>
+          <w:shd w:val="clear" w:color="auto" w:fill="28292B"/>
+        </w:rPr>
+        <w:t xml:space="preserve"> </w:t>
+      </w:r>
+      <w:r>
+        <w:rPr>
+          <w:rStyle w:val="token"/>
+          <w:rFonts w:ascii="Fraktion Mono" w:hAnsi="Fraktion Mono"/>
+          <w:color w:val="C792EA"/>
+          <w:shd w:val="clear" w:color="auto" w:fill="28292B"/>
+        </w:rPr>
+        <w:t>{</w:t>
+      </w:r>
+      <w:r>
+        <w:rPr>
+          <w:rFonts w:ascii="Fraktion Mono" w:hAnsi="Fraktion Mono"/>
+          <w:color w:val="BFC7D5"/>
+          <w:shd w:val="clear" w:color="auto" w:fill="28292B"/>
+        </w:rPr>
+        <w:br/>
+      </w:r>
+      <w:r>
+        <w:rPr>
+          <w:rStyle w:val="token"/>
+          <w:rFonts w:ascii="Fraktion Mono" w:hAnsi="Fraktion Mono"/>
+          <w:color w:val="BFC7D5"/>
+          <w:shd w:val="clear" w:color="auto" w:fill="28292B"/>
+        </w:rPr>
+        <w:tab/>
+      </w:r>
+      <w:r>
+        <w:rPr>
+          <w:rStyle w:val="token"/>
+          <w:rFonts w:ascii="Fraktion Mono" w:hAnsi="Fraktion Mono"/>
+          <w:color w:val="BFC7D5"/>
+          <w:shd w:val="clear" w:color="auto" w:fill="28292B"/>
+        </w:rPr>
+        <w:tab/>
+        <w:t>trigger</w:t>
+      </w:r>
+      <w:r>
+        <w:rPr>
+          <w:rStyle w:val="token"/>
+          <w:rFonts w:ascii="Fraktion Mono" w:hAnsi="Fraktion Mono"/>
+          <w:color w:val="89DDFF"/>
+          <w:shd w:val="clear" w:color="auto" w:fill="28292B"/>
+        </w:rPr>
+        <w:t>:</w:t>
+      </w:r>
+      <w:r>
+        <w:rPr>
+          <w:rStyle w:val="token"/>
+          <w:rFonts w:ascii="Fraktion Mono" w:hAnsi="Fraktion Mono"/>
+          <w:color w:val="BFC7D5"/>
+          <w:shd w:val="clear" w:color="auto" w:fill="28292B"/>
+        </w:rPr>
+        <w:t xml:space="preserve"> </w:t>
+      </w:r>
+      <w:r>
+        <w:rPr>
+          <w:rStyle w:val="token"/>
+          <w:rFonts w:ascii="Fraktion Mono" w:hAnsi="Fraktion Mono"/>
+          <w:color w:val="63D55A"/>
+          <w:shd w:val="clear" w:color="auto" w:fill="28292B"/>
+        </w:rPr>
+        <w:t>'.container'</w:t>
+      </w:r>
+      <w:r>
+        <w:rPr>
+          <w:rStyle w:val="token"/>
+          <w:rFonts w:ascii="Fraktion Mono" w:hAnsi="Fraktion Mono"/>
+          <w:color w:val="C792EA"/>
+          <w:shd w:val="clear" w:color="auto" w:fill="28292B"/>
+        </w:rPr>
+        <w:t>,</w:t>
+      </w:r>
+      <w:r>
+        <w:rPr>
+          <w:rFonts w:ascii="Fraktion Mono" w:hAnsi="Fraktion Mono"/>
+          <w:color w:val="BFC7D5"/>
+          <w:shd w:val="clear" w:color="auto" w:fill="28292B"/>
+        </w:rPr>
+        <w:br/>
+      </w:r>
+      <w:r>
+        <w:rPr>
+          <w:rStyle w:val="token"/>
+          <w:rFonts w:ascii="Fraktion Mono" w:hAnsi="Fraktion Mono"/>
+          <w:color w:val="BFC7D5"/>
+          <w:shd w:val="clear" w:color="auto" w:fill="28292B"/>
+        </w:rPr>
+        <w:tab/>
+      </w:r>
+      <w:r>
+        <w:rPr>
+          <w:rStyle w:val="token"/>
+          <w:rFonts w:ascii="Fraktion Mono" w:hAnsi="Fraktion Mono"/>
+          <w:color w:val="BFC7D5"/>
+          <w:shd w:val="clear" w:color="auto" w:fill="28292B"/>
+        </w:rPr>
+        <w:tab/>
+        <w:t>pin</w:t>
+      </w:r>
+      <w:r>
+        <w:rPr>
+          <w:rStyle w:val="token"/>
+          <w:rFonts w:ascii="Fraktion Mono" w:hAnsi="Fraktion Mono"/>
+          <w:color w:val="89DDFF"/>
+          <w:shd w:val="clear" w:color="auto" w:fill="28292B"/>
+        </w:rPr>
+        <w:t>:</w:t>
+      </w:r>
+      <w:r>
+        <w:rPr>
+          <w:rStyle w:val="token"/>
+          <w:rFonts w:ascii="Fraktion Mono" w:hAnsi="Fraktion Mono"/>
+          <w:color w:val="BFC7D5"/>
+          <w:shd w:val="clear" w:color="auto" w:fill="28292B"/>
+        </w:rPr>
+        <w:t xml:space="preserve"> </w:t>
+      </w:r>
+      <w:r>
+        <w:rPr>
+          <w:rStyle w:val="token"/>
+          <w:rFonts w:ascii="Fraktion Mono" w:hAnsi="Fraktion Mono"/>
+          <w:color w:val="FF5874"/>
+          <w:shd w:val="clear" w:color="auto" w:fill="28292B"/>
+        </w:rPr>
+        <w:t>true</w:t>
+      </w:r>
+      <w:r>
+        <w:rPr>
+          <w:rStyle w:val="token"/>
+          <w:rFonts w:ascii="Fraktion Mono" w:hAnsi="Fraktion Mono"/>
+          <w:color w:val="C792EA"/>
+          <w:shd w:val="clear" w:color="auto" w:fill="28292B"/>
+        </w:rPr>
+        <w:t>,</w:t>
+      </w:r>
+      <w:r>
+        <w:rPr>
+          <w:rStyle w:val="token"/>
+          <w:rFonts w:ascii="Fraktion Mono" w:hAnsi="Fraktion Mono"/>
+          <w:color w:val="BFC7D5"/>
+          <w:shd w:val="clear" w:color="auto" w:fill="28292B"/>
+        </w:rPr>
+        <w:t xml:space="preserve"> </w:t>
+      </w:r>
+      <w:r>
+        <w:rPr>
+          <w:rStyle w:val="token"/>
+          <w:rFonts w:ascii="Fraktion Mono" w:hAnsi="Fraktion Mono"/>
+          <w:i/>
+          <w:iCs/>
+          <w:color w:val="9C9C9C"/>
+          <w:shd w:val="clear" w:color="auto" w:fill="28292B"/>
+        </w:rPr>
+        <w:t>// pin the trigger element while active</w:t>
+      </w:r>
+      <w:r>
+        <w:rPr>
+          <w:rFonts w:ascii="Fraktion Mono" w:hAnsi="Fraktion Mono"/>
+          <w:color w:val="BFC7D5"/>
+          <w:shd w:val="clear" w:color="auto" w:fill="28292B"/>
+        </w:rPr>
+        <w:br/>
+      </w:r>
+      <w:r>
+        <w:rPr>
+          <w:rStyle w:val="token"/>
+          <w:rFonts w:ascii="Fraktion Mono" w:hAnsi="Fraktion Mono"/>
+          <w:color w:val="BFC7D5"/>
+          <w:shd w:val="clear" w:color="auto" w:fill="28292B"/>
+        </w:rPr>
+        <w:tab/>
+      </w:r>
+      <w:r>
+        <w:rPr>
+          <w:rStyle w:val="token"/>
+          <w:rFonts w:ascii="Fraktion Mono" w:hAnsi="Fraktion Mono"/>
+          <w:color w:val="BFC7D5"/>
+          <w:shd w:val="clear" w:color="auto" w:fill="28292B"/>
+        </w:rPr>
+        <w:tab/>
+        <w:t>start</w:t>
+      </w:r>
+      <w:r>
+        <w:rPr>
+          <w:rStyle w:val="token"/>
+          <w:rFonts w:ascii="Fraktion Mono" w:hAnsi="Fraktion Mono"/>
+          <w:color w:val="89DDFF"/>
+          <w:shd w:val="clear" w:color="auto" w:fill="28292B"/>
+        </w:rPr>
+        <w:t>:</w:t>
+      </w:r>
+      <w:r>
+        <w:rPr>
+          <w:rStyle w:val="token"/>
+          <w:rFonts w:ascii="Fraktion Mono" w:hAnsi="Fraktion Mono"/>
+          <w:color w:val="BFC7D5"/>
+          <w:shd w:val="clear" w:color="auto" w:fill="28292B"/>
+        </w:rPr>
+        <w:t xml:space="preserve"> </w:t>
+      </w:r>
+      <w:r>
+        <w:rPr>
+          <w:rStyle w:val="token"/>
+          <w:rFonts w:ascii="Fraktion Mono" w:hAnsi="Fraktion Mono"/>
+          <w:color w:val="63D55A"/>
+          <w:shd w:val="clear" w:color="auto" w:fill="28292B"/>
+        </w:rPr>
+        <w:t>'top top'</w:t>
+      </w:r>
+      <w:r>
+        <w:rPr>
+          <w:rStyle w:val="token"/>
+          <w:rFonts w:ascii="Fraktion Mono" w:hAnsi="Fraktion Mono"/>
+          <w:color w:val="C792EA"/>
+          <w:shd w:val="clear" w:color="auto" w:fill="28292B"/>
+        </w:rPr>
+        <w:t>,</w:t>
+      </w:r>
+      <w:r>
+        <w:rPr>
+          <w:rStyle w:val="token"/>
+          <w:rFonts w:ascii="Fraktion Mono" w:hAnsi="Fraktion Mono"/>
+          <w:color w:val="BFC7D5"/>
+          <w:shd w:val="clear" w:color="auto" w:fill="28292B"/>
+        </w:rPr>
+        <w:t xml:space="preserve"> </w:t>
+      </w:r>
+      <w:r>
+        <w:rPr>
+          <w:rStyle w:val="token"/>
+          <w:rFonts w:ascii="Fraktion Mono" w:hAnsi="Fraktion Mono"/>
+          <w:i/>
+          <w:iCs/>
+          <w:color w:val="9C9C9C"/>
+          <w:shd w:val="clear" w:color="auto" w:fill="28292B"/>
+        </w:rPr>
+        <w:t>// when the top of the trigger hits the top of the viewport</w:t>
+      </w:r>
+      <w:r>
+        <w:rPr>
+          <w:rFonts w:ascii="Fraktion Mono" w:hAnsi="Fraktion Mono"/>
+          <w:color w:val="BFC7D5"/>
+          <w:shd w:val="clear" w:color="auto" w:fill="28292B"/>
+        </w:rPr>
+        <w:br/>
+      </w:r>
+      <w:r>
+        <w:rPr>
+          <w:rStyle w:val="token"/>
+          <w:rFonts w:ascii="Fraktion Mono" w:hAnsi="Fraktion Mono"/>
+          <w:color w:val="BFC7D5"/>
+          <w:shd w:val="clear" w:color="auto" w:fill="28292B"/>
+        </w:rPr>
+        <w:tab/>
+      </w:r>
+      <w:r>
+        <w:rPr>
+          <w:rStyle w:val="token"/>
+          <w:rFonts w:ascii="Fraktion Mono" w:hAnsi="Fraktion Mono"/>
+          <w:color w:val="BFC7D5"/>
+          <w:shd w:val="clear" w:color="auto" w:fill="28292B"/>
+        </w:rPr>
+        <w:tab/>
+        <w:t>end</w:t>
+      </w:r>
+      <w:r>
+        <w:rPr>
+          <w:rStyle w:val="token"/>
+          <w:rFonts w:ascii="Fraktion Mono" w:hAnsi="Fraktion Mono"/>
+          <w:color w:val="89DDFF"/>
+          <w:shd w:val="clear" w:color="auto" w:fill="28292B"/>
+        </w:rPr>
+        <w:t>:</w:t>
+      </w:r>
+      <w:r>
+        <w:rPr>
+          <w:rStyle w:val="token"/>
+          <w:rFonts w:ascii="Fraktion Mono" w:hAnsi="Fraktion Mono"/>
+          <w:color w:val="BFC7D5"/>
+          <w:shd w:val="clear" w:color="auto" w:fill="28292B"/>
+        </w:rPr>
+        <w:t xml:space="preserve"> </w:t>
+      </w:r>
+      <w:r>
+        <w:rPr>
+          <w:rStyle w:val="token"/>
+          <w:rFonts w:ascii="Fraktion Mono" w:hAnsi="Fraktion Mono"/>
+          <w:color w:val="63D55A"/>
+          <w:shd w:val="clear" w:color="auto" w:fill="28292B"/>
+        </w:rPr>
+        <w:t>'+=500'</w:t>
+      </w:r>
+      <w:r>
+        <w:rPr>
+          <w:rStyle w:val="token"/>
+          <w:rFonts w:ascii="Fraktion Mono" w:hAnsi="Fraktion Mono"/>
+          <w:color w:val="C792EA"/>
+          <w:shd w:val="clear" w:color="auto" w:fill="28292B"/>
+        </w:rPr>
+        <w:t>,</w:t>
+      </w:r>
+      <w:r>
+        <w:rPr>
+          <w:rStyle w:val="token"/>
+          <w:rFonts w:ascii="Fraktion Mono" w:hAnsi="Fraktion Mono"/>
+          <w:color w:val="BFC7D5"/>
+          <w:shd w:val="clear" w:color="auto" w:fill="28292B"/>
+        </w:rPr>
+        <w:t xml:space="preserve"> </w:t>
+      </w:r>
+      <w:r>
+        <w:rPr>
+          <w:rStyle w:val="token"/>
+          <w:rFonts w:ascii="Fraktion Mono" w:hAnsi="Fraktion Mono"/>
+          <w:i/>
+          <w:iCs/>
+          <w:color w:val="9C9C9C"/>
+          <w:shd w:val="clear" w:color="auto" w:fill="28292B"/>
+        </w:rPr>
+        <w:t>// end after scrolling 500px beyond the start</w:t>
+      </w:r>
+      <w:r>
+        <w:rPr>
+          <w:rFonts w:ascii="Fraktion Mono" w:hAnsi="Fraktion Mono"/>
+          <w:color w:val="BFC7D5"/>
+          <w:shd w:val="clear" w:color="auto" w:fill="28292B"/>
+        </w:rPr>
+        <w:br/>
+      </w:r>
+      <w:r>
+        <w:rPr>
+          <w:rStyle w:val="token"/>
+          <w:rFonts w:ascii="Fraktion Mono" w:hAnsi="Fraktion Mono"/>
+          <w:color w:val="BFC7D5"/>
+          <w:shd w:val="clear" w:color="auto" w:fill="28292B"/>
+        </w:rPr>
+        <w:tab/>
+      </w:r>
+      <w:r>
+        <w:rPr>
+          <w:rStyle w:val="token"/>
+          <w:rFonts w:ascii="Fraktion Mono" w:hAnsi="Fraktion Mono"/>
+          <w:color w:val="BFC7D5"/>
+          <w:shd w:val="clear" w:color="auto" w:fill="28292B"/>
+        </w:rPr>
+        <w:tab/>
+        <w:t>scrub</w:t>
+      </w:r>
+      <w:r>
+        <w:rPr>
+          <w:rStyle w:val="token"/>
+          <w:rFonts w:ascii="Fraktion Mono" w:hAnsi="Fraktion Mono"/>
+          <w:color w:val="89DDFF"/>
+          <w:shd w:val="clear" w:color="auto" w:fill="28292B"/>
+        </w:rPr>
+        <w:t>:</w:t>
+      </w:r>
+      <w:r>
+        <w:rPr>
+          <w:rStyle w:val="token"/>
+          <w:rFonts w:ascii="Fraktion Mono" w:hAnsi="Fraktion Mono"/>
+          <w:color w:val="BFC7D5"/>
+          <w:shd w:val="clear" w:color="auto" w:fill="28292B"/>
+        </w:rPr>
+        <w:t xml:space="preserve"> </w:t>
+      </w:r>
+      <w:r>
+        <w:rPr>
+          <w:rStyle w:val="token"/>
+          <w:rFonts w:ascii="Fraktion Mono" w:hAnsi="Fraktion Mono"/>
+          <w:color w:val="F78C6C"/>
+          <w:shd w:val="clear" w:color="auto" w:fill="28292B"/>
+        </w:rPr>
+        <w:t>1</w:t>
+      </w:r>
+      <w:r>
+        <w:rPr>
+          <w:rStyle w:val="token"/>
+          <w:rFonts w:ascii="Fraktion Mono" w:hAnsi="Fraktion Mono"/>
+          <w:color w:val="C792EA"/>
+          <w:shd w:val="clear" w:color="auto" w:fill="28292B"/>
+        </w:rPr>
+        <w:t>,</w:t>
+      </w:r>
+      <w:r>
+        <w:rPr>
+          <w:rStyle w:val="token"/>
+          <w:rFonts w:ascii="Fraktion Mono" w:hAnsi="Fraktion Mono"/>
+          <w:color w:val="BFC7D5"/>
+          <w:shd w:val="clear" w:color="auto" w:fill="28292B"/>
+        </w:rPr>
+        <w:t xml:space="preserve"> </w:t>
+      </w:r>
+      <w:r>
+        <w:rPr>
+          <w:rStyle w:val="token"/>
+          <w:rFonts w:ascii="Fraktion Mono" w:hAnsi="Fraktion Mono"/>
+          <w:i/>
+          <w:iCs/>
+          <w:color w:val="9C9C9C"/>
+          <w:shd w:val="clear" w:color="auto" w:fill="28292B"/>
+        </w:rPr>
+        <w:t>// smooth scrubbing, takes 1 second to "catch up" to the scrollbar</w:t>
+      </w:r>
+      <w:r>
+        <w:rPr>
+          <w:rFonts w:ascii="Fraktion Mono" w:hAnsi="Fraktion Mono"/>
+          <w:color w:val="BFC7D5"/>
+          <w:shd w:val="clear" w:color="auto" w:fill="28292B"/>
+        </w:rPr>
+        <w:br/>
+      </w:r>
+      <w:r>
+        <w:rPr>
+          <w:rStyle w:val="token"/>
+          <w:rFonts w:ascii="Fraktion Mono" w:hAnsi="Fraktion Mono"/>
+          <w:color w:val="BFC7D5"/>
+          <w:shd w:val="clear" w:color="auto" w:fill="28292B"/>
+        </w:rPr>
+        <w:tab/>
+      </w:r>
+      <w:r>
+        <w:rPr>
+          <w:rStyle w:val="token"/>
+          <w:rFonts w:ascii="Fraktion Mono" w:hAnsi="Fraktion Mono"/>
+          <w:color w:val="BFC7D5"/>
+          <w:shd w:val="clear" w:color="auto" w:fill="28292B"/>
+        </w:rPr>
+        <w:tab/>
+        <w:t>snap</w:t>
+      </w:r>
+      <w:r>
+        <w:rPr>
+          <w:rStyle w:val="token"/>
+          <w:rFonts w:ascii="Fraktion Mono" w:hAnsi="Fraktion Mono"/>
+          <w:color w:val="89DDFF"/>
+          <w:shd w:val="clear" w:color="auto" w:fill="28292B"/>
+        </w:rPr>
+        <w:t>:</w:t>
+      </w:r>
+      <w:r>
+        <w:rPr>
+          <w:rStyle w:val="token"/>
+          <w:rFonts w:ascii="Fraktion Mono" w:hAnsi="Fraktion Mono"/>
+          <w:color w:val="BFC7D5"/>
+          <w:shd w:val="clear" w:color="auto" w:fill="28292B"/>
+        </w:rPr>
+        <w:t xml:space="preserve"> </w:t>
+      </w:r>
+      <w:r>
+        <w:rPr>
+          <w:rStyle w:val="token"/>
+          <w:rFonts w:ascii="Fraktion Mono" w:hAnsi="Fraktion Mono"/>
+          <w:color w:val="C792EA"/>
+          <w:shd w:val="clear" w:color="auto" w:fill="28292B"/>
+        </w:rPr>
+        <w:t>{</w:t>
+      </w:r>
+      <w:r>
+        <w:rPr>
+          <w:rFonts w:ascii="Fraktion Mono" w:hAnsi="Fraktion Mono"/>
+          <w:color w:val="BFC7D5"/>
+          <w:shd w:val="clear" w:color="auto" w:fill="28292B"/>
+        </w:rPr>
+        <w:br/>
+      </w:r>
+      <w:r>
+        <w:rPr>
+          <w:rStyle w:val="token"/>
+          <w:rFonts w:ascii="Fraktion Mono" w:hAnsi="Fraktion Mono"/>
+          <w:color w:val="BFC7D5"/>
+          <w:shd w:val="clear" w:color="auto" w:fill="28292B"/>
+        </w:rPr>
+        <w:tab/>
+      </w:r>
+      <w:r>
+        <w:rPr>
+          <w:rStyle w:val="token"/>
+          <w:rFonts w:ascii="Fraktion Mono" w:hAnsi="Fraktion Mono"/>
+          <w:color w:val="BFC7D5"/>
+          <w:shd w:val="clear" w:color="auto" w:fill="28292B"/>
+        </w:rPr>
+        <w:tab/>
+      </w:r>
+      <w:r>
+        <w:rPr>
+          <w:rStyle w:val="token"/>
+          <w:rFonts w:ascii="Fraktion Mono" w:hAnsi="Fraktion Mono"/>
+          <w:color w:val="BFC7D5"/>
+          <w:shd w:val="clear" w:color="auto" w:fill="28292B"/>
+        </w:rPr>
+        <w:tab/>
+        <w:t>snapTo</w:t>
+      </w:r>
+      <w:r>
+        <w:rPr>
+          <w:rStyle w:val="token"/>
+          <w:rFonts w:ascii="Fraktion Mono" w:hAnsi="Fraktion Mono"/>
+          <w:color w:val="89DDFF"/>
+          <w:shd w:val="clear" w:color="auto" w:fill="28292B"/>
+        </w:rPr>
+        <w:t>:</w:t>
+      </w:r>
+      <w:r>
+        <w:rPr>
+          <w:rStyle w:val="token"/>
+          <w:rFonts w:ascii="Fraktion Mono" w:hAnsi="Fraktion Mono"/>
+          <w:color w:val="BFC7D5"/>
+          <w:shd w:val="clear" w:color="auto" w:fill="28292B"/>
+        </w:rPr>
+        <w:t xml:space="preserve"> </w:t>
+      </w:r>
+      <w:r>
+        <w:rPr>
+          <w:rStyle w:val="token"/>
+          <w:rFonts w:ascii="Fraktion Mono" w:hAnsi="Fraktion Mono"/>
+          <w:color w:val="63D55A"/>
+          <w:shd w:val="clear" w:color="auto" w:fill="28292B"/>
+        </w:rPr>
+        <w:t>'labels'</w:t>
+      </w:r>
+      <w:r>
+        <w:rPr>
+          <w:rStyle w:val="token"/>
+          <w:rFonts w:ascii="Fraktion Mono" w:hAnsi="Fraktion Mono"/>
+          <w:color w:val="C792EA"/>
+          <w:shd w:val="clear" w:color="auto" w:fill="28292B"/>
+        </w:rPr>
+        <w:t>,</w:t>
+      </w:r>
+      <w:r>
+        <w:rPr>
+          <w:rStyle w:val="token"/>
+          <w:rFonts w:ascii="Fraktion Mono" w:hAnsi="Fraktion Mono"/>
+          <w:color w:val="BFC7D5"/>
+          <w:shd w:val="clear" w:color="auto" w:fill="28292B"/>
+        </w:rPr>
+        <w:t xml:space="preserve"> </w:t>
+      </w:r>
+      <w:r>
+        <w:rPr>
+          <w:rStyle w:val="token"/>
+          <w:rFonts w:ascii="Fraktion Mono" w:hAnsi="Fraktion Mono"/>
+          <w:i/>
+          <w:iCs/>
+          <w:color w:val="9C9C9C"/>
+          <w:shd w:val="clear" w:color="auto" w:fill="28292B"/>
+        </w:rPr>
+        <w:t>// snap to the closest label in the timeline</w:t>
+      </w:r>
+      <w:r>
+        <w:rPr>
+          <w:rFonts w:ascii="Fraktion Mono" w:hAnsi="Fraktion Mono"/>
+          <w:color w:val="BFC7D5"/>
+          <w:shd w:val="clear" w:color="auto" w:fill="28292B"/>
+        </w:rPr>
+        <w:br/>
+      </w:r>
+      <w:r>
+        <w:rPr>
+          <w:rStyle w:val="token"/>
+          <w:rFonts w:ascii="Fraktion Mono" w:hAnsi="Fraktion Mono"/>
+          <w:color w:val="BFC7D5"/>
+          <w:shd w:val="clear" w:color="auto" w:fill="28292B"/>
+        </w:rPr>
+        <w:tab/>
+      </w:r>
+      <w:r>
+        <w:rPr>
+          <w:rStyle w:val="token"/>
+          <w:rFonts w:ascii="Fraktion Mono" w:hAnsi="Fraktion Mono"/>
+          <w:color w:val="BFC7D5"/>
+          <w:shd w:val="clear" w:color="auto" w:fill="28292B"/>
+        </w:rPr>
+        <w:tab/>
+      </w:r>
+      <w:r>
+        <w:rPr>
+          <w:rStyle w:val="token"/>
+          <w:rFonts w:ascii="Fraktion Mono" w:hAnsi="Fraktion Mono"/>
+          <w:color w:val="BFC7D5"/>
+          <w:shd w:val="clear" w:color="auto" w:fill="28292B"/>
+        </w:rPr>
+        <w:tab/>
+        <w:t>duration</w:t>
+      </w:r>
+      <w:r>
+        <w:rPr>
+          <w:rStyle w:val="token"/>
+          <w:rFonts w:ascii="Fraktion Mono" w:hAnsi="Fraktion Mono"/>
+          <w:color w:val="89DDFF"/>
+          <w:shd w:val="clear" w:color="auto" w:fill="28292B"/>
+        </w:rPr>
+        <w:t>:</w:t>
+      </w:r>
+      <w:r>
+        <w:rPr>
+          <w:rStyle w:val="token"/>
+          <w:rFonts w:ascii="Fraktion Mono" w:hAnsi="Fraktion Mono"/>
+          <w:color w:val="BFC7D5"/>
+          <w:shd w:val="clear" w:color="auto" w:fill="28292B"/>
+        </w:rPr>
+        <w:t xml:space="preserve"> </w:t>
+      </w:r>
+      <w:r>
+        <w:rPr>
+          <w:rStyle w:val="token"/>
+          <w:rFonts w:ascii="Fraktion Mono" w:hAnsi="Fraktion Mono"/>
+          <w:color w:val="C792EA"/>
+          <w:shd w:val="clear" w:color="auto" w:fill="28292B"/>
+        </w:rPr>
+        <w:t>{</w:t>
+      </w:r>
+      <w:r>
+        <w:rPr>
+          <w:rStyle w:val="token"/>
+          <w:rFonts w:ascii="Fraktion Mono" w:hAnsi="Fraktion Mono"/>
+          <w:color w:val="BFC7D5"/>
+          <w:shd w:val="clear" w:color="auto" w:fill="28292B"/>
+        </w:rPr>
+        <w:t xml:space="preserve"> min</w:t>
+      </w:r>
+      <w:r>
+        <w:rPr>
+          <w:rStyle w:val="token"/>
+          <w:rFonts w:ascii="Fraktion Mono" w:hAnsi="Fraktion Mono"/>
+          <w:color w:val="89DDFF"/>
+          <w:shd w:val="clear" w:color="auto" w:fill="28292B"/>
+        </w:rPr>
+        <w:t>:</w:t>
+      </w:r>
+      <w:r>
+        <w:rPr>
+          <w:rStyle w:val="token"/>
+          <w:rFonts w:ascii="Fraktion Mono" w:hAnsi="Fraktion Mono"/>
+          <w:color w:val="BFC7D5"/>
+          <w:shd w:val="clear" w:color="auto" w:fill="28292B"/>
+        </w:rPr>
+        <w:t xml:space="preserve"> </w:t>
+      </w:r>
+      <w:r>
+        <w:rPr>
+          <w:rStyle w:val="token"/>
+          <w:rFonts w:ascii="Fraktion Mono" w:hAnsi="Fraktion Mono"/>
+          <w:color w:val="F78C6C"/>
+          <w:shd w:val="clear" w:color="auto" w:fill="28292B"/>
+        </w:rPr>
+        <w:t>0.2</w:t>
+      </w:r>
+      <w:r>
+        <w:rPr>
+          <w:rStyle w:val="token"/>
+          <w:rFonts w:ascii="Fraktion Mono" w:hAnsi="Fraktion Mono"/>
+          <w:color w:val="C792EA"/>
+          <w:shd w:val="clear" w:color="auto" w:fill="28292B"/>
+        </w:rPr>
+        <w:t>,</w:t>
+      </w:r>
+      <w:r>
+        <w:rPr>
+          <w:rStyle w:val="token"/>
+          <w:rFonts w:ascii="Fraktion Mono" w:hAnsi="Fraktion Mono"/>
+          <w:color w:val="BFC7D5"/>
+          <w:shd w:val="clear" w:color="auto" w:fill="28292B"/>
+        </w:rPr>
+        <w:t xml:space="preserve"> max</w:t>
+      </w:r>
+      <w:r>
+        <w:rPr>
+          <w:rStyle w:val="token"/>
+          <w:rFonts w:ascii="Fraktion Mono" w:hAnsi="Fraktion Mono"/>
+          <w:color w:val="89DDFF"/>
+          <w:shd w:val="clear" w:color="auto" w:fill="28292B"/>
+        </w:rPr>
+        <w:t>:</w:t>
+      </w:r>
+      <w:r>
+        <w:rPr>
+          <w:rStyle w:val="token"/>
+          <w:rFonts w:ascii="Fraktion Mono" w:hAnsi="Fraktion Mono"/>
+          <w:color w:val="BFC7D5"/>
+          <w:shd w:val="clear" w:color="auto" w:fill="28292B"/>
+        </w:rPr>
+        <w:t xml:space="preserve"> </w:t>
+      </w:r>
+      <w:r>
+        <w:rPr>
+          <w:rStyle w:val="token"/>
+          <w:rFonts w:ascii="Fraktion Mono" w:hAnsi="Fraktion Mono"/>
+          <w:color w:val="F78C6C"/>
+          <w:shd w:val="clear" w:color="auto" w:fill="28292B"/>
+        </w:rPr>
+        <w:t>3</w:t>
+      </w:r>
+      <w:r>
+        <w:rPr>
+          <w:rStyle w:val="token"/>
+          <w:rFonts w:ascii="Fraktion Mono" w:hAnsi="Fraktion Mono"/>
+          <w:color w:val="BFC7D5"/>
+          <w:shd w:val="clear" w:color="auto" w:fill="28292B"/>
+        </w:rPr>
+        <w:t xml:space="preserve"> </w:t>
+      </w:r>
+      <w:r>
+        <w:rPr>
+          <w:rStyle w:val="token"/>
+          <w:rFonts w:ascii="Fraktion Mono" w:hAnsi="Fraktion Mono"/>
+          <w:color w:val="C792EA"/>
+          <w:shd w:val="clear" w:color="auto" w:fill="28292B"/>
+        </w:rPr>
+        <w:t>},</w:t>
+      </w:r>
+      <w:r>
+        <w:rPr>
+          <w:rStyle w:val="token"/>
+          <w:rFonts w:ascii="Fraktion Mono" w:hAnsi="Fraktion Mono"/>
+          <w:color w:val="BFC7D5"/>
+          <w:shd w:val="clear" w:color="auto" w:fill="28292B"/>
+        </w:rPr>
+        <w:t xml:space="preserve"> </w:t>
+      </w:r>
+      <w:r>
+        <w:rPr>
+          <w:rStyle w:val="token"/>
+          <w:rFonts w:ascii="Fraktion Mono" w:hAnsi="Fraktion Mono"/>
+          <w:i/>
+          <w:iCs/>
+          <w:color w:val="9C9C9C"/>
+          <w:shd w:val="clear" w:color="auto" w:fill="28292B"/>
+        </w:rPr>
+        <w:t>// the snap animation should be at least 0.2 seconds, but no more than 3 seconds (determined by velocity)</w:t>
+      </w:r>
+      <w:r>
+        <w:rPr>
+          <w:rFonts w:ascii="Fraktion Mono" w:hAnsi="Fraktion Mono"/>
+          <w:color w:val="BFC7D5"/>
+          <w:shd w:val="clear" w:color="auto" w:fill="28292B"/>
+        </w:rPr>
+        <w:br/>
+      </w:r>
+      <w:r>
+        <w:rPr>
+          <w:rStyle w:val="token"/>
+          <w:rFonts w:ascii="Fraktion Mono" w:hAnsi="Fraktion Mono"/>
+          <w:color w:val="BFC7D5"/>
+          <w:shd w:val="clear" w:color="auto" w:fill="28292B"/>
+        </w:rPr>
+        <w:tab/>
+      </w:r>
+      <w:r>
+        <w:rPr>
+          <w:rStyle w:val="token"/>
+          <w:rFonts w:ascii="Fraktion Mono" w:hAnsi="Fraktion Mono"/>
+          <w:color w:val="BFC7D5"/>
+          <w:shd w:val="clear" w:color="auto" w:fill="28292B"/>
+        </w:rPr>
+        <w:tab/>
+      </w:r>
+      <w:r>
+        <w:rPr>
+          <w:rStyle w:val="token"/>
+          <w:rFonts w:ascii="Fraktion Mono" w:hAnsi="Fraktion Mono"/>
+          <w:color w:val="BFC7D5"/>
+          <w:shd w:val="clear" w:color="auto" w:fill="28292B"/>
+        </w:rPr>
+        <w:tab/>
+        <w:t>delay</w:t>
+      </w:r>
+      <w:r>
+        <w:rPr>
+          <w:rStyle w:val="token"/>
+          <w:rFonts w:ascii="Fraktion Mono" w:hAnsi="Fraktion Mono"/>
+          <w:color w:val="89DDFF"/>
+          <w:shd w:val="clear" w:color="auto" w:fill="28292B"/>
+        </w:rPr>
+        <w:t>:</w:t>
+      </w:r>
+      <w:r>
+        <w:rPr>
+          <w:rStyle w:val="token"/>
+          <w:rFonts w:ascii="Fraktion Mono" w:hAnsi="Fraktion Mono"/>
+          <w:color w:val="BFC7D5"/>
+          <w:shd w:val="clear" w:color="auto" w:fill="28292B"/>
+        </w:rPr>
+        <w:t xml:space="preserve"> </w:t>
+      </w:r>
+      <w:r>
+        <w:rPr>
+          <w:rStyle w:val="token"/>
+          <w:rFonts w:ascii="Fraktion Mono" w:hAnsi="Fraktion Mono"/>
+          <w:color w:val="F78C6C"/>
+          <w:shd w:val="clear" w:color="auto" w:fill="28292B"/>
+        </w:rPr>
+        <w:t>0.2</w:t>
+      </w:r>
+      <w:r>
+        <w:rPr>
+          <w:rStyle w:val="token"/>
+          <w:rFonts w:ascii="Fraktion Mono" w:hAnsi="Fraktion Mono"/>
+          <w:color w:val="C792EA"/>
+          <w:shd w:val="clear" w:color="auto" w:fill="28292B"/>
+        </w:rPr>
+        <w:t>,</w:t>
+      </w:r>
+      <w:r>
+        <w:rPr>
+          <w:rStyle w:val="token"/>
+          <w:rFonts w:ascii="Fraktion Mono" w:hAnsi="Fraktion Mono"/>
+          <w:color w:val="BFC7D5"/>
+          <w:shd w:val="clear" w:color="auto" w:fill="28292B"/>
+        </w:rPr>
+        <w:t xml:space="preserve"> </w:t>
+      </w:r>
+      <w:r>
+        <w:rPr>
+          <w:rStyle w:val="token"/>
+          <w:rFonts w:ascii="Fraktion Mono" w:hAnsi="Fraktion Mono"/>
+          <w:i/>
+          <w:iCs/>
+          <w:color w:val="9C9C9C"/>
+          <w:shd w:val="clear" w:color="auto" w:fill="28292B"/>
+        </w:rPr>
+        <w:t>// wait 0.2 seconds from the last scroll event before doing the snapping</w:t>
+      </w:r>
+      <w:r>
+        <w:rPr>
+          <w:rFonts w:ascii="Fraktion Mono" w:hAnsi="Fraktion Mono"/>
+          <w:color w:val="BFC7D5"/>
+          <w:shd w:val="clear" w:color="auto" w:fill="28292B"/>
+        </w:rPr>
+        <w:br/>
+      </w:r>
+      <w:r>
+        <w:rPr>
+          <w:rStyle w:val="token"/>
+          <w:rFonts w:ascii="Fraktion Mono" w:hAnsi="Fraktion Mono"/>
+          <w:color w:val="BFC7D5"/>
+          <w:shd w:val="clear" w:color="auto" w:fill="28292B"/>
+        </w:rPr>
+        <w:tab/>
+      </w:r>
+      <w:r>
+        <w:rPr>
+          <w:rStyle w:val="token"/>
+          <w:rFonts w:ascii="Fraktion Mono" w:hAnsi="Fraktion Mono"/>
+          <w:color w:val="BFC7D5"/>
+          <w:shd w:val="clear" w:color="auto" w:fill="28292B"/>
+        </w:rPr>
+        <w:tab/>
+      </w:r>
+      <w:r>
+        <w:rPr>
+          <w:rStyle w:val="token"/>
+          <w:rFonts w:ascii="Fraktion Mono" w:hAnsi="Fraktion Mono"/>
+          <w:color w:val="BFC7D5"/>
+          <w:shd w:val="clear" w:color="auto" w:fill="28292B"/>
+        </w:rPr>
+        <w:tab/>
+        <w:t>ease</w:t>
+      </w:r>
+      <w:r>
+        <w:rPr>
+          <w:rStyle w:val="token"/>
+          <w:rFonts w:ascii="Fraktion Mono" w:hAnsi="Fraktion Mono"/>
+          <w:color w:val="89DDFF"/>
+          <w:shd w:val="clear" w:color="auto" w:fill="28292B"/>
+        </w:rPr>
+        <w:t>:</w:t>
+      </w:r>
+      <w:r>
+        <w:rPr>
+          <w:rStyle w:val="token"/>
+          <w:rFonts w:ascii="Fraktion Mono" w:hAnsi="Fraktion Mono"/>
+          <w:color w:val="BFC7D5"/>
+          <w:shd w:val="clear" w:color="auto" w:fill="28292B"/>
+        </w:rPr>
+        <w:t xml:space="preserve"> </w:t>
+      </w:r>
+      <w:r>
+        <w:rPr>
+          <w:rStyle w:val="token"/>
+          <w:rFonts w:ascii="Fraktion Mono" w:hAnsi="Fraktion Mono"/>
+          <w:color w:val="63D55A"/>
+          <w:shd w:val="clear" w:color="auto" w:fill="28292B"/>
+        </w:rPr>
+        <w:t>'power1.inOut'</w:t>
+      </w:r>
+      <w:r>
+        <w:rPr>
+          <w:rStyle w:val="token"/>
+          <w:rFonts w:ascii="Fraktion Mono" w:hAnsi="Fraktion Mono"/>
+          <w:color w:val="BFC7D5"/>
+          <w:shd w:val="clear" w:color="auto" w:fill="28292B"/>
+        </w:rPr>
+        <w:t xml:space="preserve"> </w:t>
+      </w:r>
+      <w:r>
+        <w:rPr>
+          <w:rStyle w:val="token"/>
+          <w:rFonts w:ascii="Fraktion Mono" w:hAnsi="Fraktion Mono"/>
+          <w:i/>
+          <w:iCs/>
+          <w:color w:val="9C9C9C"/>
+          <w:shd w:val="clear" w:color="auto" w:fill="28292B"/>
+        </w:rPr>
+        <w:t>// the ease of the snap animation ("power3" by default)</w:t>
+      </w:r>
+      <w:r>
+        <w:rPr>
+          <w:rFonts w:ascii="Fraktion Mono" w:hAnsi="Fraktion Mono"/>
+          <w:color w:val="BFC7D5"/>
+          <w:shd w:val="clear" w:color="auto" w:fill="28292B"/>
+        </w:rPr>
+        <w:br/>
+      </w:r>
+      <w:r>
+        <w:rPr>
+          <w:rStyle w:val="token"/>
+          <w:rFonts w:ascii="Fraktion Mono" w:hAnsi="Fraktion Mono"/>
+          <w:color w:val="BFC7D5"/>
+          <w:shd w:val="clear" w:color="auto" w:fill="28292B"/>
+        </w:rPr>
+        <w:tab/>
+      </w:r>
+      <w:r>
+        <w:rPr>
+          <w:rStyle w:val="token"/>
+          <w:rFonts w:ascii="Fraktion Mono" w:hAnsi="Fraktion Mono"/>
+          <w:color w:val="BFC7D5"/>
+          <w:shd w:val="clear" w:color="auto" w:fill="28292B"/>
+        </w:rPr>
+        <w:tab/>
+      </w:r>
+      <w:r>
+        <w:rPr>
+          <w:rStyle w:val="token"/>
+          <w:rFonts w:ascii="Fraktion Mono" w:hAnsi="Fraktion Mono"/>
+          <w:color w:val="C792EA"/>
+          <w:shd w:val="clear" w:color="auto" w:fill="28292B"/>
+        </w:rPr>
+        <w:t>}</w:t>
+      </w:r>
+      <w:r>
+        <w:rPr>
+          <w:rFonts w:ascii="Fraktion Mono" w:hAnsi="Fraktion Mono"/>
+          <w:color w:val="BFC7D5"/>
+          <w:shd w:val="clear" w:color="auto" w:fill="28292B"/>
+        </w:rPr>
+        <w:br/>
+      </w:r>
+      <w:r>
+        <w:rPr>
+          <w:rStyle w:val="token"/>
+          <w:rFonts w:ascii="Fraktion Mono" w:hAnsi="Fraktion Mono"/>
+          <w:color w:val="BFC7D5"/>
+          <w:shd w:val="clear" w:color="auto" w:fill="28292B"/>
+        </w:rPr>
+        <w:tab/>
+      </w:r>
+      <w:r>
+        <w:rPr>
+          <w:rStyle w:val="token"/>
+          <w:rFonts w:ascii="Fraktion Mono" w:hAnsi="Fraktion Mono"/>
+          <w:color w:val="C792EA"/>
+          <w:shd w:val="clear" w:color="auto" w:fill="28292B"/>
+        </w:rPr>
+        <w:t>}</w:t>
+      </w:r>
+      <w:r>
+        <w:rPr>
+          <w:rFonts w:ascii="Fraktion Mono" w:hAnsi="Fraktion Mono"/>
+          <w:color w:val="BFC7D5"/>
+          <w:shd w:val="clear" w:color="auto" w:fill="28292B"/>
+        </w:rPr>
+        <w:br/>
+      </w:r>
+      <w:r>
+        <w:rPr>
+          <w:rStyle w:val="token"/>
+          <w:rFonts w:ascii="Fraktion Mono" w:hAnsi="Fraktion Mono"/>
+          <w:color w:val="C792EA"/>
+          <w:shd w:val="clear" w:color="auto" w:fill="28292B"/>
+        </w:rPr>
+        <w:t>});</w:t>
+      </w:r>
       <w:bookmarkStart w:id="0" w:name="_GoBack"/>
       <w:bookmarkEnd w:id="0"/>
     </w:p>
@@ -6406,10 +7476,32 @@
       <w:szCs w:val="48"/>
     </w:rPr>
   </w:style>
+  <w:style w:type="paragraph" w:styleId="Heading2">
+    <w:name w:val="heading 2"/>
+    <w:basedOn w:val="Normal"/>
+    <w:next w:val="Normal"/>
+    <w:link w:val="Heading2Char"/>
+    <w:uiPriority w:val="9"/>
+    <w:semiHidden/>
+    <w:unhideWhenUsed/>
+    <w:qFormat/>
+    <w:rsid w:val="00931962"/>
+    <w:pPr>
+      <w:keepNext/>
+      <w:keepLines/>
+      <w:spacing w:before="40" w:after="0"/>
+      <w:outlineLvl w:val="1"/>
+    </w:pPr>
+    <w:rPr>
+      <w:rFonts w:asciiTheme="majorHAnsi" w:eastAsiaTheme="majorEastAsia" w:hAnsiTheme="majorHAnsi" w:cstheme="majorBidi"/>
+      <w:color w:val="2E74B5" w:themeColor="accent1" w:themeShade="BF"/>
+      <w:sz w:val="26"/>
+      <w:szCs w:val="26"/>
+    </w:rPr>
+  </w:style>
   <w:style w:type="character" w:default="1" w:styleId="DefaultParagraphFont">
     <w:name w:val="Default Paragraph Font"/>
     <w:uiPriority w:val="1"/>
-    <w:semiHidden/>
     <w:unhideWhenUsed/>
   </w:style>
   <w:style w:type="table" w:default="1" w:styleId="TableNormal">
@@ -6451,6 +7543,68 @@
       <w:kern w:val="36"/>
       <w:sz w:val="48"/>
       <w:szCs w:val="48"/>
+    </w:rPr>
+  </w:style>
+  <w:style w:type="character" w:customStyle="1" w:styleId="Heading2Char">
+    <w:name w:val="Heading 2 Char"/>
+    <w:basedOn w:val="DefaultParagraphFont"/>
+    <w:link w:val="Heading2"/>
+    <w:uiPriority w:val="9"/>
+    <w:semiHidden/>
+    <w:rsid w:val="00931962"/>
+    <w:rPr>
+      <w:rFonts w:asciiTheme="majorHAnsi" w:eastAsiaTheme="majorEastAsia" w:hAnsiTheme="majorHAnsi" w:cstheme="majorBidi"/>
+      <w:color w:val="2E74B5" w:themeColor="accent1" w:themeShade="BF"/>
+      <w:sz w:val="26"/>
+      <w:szCs w:val="26"/>
+    </w:rPr>
+  </w:style>
+  <w:style w:type="paragraph" w:styleId="HTMLPreformatted">
+    <w:name w:val="HTML Preformatted"/>
+    <w:basedOn w:val="Normal"/>
+    <w:link w:val="HTMLPreformattedChar"/>
+    <w:uiPriority w:val="99"/>
+    <w:semiHidden/>
+    <w:unhideWhenUsed/>
+    <w:rsid w:val="00931962"/>
+    <w:pPr>
+      <w:tabs>
+        <w:tab w:val="left" w:pos="916"/>
+        <w:tab w:val="left" w:pos="1832"/>
+        <w:tab w:val="left" w:pos="2748"/>
+        <w:tab w:val="left" w:pos="3664"/>
+        <w:tab w:val="left" w:pos="4580"/>
+        <w:tab w:val="left" w:pos="5496"/>
+        <w:tab w:val="left" w:pos="6412"/>
+        <w:tab w:val="left" w:pos="7328"/>
+        <w:tab w:val="left" w:pos="8244"/>
+        <w:tab w:val="left" w:pos="9160"/>
+        <w:tab w:val="left" w:pos="10076"/>
+        <w:tab w:val="left" w:pos="10992"/>
+        <w:tab w:val="left" w:pos="11908"/>
+        <w:tab w:val="left" w:pos="12824"/>
+        <w:tab w:val="left" w:pos="13740"/>
+        <w:tab w:val="left" w:pos="14656"/>
+      </w:tabs>
+      <w:spacing w:after="0" w:line="240" w:lineRule="auto"/>
+    </w:pPr>
+    <w:rPr>
+      <w:rFonts w:ascii="Courier New" w:eastAsia="Times New Roman" w:hAnsi="Courier New" w:cs="Courier New"/>
+      <w:sz w:val="20"/>
+      <w:szCs w:val="20"/>
+    </w:rPr>
+  </w:style>
+  <w:style w:type="character" w:customStyle="1" w:styleId="HTMLPreformattedChar">
+    <w:name w:val="HTML Preformatted Char"/>
+    <w:basedOn w:val="DefaultParagraphFont"/>
+    <w:link w:val="HTMLPreformatted"/>
+    <w:uiPriority w:val="99"/>
+    <w:semiHidden/>
+    <w:rsid w:val="00931962"/>
+    <w:rPr>
+      <w:rFonts w:ascii="Courier New" w:eastAsia="Times New Roman" w:hAnsi="Courier New" w:cs="Courier New"/>
+      <w:sz w:val="20"/>
+      <w:szCs w:val="20"/>
     </w:rPr>
   </w:style>
 </w:styles>

</xml_diff>

<commit_message>
deep study in tl after before animation start
</commit_message>
<xml_diff>
--- a/gsap/GSAP.docx
+++ b/gsap/GSAP.docx
@@ -614,8 +614,6 @@
       <w:r>
         <w:t xml:space="preserve"> size</w:t>
       </w:r>
-      <w:bookmarkStart w:id="0" w:name="_GoBack"/>
-      <w:bookmarkEnd w:id="0"/>
     </w:p>
     <w:p>
       <w:proofErr w:type="spellStart"/>
@@ -5794,7 +5792,3685 @@
       <w:r>
         <w:br w:type="page"/>
       </w:r>
-    </w:p>
+      <w:r>
+        <w:lastRenderedPageBreak/>
+        <w:t>Timeline</w:t>
+      </w:r>
+    </w:p>
+    <w:tbl>
+      <w:tblPr>
+        <w:tblW w:w="0" w:type="auto"/>
+        <w:tblCellSpacing w:w="15" w:type="dxa"/>
+        <w:tblCellMar>
+          <w:top w:w="15" w:type="dxa"/>
+          <w:left w:w="15" w:type="dxa"/>
+          <w:bottom w:w="15" w:type="dxa"/>
+          <w:right w:w="15" w:type="dxa"/>
+        </w:tblCellMar>
+        <w:tblLook w:val="04A0" w:firstRow="1" w:lastRow="0" w:firstColumn="1" w:lastColumn="0" w:noHBand="0" w:noVBand="1"/>
+      </w:tblPr>
+      <w:tblGrid>
+        <w:gridCol w:w="702"/>
+        <w:gridCol w:w="1402"/>
+      </w:tblGrid>
+      <w:tr>
+        <w:trPr>
+          <w:tblHeader/>
+          <w:tblCellSpacing w:w="15" w:type="dxa"/>
+        </w:trPr>
+        <w:tc>
+          <w:tcPr>
+            <w:tcW w:w="0" w:type="auto"/>
+            <w:vAlign w:val="center"/>
+            <w:hideMark/>
+          </w:tcPr>
+          <w:p>
+            <w:pPr>
+              <w:spacing w:after="0" w:line="240" w:lineRule="auto"/>
+              <w:jc w:val="center"/>
+              <w:rPr>
+                <w:rFonts w:ascii="Times New Roman" w:eastAsia="Times New Roman" w:hAnsi="Times New Roman" w:cs="Times New Roman"/>
+                <w:b/>
+                <w:bCs/>
+                <w:sz w:val="24"/>
+                <w:szCs w:val="24"/>
+              </w:rPr>
+            </w:pPr>
+            <w:r>
+              <w:rPr>
+                <w:rFonts w:ascii="Times New Roman" w:eastAsia="Times New Roman" w:hAnsi="Times New Roman" w:cs="Times New Roman"/>
+                <w:b/>
+                <w:bCs/>
+                <w:sz w:val="24"/>
+                <w:szCs w:val="24"/>
+              </w:rPr>
+              <w:t>Value</w:t>
+            </w:r>
+          </w:p>
+        </w:tc>
+        <w:tc>
+          <w:tcPr>
+            <w:tcW w:w="0" w:type="auto"/>
+            <w:vAlign w:val="center"/>
+            <w:hideMark/>
+          </w:tcPr>
+          <w:p>
+            <w:pPr>
+              <w:spacing w:after="0" w:line="240" w:lineRule="auto"/>
+              <w:jc w:val="center"/>
+              <w:rPr>
+                <w:rFonts w:ascii="Times New Roman" w:eastAsia="Times New Roman" w:hAnsi="Times New Roman" w:cs="Times New Roman"/>
+                <w:b/>
+                <w:bCs/>
+                <w:sz w:val="24"/>
+                <w:szCs w:val="24"/>
+              </w:rPr>
+            </w:pPr>
+            <w:r>
+              <w:rPr>
+                <w:rFonts w:ascii="Times New Roman" w:eastAsia="Times New Roman" w:hAnsi="Times New Roman" w:cs="Times New Roman"/>
+                <w:b/>
+                <w:bCs/>
+                <w:sz w:val="24"/>
+                <w:szCs w:val="24"/>
+              </w:rPr>
+              <w:t>Meaning</w:t>
+            </w:r>
+          </w:p>
+        </w:tc>
+      </w:tr>
+      <w:tr>
+        <w:trPr>
+          <w:tblCellSpacing w:w="15" w:type="dxa"/>
+        </w:trPr>
+        <w:tc>
+          <w:tcPr>
+            <w:tcW w:w="0" w:type="auto"/>
+            <w:vAlign w:val="center"/>
+            <w:hideMark/>
+          </w:tcPr>
+          <w:p>
+            <w:pPr>
+              <w:spacing w:after="0" w:line="240" w:lineRule="auto"/>
+              <w:rPr>
+                <w:rFonts w:ascii="Times New Roman" w:eastAsia="Times New Roman" w:hAnsi="Times New Roman" w:cs="Times New Roman"/>
+                <w:sz w:val="24"/>
+                <w:szCs w:val="24"/>
+              </w:rPr>
+            </w:pPr>
+            <w:r>
+              <w:rPr>
+                <w:rFonts w:ascii="Times New Roman" w:eastAsia="Times New Roman" w:hAnsi="Times New Roman" w:cs="Times New Roman"/>
+                <w:sz w:val="24"/>
+                <w:szCs w:val="24"/>
+              </w:rPr>
+              <w:t>(none)</w:t>
+            </w:r>
+          </w:p>
+        </w:tc>
+        <w:tc>
+          <w:tcPr>
+            <w:tcW w:w="0" w:type="auto"/>
+            <w:vAlign w:val="center"/>
+            <w:hideMark/>
+          </w:tcPr>
+          <w:p>
+            <w:pPr>
+              <w:spacing w:after="0" w:line="240" w:lineRule="auto"/>
+              <w:rPr>
+                <w:rFonts w:ascii="Times New Roman" w:eastAsia="Times New Roman" w:hAnsi="Times New Roman" w:cs="Times New Roman"/>
+                <w:sz w:val="24"/>
+                <w:szCs w:val="24"/>
+              </w:rPr>
+            </w:pPr>
+            <w:r>
+              <w:rPr>
+                <w:rFonts w:ascii="Times New Roman" w:eastAsia="Times New Roman" w:hAnsi="Times New Roman" w:cs="Times New Roman"/>
+                <w:sz w:val="24"/>
+                <w:szCs w:val="24"/>
+              </w:rPr>
+              <w:t>after previous</w:t>
+            </w:r>
+          </w:p>
+        </w:tc>
+      </w:tr>
+      <w:tr>
+        <w:trPr>
+          <w:tblCellSpacing w:w="15" w:type="dxa"/>
+        </w:trPr>
+        <w:tc>
+          <w:tcPr>
+            <w:tcW w:w="0" w:type="auto"/>
+            <w:vAlign w:val="center"/>
+            <w:hideMark/>
+          </w:tcPr>
+          <w:p>
+            <w:pPr>
+              <w:spacing w:after="0" w:line="240" w:lineRule="auto"/>
+              <w:rPr>
+                <w:rFonts w:ascii="Times New Roman" w:eastAsia="Times New Roman" w:hAnsi="Times New Roman" w:cs="Times New Roman"/>
+                <w:sz w:val="24"/>
+                <w:szCs w:val="24"/>
+              </w:rPr>
+            </w:pPr>
+            <w:r>
+              <w:rPr>
+                <w:rFonts w:ascii="Courier New" w:eastAsia="Times New Roman" w:hAnsi="Courier New" w:cs="Courier New"/>
+                <w:sz w:val="20"/>
+                <w:szCs w:val="20"/>
+              </w:rPr>
+              <w:t>1</w:t>
+            </w:r>
+          </w:p>
+        </w:tc>
+        <w:tc>
+          <w:tcPr>
+            <w:tcW w:w="0" w:type="auto"/>
+            <w:vAlign w:val="center"/>
+            <w:hideMark/>
+          </w:tcPr>
+          <w:p>
+            <w:pPr>
+              <w:spacing w:after="0" w:line="240" w:lineRule="auto"/>
+              <w:rPr>
+                <w:rFonts w:ascii="Times New Roman" w:eastAsia="Times New Roman" w:hAnsi="Times New Roman" w:cs="Times New Roman"/>
+                <w:sz w:val="24"/>
+                <w:szCs w:val="24"/>
+              </w:rPr>
+            </w:pPr>
+            <w:r>
+              <w:rPr>
+                <w:rFonts w:ascii="Times New Roman" w:eastAsia="Times New Roman" w:hAnsi="Times New Roman" w:cs="Times New Roman"/>
+                <w:sz w:val="24"/>
+                <w:szCs w:val="24"/>
+              </w:rPr>
+              <w:t>at 1 sec</w:t>
+            </w:r>
+          </w:p>
+        </w:tc>
+      </w:tr>
+      <w:tr>
+        <w:trPr>
+          <w:tblCellSpacing w:w="15" w:type="dxa"/>
+        </w:trPr>
+        <w:tc>
+          <w:tcPr>
+            <w:tcW w:w="0" w:type="auto"/>
+            <w:vAlign w:val="center"/>
+            <w:hideMark/>
+          </w:tcPr>
+          <w:p>
+            <w:pPr>
+              <w:spacing w:after="0" w:line="240" w:lineRule="auto"/>
+              <w:rPr>
+                <w:rFonts w:ascii="Times New Roman" w:eastAsia="Times New Roman" w:hAnsi="Times New Roman" w:cs="Times New Roman"/>
+                <w:sz w:val="24"/>
+                <w:szCs w:val="24"/>
+              </w:rPr>
+            </w:pPr>
+            <w:r>
+              <w:rPr>
+                <w:rFonts w:ascii="Courier New" w:eastAsia="Times New Roman" w:hAnsi="Courier New" w:cs="Courier New"/>
+                <w:sz w:val="20"/>
+                <w:szCs w:val="20"/>
+              </w:rPr>
+              <w:t>+=1</w:t>
+            </w:r>
+          </w:p>
+        </w:tc>
+        <w:tc>
+          <w:tcPr>
+            <w:tcW w:w="0" w:type="auto"/>
+            <w:vAlign w:val="center"/>
+            <w:hideMark/>
+          </w:tcPr>
+          <w:p>
+            <w:pPr>
+              <w:spacing w:after="0" w:line="240" w:lineRule="auto"/>
+              <w:rPr>
+                <w:rFonts w:ascii="Times New Roman" w:eastAsia="Times New Roman" w:hAnsi="Times New Roman" w:cs="Times New Roman"/>
+                <w:sz w:val="24"/>
+                <w:szCs w:val="24"/>
+              </w:rPr>
+            </w:pPr>
+            <w:r>
+              <w:rPr>
+                <w:rFonts w:ascii="Times New Roman" w:eastAsia="Times New Roman" w:hAnsi="Times New Roman" w:cs="Times New Roman"/>
+                <w:sz w:val="24"/>
+                <w:szCs w:val="24"/>
+              </w:rPr>
+              <w:t>1 sec after</w:t>
+            </w:r>
+          </w:p>
+        </w:tc>
+      </w:tr>
+      <w:tr>
+        <w:trPr>
+          <w:tblCellSpacing w:w="15" w:type="dxa"/>
+        </w:trPr>
+        <w:tc>
+          <w:tcPr>
+            <w:tcW w:w="0" w:type="auto"/>
+            <w:vAlign w:val="center"/>
+            <w:hideMark/>
+          </w:tcPr>
+          <w:p>
+            <w:pPr>
+              <w:spacing w:after="0" w:line="240" w:lineRule="auto"/>
+              <w:rPr>
+                <w:rFonts w:ascii="Times New Roman" w:eastAsia="Times New Roman" w:hAnsi="Times New Roman" w:cs="Times New Roman"/>
+                <w:sz w:val="24"/>
+                <w:szCs w:val="24"/>
+              </w:rPr>
+            </w:pPr>
+            <w:r>
+              <w:rPr>
+                <w:rFonts w:ascii="Courier New" w:eastAsia="Times New Roman" w:hAnsi="Courier New" w:cs="Courier New"/>
+                <w:sz w:val="20"/>
+                <w:szCs w:val="20"/>
+              </w:rPr>
+              <w:t>-=1</w:t>
+            </w:r>
+          </w:p>
+        </w:tc>
+        <w:tc>
+          <w:tcPr>
+            <w:tcW w:w="0" w:type="auto"/>
+            <w:vAlign w:val="center"/>
+            <w:hideMark/>
+          </w:tcPr>
+          <w:p>
+            <w:pPr>
+              <w:spacing w:after="0" w:line="240" w:lineRule="auto"/>
+              <w:rPr>
+                <w:rFonts w:ascii="Times New Roman" w:eastAsia="Times New Roman" w:hAnsi="Times New Roman" w:cs="Times New Roman"/>
+                <w:sz w:val="24"/>
+                <w:szCs w:val="24"/>
+              </w:rPr>
+            </w:pPr>
+            <w:r>
+              <w:rPr>
+                <w:rFonts w:ascii="Times New Roman" w:eastAsia="Times New Roman" w:hAnsi="Times New Roman" w:cs="Times New Roman"/>
+                <w:sz w:val="24"/>
+                <w:szCs w:val="24"/>
+              </w:rPr>
+              <w:t>1 sec before</w:t>
+            </w:r>
+          </w:p>
+        </w:tc>
+      </w:tr>
+      <w:tr>
+        <w:trPr>
+          <w:tblCellSpacing w:w="15" w:type="dxa"/>
+        </w:trPr>
+        <w:tc>
+          <w:tcPr>
+            <w:tcW w:w="0" w:type="auto"/>
+            <w:vAlign w:val="center"/>
+            <w:hideMark/>
+          </w:tcPr>
+          <w:p>
+            <w:pPr>
+              <w:spacing w:after="0" w:line="240" w:lineRule="auto"/>
+              <w:rPr>
+                <w:rFonts w:ascii="Times New Roman" w:eastAsia="Times New Roman" w:hAnsi="Times New Roman" w:cs="Times New Roman"/>
+                <w:sz w:val="24"/>
+                <w:szCs w:val="24"/>
+              </w:rPr>
+            </w:pPr>
+            <w:r>
+              <w:rPr>
+                <w:rFonts w:ascii="Courier New" w:eastAsia="Times New Roman" w:hAnsi="Courier New" w:cs="Courier New"/>
+                <w:sz w:val="20"/>
+                <w:szCs w:val="20"/>
+              </w:rPr>
+              <w:t>&lt;</w:t>
+            </w:r>
+          </w:p>
+        </w:tc>
+        <w:tc>
+          <w:tcPr>
+            <w:tcW w:w="0" w:type="auto"/>
+            <w:vAlign w:val="center"/>
+            <w:hideMark/>
+          </w:tcPr>
+          <w:p>
+            <w:pPr>
+              <w:spacing w:after="0" w:line="240" w:lineRule="auto"/>
+              <w:rPr>
+                <w:rFonts w:ascii="Times New Roman" w:eastAsia="Times New Roman" w:hAnsi="Times New Roman" w:cs="Times New Roman"/>
+                <w:sz w:val="24"/>
+                <w:szCs w:val="24"/>
+              </w:rPr>
+            </w:pPr>
+            <w:r>
+              <w:rPr>
+                <w:rFonts w:ascii="Times New Roman" w:eastAsia="Times New Roman" w:hAnsi="Times New Roman" w:cs="Times New Roman"/>
+                <w:sz w:val="24"/>
+                <w:szCs w:val="24"/>
+              </w:rPr>
+              <w:t>same start</w:t>
+            </w:r>
+          </w:p>
+        </w:tc>
+      </w:tr>
+      <w:tr>
+        <w:trPr>
+          <w:tblCellSpacing w:w="15" w:type="dxa"/>
+        </w:trPr>
+        <w:tc>
+          <w:tcPr>
+            <w:tcW w:w="0" w:type="auto"/>
+            <w:vAlign w:val="center"/>
+            <w:hideMark/>
+          </w:tcPr>
+          <w:p>
+            <w:pPr>
+              <w:spacing w:after="0" w:line="240" w:lineRule="auto"/>
+              <w:rPr>
+                <w:rFonts w:ascii="Times New Roman" w:eastAsia="Times New Roman" w:hAnsi="Times New Roman" w:cs="Times New Roman"/>
+                <w:sz w:val="24"/>
+                <w:szCs w:val="24"/>
+              </w:rPr>
+            </w:pPr>
+            <w:r>
+              <w:rPr>
+                <w:rFonts w:ascii="Courier New" w:eastAsia="Times New Roman" w:hAnsi="Courier New" w:cs="Courier New"/>
+                <w:sz w:val="20"/>
+                <w:szCs w:val="20"/>
+              </w:rPr>
+              <w:t>&gt;</w:t>
+            </w:r>
+          </w:p>
+        </w:tc>
+        <w:tc>
+          <w:tcPr>
+            <w:tcW w:w="0" w:type="auto"/>
+            <w:vAlign w:val="center"/>
+            <w:hideMark/>
+          </w:tcPr>
+          <w:p>
+            <w:pPr>
+              <w:spacing w:after="0" w:line="240" w:lineRule="auto"/>
+              <w:rPr>
+                <w:rFonts w:ascii="Times New Roman" w:eastAsia="Times New Roman" w:hAnsi="Times New Roman" w:cs="Times New Roman"/>
+                <w:sz w:val="24"/>
+                <w:szCs w:val="24"/>
+              </w:rPr>
+            </w:pPr>
+            <w:r>
+              <w:rPr>
+                <w:rFonts w:ascii="Times New Roman" w:eastAsia="Times New Roman" w:hAnsi="Times New Roman" w:cs="Times New Roman"/>
+                <w:sz w:val="24"/>
+                <w:szCs w:val="24"/>
+              </w:rPr>
+              <w:t>after end</w:t>
+            </w:r>
+          </w:p>
+        </w:tc>
+      </w:tr>
+    </w:tbl>
+    <w:p>
+      <w:pPr>
+        <w:spacing w:after="0" w:line="240" w:lineRule="auto"/>
+        <w:rPr>
+          <w:rFonts w:ascii="Courier New" w:eastAsia="Times New Roman" w:hAnsi="Courier New" w:cs="Courier New"/>
+          <w:sz w:val="20"/>
+          <w:szCs w:val="20"/>
+        </w:rPr>
+        <w:sectPr>
+          <w:pgSz w:w="12240" w:h="15840"/>
+          <w:pgMar w:top="1440" w:right="1440" w:bottom="1440" w:left="1440" w:header="720" w:footer="720" w:gutter="0"/>
+          <w:cols w:space="720"/>
+          <w:docGrid w:linePitch="360"/>
+        </w:sectPr>
+      </w:pPr>
+    </w:p>
+    <w:tbl>
+      <w:tblPr>
+        <w:tblW w:w="0" w:type="auto"/>
+        <w:tblCellSpacing w:w="15" w:type="dxa"/>
+        <w:tblCellMar>
+          <w:top w:w="15" w:type="dxa"/>
+          <w:left w:w="15" w:type="dxa"/>
+          <w:bottom w:w="15" w:type="dxa"/>
+          <w:right w:w="15" w:type="dxa"/>
+        </w:tblCellMar>
+        <w:tblLook w:val="04A0" w:firstRow="1" w:lastRow="0" w:firstColumn="1" w:lastColumn="0" w:noHBand="0" w:noVBand="1"/>
+      </w:tblPr>
+      <w:tblGrid>
+        <w:gridCol w:w="3308"/>
+        <w:gridCol w:w="81"/>
+      </w:tblGrid>
+      <w:tr>
+        <w:trPr>
+          <w:tblCellSpacing w:w="15" w:type="dxa"/>
+        </w:trPr>
+        <w:tc>
+          <w:tcPr>
+            <w:tcW w:w="0" w:type="auto"/>
+            <w:vAlign w:val="center"/>
+          </w:tcPr>
+          <w:p>
+            <w:pPr>
+              <w:spacing w:after="0" w:line="240" w:lineRule="auto"/>
+              <w:rPr>
+                <w:rFonts w:ascii="Courier New" w:eastAsia="Times New Roman" w:hAnsi="Courier New" w:cs="Courier New"/>
+                <w:sz w:val="20"/>
+                <w:szCs w:val="20"/>
+              </w:rPr>
+            </w:pPr>
+          </w:p>
+          <w:p>
+            <w:pPr>
+              <w:shd w:val="clear" w:color="auto" w:fill="121314"/>
+              <w:spacing w:after="0" w:line="285" w:lineRule="atLeast"/>
+              <w:rPr>
+                <w:rFonts w:ascii="Consolas" w:eastAsia="Times New Roman" w:hAnsi="Consolas" w:cs="Times New Roman"/>
+                <w:color w:val="BBBEBF"/>
+                <w:sz w:val="21"/>
+                <w:szCs w:val="21"/>
+              </w:rPr>
+            </w:pPr>
+            <w:r>
+              <w:rPr>
+                <w:rFonts w:ascii="Consolas" w:eastAsia="Times New Roman" w:hAnsi="Consolas" w:cs="Times New Roman"/>
+                <w:color w:val="D4D4D4"/>
+                <w:sz w:val="21"/>
+                <w:szCs w:val="21"/>
+              </w:rPr>
+              <w:t> </w:t>
+            </w:r>
+            <w:proofErr w:type="spellStart"/>
+            <w:r>
+              <w:rPr>
+                <w:rFonts w:ascii="Consolas" w:eastAsia="Times New Roman" w:hAnsi="Consolas" w:cs="Times New Roman"/>
+                <w:color w:val="FF7B72"/>
+                <w:sz w:val="21"/>
+                <w:szCs w:val="21"/>
+              </w:rPr>
+              <w:t>const</w:t>
+            </w:r>
+            <w:proofErr w:type="spellEnd"/>
+            <w:r>
+              <w:rPr>
+                <w:rFonts w:ascii="Consolas" w:eastAsia="Times New Roman" w:hAnsi="Consolas" w:cs="Times New Roman"/>
+                <w:color w:val="D4D4D4"/>
+                <w:sz w:val="21"/>
+                <w:szCs w:val="21"/>
+              </w:rPr>
+              <w:t xml:space="preserve"> </w:t>
+            </w:r>
+            <w:proofErr w:type="spellStart"/>
+            <w:r>
+              <w:rPr>
+                <w:rFonts w:ascii="Consolas" w:eastAsia="Times New Roman" w:hAnsi="Consolas" w:cs="Times New Roman"/>
+                <w:color w:val="79C0FF"/>
+                <w:sz w:val="21"/>
+                <w:szCs w:val="21"/>
+              </w:rPr>
+              <w:t>tl</w:t>
+            </w:r>
+            <w:proofErr w:type="spellEnd"/>
+            <w:r>
+              <w:rPr>
+                <w:rFonts w:ascii="Consolas" w:eastAsia="Times New Roman" w:hAnsi="Consolas" w:cs="Times New Roman"/>
+                <w:color w:val="D4D4D4"/>
+                <w:sz w:val="21"/>
+                <w:szCs w:val="21"/>
+              </w:rPr>
+              <w:t xml:space="preserve"> = </w:t>
+            </w:r>
+            <w:proofErr w:type="spellStart"/>
+            <w:r>
+              <w:rPr>
+                <w:rFonts w:ascii="Consolas" w:eastAsia="Times New Roman" w:hAnsi="Consolas" w:cs="Times New Roman"/>
+                <w:color w:val="C9D1D9"/>
+                <w:sz w:val="21"/>
+                <w:szCs w:val="21"/>
+              </w:rPr>
+              <w:t>gsap</w:t>
+            </w:r>
+            <w:r>
+              <w:rPr>
+                <w:rFonts w:ascii="Consolas" w:eastAsia="Times New Roman" w:hAnsi="Consolas" w:cs="Times New Roman"/>
+                <w:color w:val="D4D4D4"/>
+                <w:sz w:val="21"/>
+                <w:szCs w:val="21"/>
+              </w:rPr>
+              <w:t>.</w:t>
+            </w:r>
+            <w:r>
+              <w:rPr>
+                <w:rFonts w:ascii="Consolas" w:eastAsia="Times New Roman" w:hAnsi="Consolas" w:cs="Times New Roman"/>
+                <w:color w:val="D2A8FF"/>
+                <w:sz w:val="21"/>
+                <w:szCs w:val="21"/>
+              </w:rPr>
+              <w:t>timeline</w:t>
+            </w:r>
+            <w:proofErr w:type="spellEnd"/>
+            <w:r>
+              <w:rPr>
+                <w:rFonts w:ascii="Consolas" w:eastAsia="Times New Roman" w:hAnsi="Consolas" w:cs="Times New Roman"/>
+                <w:color w:val="D4D4D4"/>
+                <w:sz w:val="21"/>
+                <w:szCs w:val="21"/>
+              </w:rPr>
+              <w:t>();</w:t>
+            </w:r>
+          </w:p>
+          <w:p>
+            <w:pPr>
+              <w:shd w:val="clear" w:color="auto" w:fill="121314"/>
+              <w:spacing w:after="0" w:line="285" w:lineRule="atLeast"/>
+              <w:rPr>
+                <w:rFonts w:ascii="Consolas" w:eastAsia="Times New Roman" w:hAnsi="Consolas" w:cs="Times New Roman"/>
+                <w:color w:val="BBBEBF"/>
+                <w:sz w:val="21"/>
+                <w:szCs w:val="21"/>
+              </w:rPr>
+            </w:pPr>
+            <w:r>
+              <w:rPr>
+                <w:rFonts w:ascii="Consolas" w:eastAsia="Times New Roman" w:hAnsi="Consolas" w:cs="Times New Roman"/>
+                <w:color w:val="D4D4D4"/>
+                <w:sz w:val="21"/>
+                <w:szCs w:val="21"/>
+              </w:rPr>
+              <w:t xml:space="preserve">      </w:t>
+            </w:r>
+            <w:r>
+              <w:rPr>
+                <w:rFonts w:ascii="Consolas" w:eastAsia="Times New Roman" w:hAnsi="Consolas" w:cs="Times New Roman"/>
+                <w:color w:val="79C0FF"/>
+                <w:sz w:val="21"/>
+                <w:szCs w:val="21"/>
+              </w:rPr>
+              <w:t>tl</w:t>
+            </w:r>
+            <w:r>
+              <w:rPr>
+                <w:rFonts w:ascii="Consolas" w:eastAsia="Times New Roman" w:hAnsi="Consolas" w:cs="Times New Roman"/>
+                <w:color w:val="D4D4D4"/>
+                <w:sz w:val="21"/>
+                <w:szCs w:val="21"/>
+              </w:rPr>
+              <w:t>.</w:t>
+            </w:r>
+            <w:r>
+              <w:rPr>
+                <w:rFonts w:ascii="Consolas" w:eastAsia="Times New Roman" w:hAnsi="Consolas" w:cs="Times New Roman"/>
+                <w:color w:val="D2A8FF"/>
+                <w:sz w:val="21"/>
+                <w:szCs w:val="21"/>
+              </w:rPr>
+              <w:t>to</w:t>
+            </w:r>
+            <w:r>
+              <w:rPr>
+                <w:rFonts w:ascii="Consolas" w:eastAsia="Times New Roman" w:hAnsi="Consolas" w:cs="Times New Roman"/>
+                <w:color w:val="D4D4D4"/>
+                <w:sz w:val="21"/>
+                <w:szCs w:val="21"/>
+              </w:rPr>
+              <w:t>(</w:t>
+            </w:r>
+            <w:r>
+              <w:rPr>
+                <w:rFonts w:ascii="Consolas" w:eastAsia="Times New Roman" w:hAnsi="Consolas" w:cs="Times New Roman"/>
+                <w:color w:val="A5D6FF"/>
+                <w:sz w:val="21"/>
+                <w:szCs w:val="21"/>
+              </w:rPr>
+              <w:t>".b1"</w:t>
+            </w:r>
+            <w:r>
+              <w:rPr>
+                <w:rFonts w:ascii="Consolas" w:eastAsia="Times New Roman" w:hAnsi="Consolas" w:cs="Times New Roman"/>
+                <w:color w:val="D4D4D4"/>
+                <w:sz w:val="21"/>
+                <w:szCs w:val="21"/>
+              </w:rPr>
+              <w:t>, {</w:t>
+            </w:r>
+          </w:p>
+          <w:p>
+            <w:pPr>
+              <w:shd w:val="clear" w:color="auto" w:fill="121314"/>
+              <w:spacing w:after="0" w:line="285" w:lineRule="atLeast"/>
+              <w:rPr>
+                <w:rFonts w:ascii="Consolas" w:eastAsia="Times New Roman" w:hAnsi="Consolas" w:cs="Times New Roman"/>
+                <w:color w:val="BBBEBF"/>
+                <w:sz w:val="21"/>
+                <w:szCs w:val="21"/>
+              </w:rPr>
+            </w:pPr>
+            <w:r>
+              <w:rPr>
+                <w:rFonts w:ascii="Consolas" w:eastAsia="Times New Roman" w:hAnsi="Consolas" w:cs="Times New Roman"/>
+                <w:color w:val="D4D4D4"/>
+                <w:sz w:val="21"/>
+                <w:szCs w:val="21"/>
+              </w:rPr>
+              <w:t xml:space="preserve">        </w:t>
+            </w:r>
+            <w:r>
+              <w:rPr>
+                <w:rFonts w:ascii="Consolas" w:eastAsia="Times New Roman" w:hAnsi="Consolas" w:cs="Times New Roman"/>
+                <w:color w:val="C9D1D9"/>
+                <w:sz w:val="21"/>
+                <w:szCs w:val="21"/>
+              </w:rPr>
+              <w:t>x</w:t>
+            </w:r>
+            <w:r>
+              <w:rPr>
+                <w:rFonts w:ascii="Consolas" w:eastAsia="Times New Roman" w:hAnsi="Consolas" w:cs="Times New Roman"/>
+                <w:color w:val="9CDCFE"/>
+                <w:sz w:val="21"/>
+                <w:szCs w:val="21"/>
+              </w:rPr>
+              <w:t>:</w:t>
+            </w:r>
+            <w:r>
+              <w:rPr>
+                <w:rFonts w:ascii="Consolas" w:eastAsia="Times New Roman" w:hAnsi="Consolas" w:cs="Times New Roman"/>
+                <w:color w:val="C9D1D9"/>
+                <w:sz w:val="21"/>
+                <w:szCs w:val="21"/>
+              </w:rPr>
+              <w:t xml:space="preserve"> </w:t>
+            </w:r>
+            <w:r>
+              <w:rPr>
+                <w:rFonts w:ascii="Consolas" w:eastAsia="Times New Roman" w:hAnsi="Consolas" w:cs="Times New Roman"/>
+                <w:color w:val="B5CEA8"/>
+                <w:sz w:val="21"/>
+                <w:szCs w:val="21"/>
+              </w:rPr>
+              <w:t>500</w:t>
+            </w:r>
+            <w:r>
+              <w:rPr>
+                <w:rFonts w:ascii="Consolas" w:eastAsia="Times New Roman" w:hAnsi="Consolas" w:cs="Times New Roman"/>
+                <w:color w:val="D4D4D4"/>
+                <w:sz w:val="21"/>
+                <w:szCs w:val="21"/>
+              </w:rPr>
+              <w:t>,</w:t>
+            </w:r>
+          </w:p>
+          <w:p>
+            <w:pPr>
+              <w:shd w:val="clear" w:color="auto" w:fill="121314"/>
+              <w:spacing w:after="0" w:line="285" w:lineRule="atLeast"/>
+              <w:rPr>
+                <w:rFonts w:ascii="Consolas" w:eastAsia="Times New Roman" w:hAnsi="Consolas" w:cs="Times New Roman"/>
+                <w:color w:val="BBBEBF"/>
+                <w:sz w:val="21"/>
+                <w:szCs w:val="21"/>
+              </w:rPr>
+            </w:pPr>
+            <w:r>
+              <w:rPr>
+                <w:rFonts w:ascii="Consolas" w:eastAsia="Times New Roman" w:hAnsi="Consolas" w:cs="Times New Roman"/>
+                <w:color w:val="D4D4D4"/>
+                <w:sz w:val="21"/>
+                <w:szCs w:val="21"/>
+              </w:rPr>
+              <w:t xml:space="preserve">        </w:t>
+            </w:r>
+            <w:r>
+              <w:rPr>
+                <w:rFonts w:ascii="Consolas" w:eastAsia="Times New Roman" w:hAnsi="Consolas" w:cs="Times New Roman"/>
+                <w:color w:val="C9D1D9"/>
+                <w:sz w:val="21"/>
+                <w:szCs w:val="21"/>
+              </w:rPr>
+              <w:t>duration</w:t>
+            </w:r>
+            <w:r>
+              <w:rPr>
+                <w:rFonts w:ascii="Consolas" w:eastAsia="Times New Roman" w:hAnsi="Consolas" w:cs="Times New Roman"/>
+                <w:color w:val="9CDCFE"/>
+                <w:sz w:val="21"/>
+                <w:szCs w:val="21"/>
+              </w:rPr>
+              <w:t>:</w:t>
+            </w:r>
+            <w:r>
+              <w:rPr>
+                <w:rFonts w:ascii="Consolas" w:eastAsia="Times New Roman" w:hAnsi="Consolas" w:cs="Times New Roman"/>
+                <w:color w:val="C9D1D9"/>
+                <w:sz w:val="21"/>
+                <w:szCs w:val="21"/>
+              </w:rPr>
+              <w:t xml:space="preserve"> </w:t>
+            </w:r>
+            <w:r>
+              <w:rPr>
+                <w:rFonts w:ascii="Consolas" w:eastAsia="Times New Roman" w:hAnsi="Consolas" w:cs="Times New Roman"/>
+                <w:color w:val="B5CEA8"/>
+                <w:sz w:val="21"/>
+                <w:szCs w:val="21"/>
+              </w:rPr>
+              <w:t>4</w:t>
+            </w:r>
+            <w:r>
+              <w:rPr>
+                <w:rFonts w:ascii="Consolas" w:eastAsia="Times New Roman" w:hAnsi="Consolas" w:cs="Times New Roman"/>
+                <w:color w:val="D4D4D4"/>
+                <w:sz w:val="21"/>
+                <w:szCs w:val="21"/>
+              </w:rPr>
+              <w:t>,</w:t>
+            </w:r>
+          </w:p>
+          <w:p>
+            <w:pPr>
+              <w:shd w:val="clear" w:color="auto" w:fill="121314"/>
+              <w:spacing w:after="0" w:line="285" w:lineRule="atLeast"/>
+              <w:rPr>
+                <w:rFonts w:ascii="Consolas" w:eastAsia="Times New Roman" w:hAnsi="Consolas" w:cs="Times New Roman"/>
+                <w:color w:val="BBBEBF"/>
+                <w:sz w:val="21"/>
+                <w:szCs w:val="21"/>
+              </w:rPr>
+            </w:pPr>
+            <w:r>
+              <w:rPr>
+                <w:rFonts w:ascii="Consolas" w:eastAsia="Times New Roman" w:hAnsi="Consolas" w:cs="Times New Roman"/>
+                <w:color w:val="D4D4D4"/>
+                <w:sz w:val="21"/>
+                <w:szCs w:val="21"/>
+              </w:rPr>
+              <w:t>      });</w:t>
+            </w:r>
+          </w:p>
+          <w:p>
+            <w:pPr>
+              <w:shd w:val="clear" w:color="auto" w:fill="121314"/>
+              <w:spacing w:after="0" w:line="285" w:lineRule="atLeast"/>
+              <w:rPr>
+                <w:rFonts w:ascii="Consolas" w:eastAsia="Times New Roman" w:hAnsi="Consolas" w:cs="Times New Roman"/>
+                <w:color w:val="BBBEBF"/>
+                <w:sz w:val="21"/>
+                <w:szCs w:val="21"/>
+              </w:rPr>
+            </w:pPr>
+            <w:r>
+              <w:rPr>
+                <w:rFonts w:ascii="Consolas" w:eastAsia="Times New Roman" w:hAnsi="Consolas" w:cs="Times New Roman"/>
+                <w:color w:val="D4D4D4"/>
+                <w:sz w:val="21"/>
+                <w:szCs w:val="21"/>
+              </w:rPr>
+              <w:t xml:space="preserve">      </w:t>
+            </w:r>
+            <w:r>
+              <w:rPr>
+                <w:rFonts w:ascii="Consolas" w:eastAsia="Times New Roman" w:hAnsi="Consolas" w:cs="Times New Roman"/>
+                <w:color w:val="79C0FF"/>
+                <w:sz w:val="21"/>
+                <w:szCs w:val="21"/>
+              </w:rPr>
+              <w:t>tl</w:t>
+            </w:r>
+            <w:r>
+              <w:rPr>
+                <w:rFonts w:ascii="Consolas" w:eastAsia="Times New Roman" w:hAnsi="Consolas" w:cs="Times New Roman"/>
+                <w:color w:val="D4D4D4"/>
+                <w:sz w:val="21"/>
+                <w:szCs w:val="21"/>
+              </w:rPr>
+              <w:t>.</w:t>
+            </w:r>
+            <w:r>
+              <w:rPr>
+                <w:rFonts w:ascii="Consolas" w:eastAsia="Times New Roman" w:hAnsi="Consolas" w:cs="Times New Roman"/>
+                <w:color w:val="D2A8FF"/>
+                <w:sz w:val="21"/>
+                <w:szCs w:val="21"/>
+              </w:rPr>
+              <w:t>to</w:t>
+            </w:r>
+            <w:r>
+              <w:rPr>
+                <w:rFonts w:ascii="Consolas" w:eastAsia="Times New Roman" w:hAnsi="Consolas" w:cs="Times New Roman"/>
+                <w:color w:val="D4D4D4"/>
+                <w:sz w:val="21"/>
+                <w:szCs w:val="21"/>
+              </w:rPr>
+              <w:t>(</w:t>
+            </w:r>
+          </w:p>
+          <w:p>
+            <w:pPr>
+              <w:shd w:val="clear" w:color="auto" w:fill="121314"/>
+              <w:spacing w:after="0" w:line="285" w:lineRule="atLeast"/>
+              <w:rPr>
+                <w:rFonts w:ascii="Consolas" w:eastAsia="Times New Roman" w:hAnsi="Consolas" w:cs="Times New Roman"/>
+                <w:color w:val="BBBEBF"/>
+                <w:sz w:val="21"/>
+                <w:szCs w:val="21"/>
+              </w:rPr>
+            </w:pPr>
+            <w:r>
+              <w:rPr>
+                <w:rFonts w:ascii="Consolas" w:eastAsia="Times New Roman" w:hAnsi="Consolas" w:cs="Times New Roman"/>
+                <w:color w:val="D4D4D4"/>
+                <w:sz w:val="21"/>
+                <w:szCs w:val="21"/>
+              </w:rPr>
+              <w:t xml:space="preserve">        </w:t>
+            </w:r>
+            <w:r>
+              <w:rPr>
+                <w:rFonts w:ascii="Consolas" w:eastAsia="Times New Roman" w:hAnsi="Consolas" w:cs="Times New Roman"/>
+                <w:color w:val="A5D6FF"/>
+                <w:sz w:val="21"/>
+                <w:szCs w:val="21"/>
+              </w:rPr>
+              <w:t>".b2"</w:t>
+            </w:r>
+            <w:r>
+              <w:rPr>
+                <w:rFonts w:ascii="Consolas" w:eastAsia="Times New Roman" w:hAnsi="Consolas" w:cs="Times New Roman"/>
+                <w:color w:val="D4D4D4"/>
+                <w:sz w:val="21"/>
+                <w:szCs w:val="21"/>
+              </w:rPr>
+              <w:t>,</w:t>
+            </w:r>
+          </w:p>
+          <w:p>
+            <w:pPr>
+              <w:shd w:val="clear" w:color="auto" w:fill="121314"/>
+              <w:spacing w:after="0" w:line="285" w:lineRule="atLeast"/>
+              <w:rPr>
+                <w:rFonts w:ascii="Consolas" w:eastAsia="Times New Roman" w:hAnsi="Consolas" w:cs="Times New Roman"/>
+                <w:color w:val="BBBEBF"/>
+                <w:sz w:val="21"/>
+                <w:szCs w:val="21"/>
+              </w:rPr>
+            </w:pPr>
+            <w:r>
+              <w:rPr>
+                <w:rFonts w:ascii="Consolas" w:eastAsia="Times New Roman" w:hAnsi="Consolas" w:cs="Times New Roman"/>
+                <w:color w:val="D4D4D4"/>
+                <w:sz w:val="21"/>
+                <w:szCs w:val="21"/>
+              </w:rPr>
+              <w:t>        {</w:t>
+            </w:r>
+          </w:p>
+          <w:p>
+            <w:pPr>
+              <w:shd w:val="clear" w:color="auto" w:fill="121314"/>
+              <w:spacing w:after="0" w:line="285" w:lineRule="atLeast"/>
+              <w:rPr>
+                <w:rFonts w:ascii="Consolas" w:eastAsia="Times New Roman" w:hAnsi="Consolas" w:cs="Times New Roman"/>
+                <w:color w:val="BBBEBF"/>
+                <w:sz w:val="21"/>
+                <w:szCs w:val="21"/>
+              </w:rPr>
+            </w:pPr>
+            <w:r>
+              <w:rPr>
+                <w:rFonts w:ascii="Consolas" w:eastAsia="Times New Roman" w:hAnsi="Consolas" w:cs="Times New Roman"/>
+                <w:color w:val="D4D4D4"/>
+                <w:sz w:val="21"/>
+                <w:szCs w:val="21"/>
+              </w:rPr>
+              <w:t xml:space="preserve">          </w:t>
+            </w:r>
+            <w:r>
+              <w:rPr>
+                <w:rFonts w:ascii="Consolas" w:eastAsia="Times New Roman" w:hAnsi="Consolas" w:cs="Times New Roman"/>
+                <w:color w:val="C9D1D9"/>
+                <w:sz w:val="21"/>
+                <w:szCs w:val="21"/>
+              </w:rPr>
+              <w:t>x</w:t>
+            </w:r>
+            <w:r>
+              <w:rPr>
+                <w:rFonts w:ascii="Consolas" w:eastAsia="Times New Roman" w:hAnsi="Consolas" w:cs="Times New Roman"/>
+                <w:color w:val="9CDCFE"/>
+                <w:sz w:val="21"/>
+                <w:szCs w:val="21"/>
+              </w:rPr>
+              <w:t>:</w:t>
+            </w:r>
+            <w:r>
+              <w:rPr>
+                <w:rFonts w:ascii="Consolas" w:eastAsia="Times New Roman" w:hAnsi="Consolas" w:cs="Times New Roman"/>
+                <w:color w:val="C9D1D9"/>
+                <w:sz w:val="21"/>
+                <w:szCs w:val="21"/>
+              </w:rPr>
+              <w:t xml:space="preserve"> </w:t>
+            </w:r>
+            <w:r>
+              <w:rPr>
+                <w:rFonts w:ascii="Consolas" w:eastAsia="Times New Roman" w:hAnsi="Consolas" w:cs="Times New Roman"/>
+                <w:color w:val="B5CEA8"/>
+                <w:sz w:val="21"/>
+                <w:szCs w:val="21"/>
+              </w:rPr>
+              <w:t>500</w:t>
+            </w:r>
+            <w:r>
+              <w:rPr>
+                <w:rFonts w:ascii="Consolas" w:eastAsia="Times New Roman" w:hAnsi="Consolas" w:cs="Times New Roman"/>
+                <w:color w:val="D4D4D4"/>
+                <w:sz w:val="21"/>
+                <w:szCs w:val="21"/>
+              </w:rPr>
+              <w:t>,</w:t>
+            </w:r>
+          </w:p>
+          <w:p>
+            <w:pPr>
+              <w:shd w:val="clear" w:color="auto" w:fill="121314"/>
+              <w:spacing w:after="0" w:line="285" w:lineRule="atLeast"/>
+              <w:rPr>
+                <w:rFonts w:ascii="Consolas" w:eastAsia="Times New Roman" w:hAnsi="Consolas" w:cs="Times New Roman"/>
+                <w:color w:val="BBBEBF"/>
+                <w:sz w:val="21"/>
+                <w:szCs w:val="21"/>
+              </w:rPr>
+            </w:pPr>
+            <w:r>
+              <w:rPr>
+                <w:rFonts w:ascii="Consolas" w:eastAsia="Times New Roman" w:hAnsi="Consolas" w:cs="Times New Roman"/>
+                <w:color w:val="D4D4D4"/>
+                <w:sz w:val="21"/>
+                <w:szCs w:val="21"/>
+              </w:rPr>
+              <w:lastRenderedPageBreak/>
+              <w:t xml:space="preserve">          </w:t>
+            </w:r>
+            <w:r>
+              <w:rPr>
+                <w:rFonts w:ascii="Consolas" w:eastAsia="Times New Roman" w:hAnsi="Consolas" w:cs="Times New Roman"/>
+                <w:color w:val="C9D1D9"/>
+                <w:sz w:val="21"/>
+                <w:szCs w:val="21"/>
+              </w:rPr>
+              <w:t>duration</w:t>
+            </w:r>
+            <w:r>
+              <w:rPr>
+                <w:rFonts w:ascii="Consolas" w:eastAsia="Times New Roman" w:hAnsi="Consolas" w:cs="Times New Roman"/>
+                <w:color w:val="9CDCFE"/>
+                <w:sz w:val="21"/>
+                <w:szCs w:val="21"/>
+              </w:rPr>
+              <w:t>:</w:t>
+            </w:r>
+            <w:r>
+              <w:rPr>
+                <w:rFonts w:ascii="Consolas" w:eastAsia="Times New Roman" w:hAnsi="Consolas" w:cs="Times New Roman"/>
+                <w:color w:val="C9D1D9"/>
+                <w:sz w:val="21"/>
+                <w:szCs w:val="21"/>
+              </w:rPr>
+              <w:t xml:space="preserve"> </w:t>
+            </w:r>
+            <w:r>
+              <w:rPr>
+                <w:rFonts w:ascii="Consolas" w:eastAsia="Times New Roman" w:hAnsi="Consolas" w:cs="Times New Roman"/>
+                <w:color w:val="B5CEA8"/>
+                <w:sz w:val="21"/>
+                <w:szCs w:val="21"/>
+              </w:rPr>
+              <w:t>2</w:t>
+            </w:r>
+            <w:r>
+              <w:rPr>
+                <w:rFonts w:ascii="Consolas" w:eastAsia="Times New Roman" w:hAnsi="Consolas" w:cs="Times New Roman"/>
+                <w:color w:val="D4D4D4"/>
+                <w:sz w:val="21"/>
+                <w:szCs w:val="21"/>
+              </w:rPr>
+              <w:t>,</w:t>
+            </w:r>
+          </w:p>
+          <w:p>
+            <w:pPr>
+              <w:shd w:val="clear" w:color="auto" w:fill="121314"/>
+              <w:spacing w:after="0" w:line="285" w:lineRule="atLeast"/>
+              <w:rPr>
+                <w:rFonts w:ascii="Consolas" w:eastAsia="Times New Roman" w:hAnsi="Consolas" w:cs="Times New Roman"/>
+                <w:color w:val="BBBEBF"/>
+                <w:sz w:val="21"/>
+                <w:szCs w:val="21"/>
+              </w:rPr>
+            </w:pPr>
+            <w:r>
+              <w:rPr>
+                <w:rFonts w:ascii="Consolas" w:eastAsia="Times New Roman" w:hAnsi="Consolas" w:cs="Times New Roman"/>
+                <w:color w:val="D4D4D4"/>
+                <w:sz w:val="21"/>
+                <w:szCs w:val="21"/>
+              </w:rPr>
+              <w:t>        },</w:t>
+            </w:r>
+          </w:p>
+          <w:p>
+            <w:pPr>
+              <w:shd w:val="clear" w:color="auto" w:fill="121314"/>
+              <w:spacing w:after="0" w:line="285" w:lineRule="atLeast"/>
+              <w:rPr>
+                <w:rFonts w:ascii="Consolas" w:eastAsia="Times New Roman" w:hAnsi="Consolas" w:cs="Times New Roman"/>
+                <w:color w:val="BBBEBF"/>
+                <w:sz w:val="21"/>
+                <w:szCs w:val="21"/>
+              </w:rPr>
+            </w:pPr>
+            <w:r>
+              <w:rPr>
+                <w:rFonts w:ascii="Consolas" w:eastAsia="Times New Roman" w:hAnsi="Consolas" w:cs="Times New Roman"/>
+                <w:color w:val="D4D4D4"/>
+                <w:sz w:val="21"/>
+                <w:szCs w:val="21"/>
+              </w:rPr>
+              <w:t xml:space="preserve">        </w:t>
+            </w:r>
+            <w:r>
+              <w:rPr>
+                <w:rFonts w:ascii="Consolas" w:eastAsia="Times New Roman" w:hAnsi="Consolas" w:cs="Times New Roman"/>
+                <w:color w:val="B5CEA8"/>
+                <w:sz w:val="21"/>
+                <w:szCs w:val="21"/>
+              </w:rPr>
+              <w:t>1</w:t>
+            </w:r>
+            <w:r>
+              <w:rPr>
+                <w:rFonts w:ascii="Consolas" w:eastAsia="Times New Roman" w:hAnsi="Consolas" w:cs="Times New Roman"/>
+                <w:color w:val="D4D4D4"/>
+                <w:sz w:val="21"/>
+                <w:szCs w:val="21"/>
+              </w:rPr>
+              <w:t>,</w:t>
+            </w:r>
+          </w:p>
+          <w:p>
+            <w:pPr>
+              <w:shd w:val="clear" w:color="auto" w:fill="121314"/>
+              <w:spacing w:after="0" w:line="285" w:lineRule="atLeast"/>
+              <w:rPr>
+                <w:rFonts w:ascii="Consolas" w:eastAsia="Times New Roman" w:hAnsi="Consolas" w:cs="Times New Roman"/>
+                <w:color w:val="BBBEBF"/>
+                <w:sz w:val="21"/>
+                <w:szCs w:val="21"/>
+              </w:rPr>
+            </w:pPr>
+            <w:r>
+              <w:rPr>
+                <w:rFonts w:ascii="Consolas" w:eastAsia="Times New Roman" w:hAnsi="Consolas" w:cs="Times New Roman"/>
+                <w:color w:val="D4D4D4"/>
+                <w:sz w:val="21"/>
+                <w:szCs w:val="21"/>
+              </w:rPr>
+              <w:t>      );</w:t>
+            </w:r>
+          </w:p>
+          <w:p>
+            <w:pPr>
+              <w:shd w:val="clear" w:color="auto" w:fill="121314"/>
+              <w:spacing w:after="0" w:line="285" w:lineRule="atLeast"/>
+              <w:rPr>
+                <w:rFonts w:ascii="Consolas" w:eastAsia="Times New Roman" w:hAnsi="Consolas" w:cs="Times New Roman"/>
+                <w:color w:val="BBBEBF"/>
+                <w:sz w:val="21"/>
+                <w:szCs w:val="21"/>
+              </w:rPr>
+            </w:pPr>
+            <w:r>
+              <w:rPr>
+                <w:rFonts w:ascii="Consolas" w:eastAsia="Times New Roman" w:hAnsi="Consolas" w:cs="Times New Roman"/>
+                <w:color w:val="D4D4D4"/>
+                <w:sz w:val="21"/>
+                <w:szCs w:val="21"/>
+              </w:rPr>
+              <w:t xml:space="preserve">      </w:t>
+            </w:r>
+            <w:r>
+              <w:rPr>
+                <w:rFonts w:ascii="Consolas" w:eastAsia="Times New Roman" w:hAnsi="Consolas" w:cs="Times New Roman"/>
+                <w:color w:val="79C0FF"/>
+                <w:sz w:val="21"/>
+                <w:szCs w:val="21"/>
+              </w:rPr>
+              <w:t>tl</w:t>
+            </w:r>
+            <w:r>
+              <w:rPr>
+                <w:rFonts w:ascii="Consolas" w:eastAsia="Times New Roman" w:hAnsi="Consolas" w:cs="Times New Roman"/>
+                <w:color w:val="D4D4D4"/>
+                <w:sz w:val="21"/>
+                <w:szCs w:val="21"/>
+              </w:rPr>
+              <w:t>.</w:t>
+            </w:r>
+            <w:r>
+              <w:rPr>
+                <w:rFonts w:ascii="Consolas" w:eastAsia="Times New Roman" w:hAnsi="Consolas" w:cs="Times New Roman"/>
+                <w:color w:val="D2A8FF"/>
+                <w:sz w:val="21"/>
+                <w:szCs w:val="21"/>
+              </w:rPr>
+              <w:t>to</w:t>
+            </w:r>
+            <w:r>
+              <w:rPr>
+                <w:rFonts w:ascii="Consolas" w:eastAsia="Times New Roman" w:hAnsi="Consolas" w:cs="Times New Roman"/>
+                <w:color w:val="D4D4D4"/>
+                <w:sz w:val="21"/>
+                <w:szCs w:val="21"/>
+              </w:rPr>
+              <w:t>(</w:t>
+            </w:r>
+            <w:r>
+              <w:rPr>
+                <w:rFonts w:ascii="Consolas" w:eastAsia="Times New Roman" w:hAnsi="Consolas" w:cs="Times New Roman"/>
+                <w:color w:val="A5D6FF"/>
+                <w:sz w:val="21"/>
+                <w:szCs w:val="21"/>
+              </w:rPr>
+              <w:t>".b3"</w:t>
+            </w:r>
+            <w:r>
+              <w:rPr>
+                <w:rFonts w:ascii="Consolas" w:eastAsia="Times New Roman" w:hAnsi="Consolas" w:cs="Times New Roman"/>
+                <w:color w:val="D4D4D4"/>
+                <w:sz w:val="21"/>
+                <w:szCs w:val="21"/>
+              </w:rPr>
+              <w:t>, {</w:t>
+            </w:r>
+          </w:p>
+          <w:p>
+            <w:pPr>
+              <w:shd w:val="clear" w:color="auto" w:fill="121314"/>
+              <w:spacing w:after="0" w:line="285" w:lineRule="atLeast"/>
+              <w:rPr>
+                <w:rFonts w:ascii="Consolas" w:eastAsia="Times New Roman" w:hAnsi="Consolas" w:cs="Times New Roman"/>
+                <w:color w:val="BBBEBF"/>
+                <w:sz w:val="21"/>
+                <w:szCs w:val="21"/>
+              </w:rPr>
+            </w:pPr>
+            <w:r>
+              <w:rPr>
+                <w:rFonts w:ascii="Consolas" w:eastAsia="Times New Roman" w:hAnsi="Consolas" w:cs="Times New Roman"/>
+                <w:color w:val="D4D4D4"/>
+                <w:sz w:val="21"/>
+                <w:szCs w:val="21"/>
+              </w:rPr>
+              <w:t xml:space="preserve">        </w:t>
+            </w:r>
+            <w:r>
+              <w:rPr>
+                <w:rFonts w:ascii="Consolas" w:eastAsia="Times New Roman" w:hAnsi="Consolas" w:cs="Times New Roman"/>
+                <w:color w:val="C9D1D9"/>
+                <w:sz w:val="21"/>
+                <w:szCs w:val="21"/>
+              </w:rPr>
+              <w:t>x</w:t>
+            </w:r>
+            <w:r>
+              <w:rPr>
+                <w:rFonts w:ascii="Consolas" w:eastAsia="Times New Roman" w:hAnsi="Consolas" w:cs="Times New Roman"/>
+                <w:color w:val="9CDCFE"/>
+                <w:sz w:val="21"/>
+                <w:szCs w:val="21"/>
+              </w:rPr>
+              <w:t>:</w:t>
+            </w:r>
+            <w:r>
+              <w:rPr>
+                <w:rFonts w:ascii="Consolas" w:eastAsia="Times New Roman" w:hAnsi="Consolas" w:cs="Times New Roman"/>
+                <w:color w:val="C9D1D9"/>
+                <w:sz w:val="21"/>
+                <w:szCs w:val="21"/>
+              </w:rPr>
+              <w:t xml:space="preserve"> </w:t>
+            </w:r>
+            <w:r>
+              <w:rPr>
+                <w:rFonts w:ascii="Consolas" w:eastAsia="Times New Roman" w:hAnsi="Consolas" w:cs="Times New Roman"/>
+                <w:color w:val="B5CEA8"/>
+                <w:sz w:val="21"/>
+                <w:szCs w:val="21"/>
+              </w:rPr>
+              <w:t>500</w:t>
+            </w:r>
+            <w:r>
+              <w:rPr>
+                <w:rFonts w:ascii="Consolas" w:eastAsia="Times New Roman" w:hAnsi="Consolas" w:cs="Times New Roman"/>
+                <w:color w:val="D4D4D4"/>
+                <w:sz w:val="21"/>
+                <w:szCs w:val="21"/>
+              </w:rPr>
+              <w:t>,</w:t>
+            </w:r>
+          </w:p>
+          <w:p>
+            <w:pPr>
+              <w:shd w:val="clear" w:color="auto" w:fill="121314"/>
+              <w:spacing w:after="0" w:line="285" w:lineRule="atLeast"/>
+              <w:rPr>
+                <w:rFonts w:ascii="Consolas" w:eastAsia="Times New Roman" w:hAnsi="Consolas" w:cs="Times New Roman"/>
+                <w:color w:val="BBBEBF"/>
+                <w:sz w:val="21"/>
+                <w:szCs w:val="21"/>
+              </w:rPr>
+            </w:pPr>
+            <w:r>
+              <w:rPr>
+                <w:rFonts w:ascii="Consolas" w:eastAsia="Times New Roman" w:hAnsi="Consolas" w:cs="Times New Roman"/>
+                <w:color w:val="D4D4D4"/>
+                <w:sz w:val="21"/>
+                <w:szCs w:val="21"/>
+              </w:rPr>
+              <w:t xml:space="preserve">        </w:t>
+            </w:r>
+            <w:r>
+              <w:rPr>
+                <w:rFonts w:ascii="Consolas" w:eastAsia="Times New Roman" w:hAnsi="Consolas" w:cs="Times New Roman"/>
+                <w:color w:val="C9D1D9"/>
+                <w:sz w:val="21"/>
+                <w:szCs w:val="21"/>
+              </w:rPr>
+              <w:t>duration</w:t>
+            </w:r>
+            <w:r>
+              <w:rPr>
+                <w:rFonts w:ascii="Consolas" w:eastAsia="Times New Roman" w:hAnsi="Consolas" w:cs="Times New Roman"/>
+                <w:color w:val="9CDCFE"/>
+                <w:sz w:val="21"/>
+                <w:szCs w:val="21"/>
+              </w:rPr>
+              <w:t>:</w:t>
+            </w:r>
+            <w:r>
+              <w:rPr>
+                <w:rFonts w:ascii="Consolas" w:eastAsia="Times New Roman" w:hAnsi="Consolas" w:cs="Times New Roman"/>
+                <w:color w:val="C9D1D9"/>
+                <w:sz w:val="21"/>
+                <w:szCs w:val="21"/>
+              </w:rPr>
+              <w:t xml:space="preserve"> </w:t>
+            </w:r>
+            <w:r>
+              <w:rPr>
+                <w:rFonts w:ascii="Consolas" w:eastAsia="Times New Roman" w:hAnsi="Consolas" w:cs="Times New Roman"/>
+                <w:color w:val="B5CEA8"/>
+                <w:sz w:val="21"/>
+                <w:szCs w:val="21"/>
+              </w:rPr>
+              <w:t>2</w:t>
+            </w:r>
+            <w:r>
+              <w:rPr>
+                <w:rFonts w:ascii="Consolas" w:eastAsia="Times New Roman" w:hAnsi="Consolas" w:cs="Times New Roman"/>
+                <w:color w:val="D4D4D4"/>
+                <w:sz w:val="21"/>
+                <w:szCs w:val="21"/>
+              </w:rPr>
+              <w:t>,</w:t>
+            </w:r>
+          </w:p>
+          <w:p>
+            <w:pPr>
+              <w:shd w:val="clear" w:color="auto" w:fill="121314"/>
+              <w:spacing w:after="0" w:line="285" w:lineRule="atLeast"/>
+              <w:rPr>
+                <w:rFonts w:ascii="Consolas" w:eastAsia="Times New Roman" w:hAnsi="Consolas" w:cs="Times New Roman"/>
+                <w:color w:val="BBBEBF"/>
+                <w:sz w:val="21"/>
+                <w:szCs w:val="21"/>
+              </w:rPr>
+            </w:pPr>
+            <w:r>
+              <w:rPr>
+                <w:rFonts w:ascii="Consolas" w:eastAsia="Times New Roman" w:hAnsi="Consolas" w:cs="Times New Roman"/>
+                <w:color w:val="D4D4D4"/>
+                <w:sz w:val="21"/>
+                <w:szCs w:val="21"/>
+              </w:rPr>
+              <w:t>      });</w:t>
+            </w:r>
+          </w:p>
+          <w:p>
+            <w:pPr>
+              <w:spacing w:after="0" w:line="240" w:lineRule="auto"/>
+              <w:rPr>
+                <w:rFonts w:ascii="Courier New" w:eastAsia="Times New Roman" w:hAnsi="Courier New" w:cs="Courier New"/>
+                <w:sz w:val="20"/>
+                <w:szCs w:val="20"/>
+              </w:rPr>
+            </w:pPr>
+          </w:p>
+        </w:tc>
+        <w:tc>
+          <w:tcPr>
+            <w:tcW w:w="0" w:type="auto"/>
+            <w:vAlign w:val="center"/>
+          </w:tcPr>
+          <w:p>
+            <w:pPr>
+              <w:spacing w:after="0" w:line="240" w:lineRule="auto"/>
+              <w:rPr>
+                <w:rFonts w:ascii="Times New Roman" w:eastAsia="Times New Roman" w:hAnsi="Times New Roman" w:cs="Times New Roman"/>
+                <w:sz w:val="24"/>
+                <w:szCs w:val="24"/>
+              </w:rPr>
+            </w:pPr>
+          </w:p>
+        </w:tc>
+      </w:tr>
+    </w:tbl>
+    <w:p>
+      <w:pPr>
+        <w:sectPr>
+          <w:type w:val="continuous"/>
+          <w:pgSz w:w="12240" w:h="15840"/>
+          <w:pgMar w:top="1440" w:right="1440" w:bottom="1440" w:left="1440" w:header="720" w:footer="720" w:gutter="0"/>
+          <w:cols w:num="2" w:space="720"/>
+          <w:docGrid w:linePitch="360"/>
+        </w:sectPr>
+      </w:pPr>
+    </w:p>
+    <w:p>
+      <w:r>
+        <w:lastRenderedPageBreak/>
+        <w:t xml:space="preserve">Hear b1, b2 and b3 – in b2 we can give top effect </w:t>
+      </w:r>
+    </w:p>
+    <w:p>
+      <w:r>
+        <w:t xml:space="preserve">If b1 have 5 sec </w:t>
+      </w:r>
+      <w:proofErr w:type="spellStart"/>
+      <w:r>
+        <w:t>animatin</w:t>
+      </w:r>
+      <w:proofErr w:type="spellEnd"/>
+      <w:r>
+        <w:t>.</w:t>
+      </w:r>
+      <w:r>
+        <w:t xml:space="preserve"> - },1,); - it mean b1 have 5 sec animation an</w:t>
+      </w:r>
+      <w:r>
+        <w:t>d</w:t>
+      </w:r>
+      <w:r>
+        <w:t xml:space="preserve"> b2 have 2 sec animation, b2 animation start after b1 1 sec animation.</w:t>
+      </w:r>
+    </w:p>
+    <w:p>
+      <w:r>
+        <w:t>B1 = _ _ _ _ _ this is our time</w:t>
+      </w:r>
+    </w:p>
+    <w:p>
+      <w:r>
+        <w:t xml:space="preserve">B2 =    _ _         animation like this – if </w:t>
+      </w:r>
+      <w:proofErr w:type="gramStart"/>
+      <w:r>
+        <w:t>b2  have</w:t>
+      </w:r>
+      <w:proofErr w:type="gramEnd"/>
+      <w:r>
+        <w:t xml:space="preserve"> 1</w:t>
+      </w:r>
+    </w:p>
+    <w:p>
+      <w:r>
+        <w:t>B2 =        _ _    if b2 have 2 – it start after 2 sec b1 animation happen.</w:t>
+      </w:r>
+    </w:p>
+    <w:p>
+      <w:pPr>
+        <w:shd w:val="clear" w:color="auto" w:fill="121314"/>
+        <w:spacing w:after="0" w:line="285" w:lineRule="atLeast"/>
+        <w:rPr>
+          <w:rFonts w:ascii="Consolas" w:eastAsia="Times New Roman" w:hAnsi="Consolas" w:cs="Times New Roman"/>
+          <w:color w:val="FF7B72"/>
+          <w:sz w:val="21"/>
+          <w:szCs w:val="21"/>
+        </w:rPr>
+        <w:sectPr>
+          <w:type w:val="continuous"/>
+          <w:pgSz w:w="12240" w:h="15840"/>
+          <w:pgMar w:top="1440" w:right="1440" w:bottom="1440" w:left="1440" w:header="720" w:footer="720" w:gutter="0"/>
+          <w:cols w:space="720"/>
+          <w:docGrid w:linePitch="360"/>
+        </w:sectPr>
+      </w:pPr>
+    </w:p>
+    <w:p>
+      <w:pPr>
+        <w:shd w:val="clear" w:color="auto" w:fill="121314"/>
+        <w:spacing w:after="0" w:line="285" w:lineRule="atLeast"/>
+        <w:rPr>
+          <w:rFonts w:ascii="Consolas" w:eastAsia="Times New Roman" w:hAnsi="Consolas" w:cs="Times New Roman"/>
+          <w:color w:val="BBBEBF"/>
+          <w:sz w:val="21"/>
+          <w:szCs w:val="21"/>
+        </w:rPr>
+      </w:pPr>
+      <w:proofErr w:type="spellStart"/>
+      <w:proofErr w:type="gramStart"/>
+      <w:r>
+        <w:rPr>
+          <w:rFonts w:ascii="Consolas" w:eastAsia="Times New Roman" w:hAnsi="Consolas" w:cs="Times New Roman"/>
+          <w:color w:val="FF7B72"/>
+          <w:sz w:val="21"/>
+          <w:szCs w:val="21"/>
+        </w:rPr>
+        <w:lastRenderedPageBreak/>
+        <w:t>const</w:t>
+      </w:r>
+      <w:proofErr w:type="spellEnd"/>
+      <w:proofErr w:type="gramEnd"/>
+      <w:r>
+        <w:rPr>
+          <w:rFonts w:ascii="Consolas" w:eastAsia="Times New Roman" w:hAnsi="Consolas" w:cs="Times New Roman"/>
+          <w:color w:val="D4D4D4"/>
+          <w:sz w:val="21"/>
+          <w:szCs w:val="21"/>
+        </w:rPr>
+        <w:t xml:space="preserve"> </w:t>
+      </w:r>
+      <w:proofErr w:type="spellStart"/>
+      <w:r>
+        <w:rPr>
+          <w:rFonts w:ascii="Consolas" w:eastAsia="Times New Roman" w:hAnsi="Consolas" w:cs="Times New Roman"/>
+          <w:color w:val="79C0FF"/>
+          <w:sz w:val="21"/>
+          <w:szCs w:val="21"/>
+        </w:rPr>
+        <w:t>tl</w:t>
+      </w:r>
+      <w:proofErr w:type="spellEnd"/>
+      <w:r>
+        <w:rPr>
+          <w:rFonts w:ascii="Consolas" w:eastAsia="Times New Roman" w:hAnsi="Consolas" w:cs="Times New Roman"/>
+          <w:color w:val="D4D4D4"/>
+          <w:sz w:val="21"/>
+          <w:szCs w:val="21"/>
+        </w:rPr>
+        <w:t xml:space="preserve"> = </w:t>
+      </w:r>
+      <w:proofErr w:type="spellStart"/>
+      <w:r>
+        <w:rPr>
+          <w:rFonts w:ascii="Consolas" w:eastAsia="Times New Roman" w:hAnsi="Consolas" w:cs="Times New Roman"/>
+          <w:color w:val="C9D1D9"/>
+          <w:sz w:val="21"/>
+          <w:szCs w:val="21"/>
+        </w:rPr>
+        <w:t>gsap</w:t>
+      </w:r>
+      <w:r>
+        <w:rPr>
+          <w:rFonts w:ascii="Consolas" w:eastAsia="Times New Roman" w:hAnsi="Consolas" w:cs="Times New Roman"/>
+          <w:color w:val="D4D4D4"/>
+          <w:sz w:val="21"/>
+          <w:szCs w:val="21"/>
+        </w:rPr>
+        <w:t>.</w:t>
+      </w:r>
+      <w:r>
+        <w:rPr>
+          <w:rFonts w:ascii="Consolas" w:eastAsia="Times New Roman" w:hAnsi="Consolas" w:cs="Times New Roman"/>
+          <w:color w:val="D2A8FF"/>
+          <w:sz w:val="21"/>
+          <w:szCs w:val="21"/>
+        </w:rPr>
+        <w:t>timeline</w:t>
+      </w:r>
+      <w:proofErr w:type="spellEnd"/>
+      <w:r>
+        <w:rPr>
+          <w:rFonts w:ascii="Consolas" w:eastAsia="Times New Roman" w:hAnsi="Consolas" w:cs="Times New Roman"/>
+          <w:color w:val="D4D4D4"/>
+          <w:sz w:val="21"/>
+          <w:szCs w:val="21"/>
+        </w:rPr>
+        <w:t>();</w:t>
+      </w:r>
+    </w:p>
+    <w:p>
+      <w:pPr>
+        <w:shd w:val="clear" w:color="auto" w:fill="121314"/>
+        <w:spacing w:after="0" w:line="285" w:lineRule="atLeast"/>
+        <w:rPr>
+          <w:rFonts w:ascii="Consolas" w:eastAsia="Times New Roman" w:hAnsi="Consolas" w:cs="Times New Roman"/>
+          <w:color w:val="BBBEBF"/>
+          <w:sz w:val="21"/>
+          <w:szCs w:val="21"/>
+        </w:rPr>
+      </w:pPr>
+      <w:r>
+        <w:rPr>
+          <w:rFonts w:ascii="Consolas" w:eastAsia="Times New Roman" w:hAnsi="Consolas" w:cs="Times New Roman"/>
+          <w:color w:val="D4D4D4"/>
+          <w:sz w:val="21"/>
+          <w:szCs w:val="21"/>
+        </w:rPr>
+        <w:t xml:space="preserve">      </w:t>
+      </w:r>
+      <w:proofErr w:type="gramStart"/>
+      <w:r>
+        <w:rPr>
+          <w:rFonts w:ascii="Consolas" w:eastAsia="Times New Roman" w:hAnsi="Consolas" w:cs="Times New Roman"/>
+          <w:color w:val="79C0FF"/>
+          <w:sz w:val="21"/>
+          <w:szCs w:val="21"/>
+        </w:rPr>
+        <w:t>tl</w:t>
+      </w:r>
+      <w:r>
+        <w:rPr>
+          <w:rFonts w:ascii="Consolas" w:eastAsia="Times New Roman" w:hAnsi="Consolas" w:cs="Times New Roman"/>
+          <w:color w:val="D4D4D4"/>
+          <w:sz w:val="21"/>
+          <w:szCs w:val="21"/>
+        </w:rPr>
+        <w:t>.</w:t>
+      </w:r>
+      <w:r>
+        <w:rPr>
+          <w:rFonts w:ascii="Consolas" w:eastAsia="Times New Roman" w:hAnsi="Consolas" w:cs="Times New Roman"/>
+          <w:color w:val="D2A8FF"/>
+          <w:sz w:val="21"/>
+          <w:szCs w:val="21"/>
+        </w:rPr>
+        <w:t>to</w:t>
+      </w:r>
+      <w:r>
+        <w:rPr>
+          <w:rFonts w:ascii="Consolas" w:eastAsia="Times New Roman" w:hAnsi="Consolas" w:cs="Times New Roman"/>
+          <w:color w:val="D4D4D4"/>
+          <w:sz w:val="21"/>
+          <w:szCs w:val="21"/>
+        </w:rPr>
+        <w:t>(</w:t>
+      </w:r>
+      <w:proofErr w:type="gramEnd"/>
+      <w:r>
+        <w:rPr>
+          <w:rFonts w:ascii="Consolas" w:eastAsia="Times New Roman" w:hAnsi="Consolas" w:cs="Times New Roman"/>
+          <w:color w:val="A5D6FF"/>
+          <w:sz w:val="21"/>
+          <w:szCs w:val="21"/>
+        </w:rPr>
+        <w:t>".b1"</w:t>
+      </w:r>
+      <w:r>
+        <w:rPr>
+          <w:rFonts w:ascii="Consolas" w:eastAsia="Times New Roman" w:hAnsi="Consolas" w:cs="Times New Roman"/>
+          <w:color w:val="D4D4D4"/>
+          <w:sz w:val="21"/>
+          <w:szCs w:val="21"/>
+        </w:rPr>
+        <w:t>, {</w:t>
+      </w:r>
+    </w:p>
+    <w:p>
+      <w:pPr>
+        <w:shd w:val="clear" w:color="auto" w:fill="121314"/>
+        <w:spacing w:after="0" w:line="285" w:lineRule="atLeast"/>
+        <w:rPr>
+          <w:rFonts w:ascii="Consolas" w:eastAsia="Times New Roman" w:hAnsi="Consolas" w:cs="Times New Roman"/>
+          <w:color w:val="BBBEBF"/>
+          <w:sz w:val="21"/>
+          <w:szCs w:val="21"/>
+        </w:rPr>
+      </w:pPr>
+      <w:r>
+        <w:rPr>
+          <w:rFonts w:ascii="Consolas" w:eastAsia="Times New Roman" w:hAnsi="Consolas" w:cs="Times New Roman"/>
+          <w:color w:val="D4D4D4"/>
+          <w:sz w:val="21"/>
+          <w:szCs w:val="21"/>
+        </w:rPr>
+        <w:t xml:space="preserve">        </w:t>
+      </w:r>
+      <w:proofErr w:type="gramStart"/>
+      <w:r>
+        <w:rPr>
+          <w:rFonts w:ascii="Consolas" w:eastAsia="Times New Roman" w:hAnsi="Consolas" w:cs="Times New Roman"/>
+          <w:color w:val="C9D1D9"/>
+          <w:sz w:val="21"/>
+          <w:szCs w:val="21"/>
+        </w:rPr>
+        <w:t>x</w:t>
+      </w:r>
+      <w:proofErr w:type="gramEnd"/>
+      <w:r>
+        <w:rPr>
+          <w:rFonts w:ascii="Consolas" w:eastAsia="Times New Roman" w:hAnsi="Consolas" w:cs="Times New Roman"/>
+          <w:color w:val="9CDCFE"/>
+          <w:sz w:val="21"/>
+          <w:szCs w:val="21"/>
+        </w:rPr>
+        <w:t>:</w:t>
+      </w:r>
+      <w:r>
+        <w:rPr>
+          <w:rFonts w:ascii="Consolas" w:eastAsia="Times New Roman" w:hAnsi="Consolas" w:cs="Times New Roman"/>
+          <w:color w:val="C9D1D9"/>
+          <w:sz w:val="21"/>
+          <w:szCs w:val="21"/>
+        </w:rPr>
+        <w:t xml:space="preserve"> </w:t>
+      </w:r>
+      <w:r>
+        <w:rPr>
+          <w:rFonts w:ascii="Consolas" w:eastAsia="Times New Roman" w:hAnsi="Consolas" w:cs="Times New Roman"/>
+          <w:color w:val="B5CEA8"/>
+          <w:sz w:val="21"/>
+          <w:szCs w:val="21"/>
+        </w:rPr>
+        <w:t>500</w:t>
+      </w:r>
+      <w:r>
+        <w:rPr>
+          <w:rFonts w:ascii="Consolas" w:eastAsia="Times New Roman" w:hAnsi="Consolas" w:cs="Times New Roman"/>
+          <w:color w:val="D4D4D4"/>
+          <w:sz w:val="21"/>
+          <w:szCs w:val="21"/>
+        </w:rPr>
+        <w:t>,</w:t>
+      </w:r>
+    </w:p>
+    <w:p>
+      <w:pPr>
+        <w:shd w:val="clear" w:color="auto" w:fill="121314"/>
+        <w:spacing w:after="0" w:line="285" w:lineRule="atLeast"/>
+        <w:rPr>
+          <w:rFonts w:ascii="Consolas" w:eastAsia="Times New Roman" w:hAnsi="Consolas" w:cs="Times New Roman"/>
+          <w:color w:val="BBBEBF"/>
+          <w:sz w:val="21"/>
+          <w:szCs w:val="21"/>
+        </w:rPr>
+      </w:pPr>
+      <w:r>
+        <w:rPr>
+          <w:rFonts w:ascii="Consolas" w:eastAsia="Times New Roman" w:hAnsi="Consolas" w:cs="Times New Roman"/>
+          <w:color w:val="D4D4D4"/>
+          <w:sz w:val="21"/>
+          <w:szCs w:val="21"/>
+        </w:rPr>
+        <w:t xml:space="preserve">        </w:t>
+      </w:r>
+      <w:proofErr w:type="gramStart"/>
+      <w:r>
+        <w:rPr>
+          <w:rFonts w:ascii="Consolas" w:eastAsia="Times New Roman" w:hAnsi="Consolas" w:cs="Times New Roman"/>
+          <w:color w:val="C9D1D9"/>
+          <w:sz w:val="21"/>
+          <w:szCs w:val="21"/>
+        </w:rPr>
+        <w:t>duration</w:t>
+      </w:r>
+      <w:proofErr w:type="gramEnd"/>
+      <w:r>
+        <w:rPr>
+          <w:rFonts w:ascii="Consolas" w:eastAsia="Times New Roman" w:hAnsi="Consolas" w:cs="Times New Roman"/>
+          <w:color w:val="9CDCFE"/>
+          <w:sz w:val="21"/>
+          <w:szCs w:val="21"/>
+        </w:rPr>
+        <w:t>:</w:t>
+      </w:r>
+      <w:r>
+        <w:rPr>
+          <w:rFonts w:ascii="Consolas" w:eastAsia="Times New Roman" w:hAnsi="Consolas" w:cs="Times New Roman"/>
+          <w:color w:val="C9D1D9"/>
+          <w:sz w:val="21"/>
+          <w:szCs w:val="21"/>
+        </w:rPr>
+        <w:t xml:space="preserve"> </w:t>
+      </w:r>
+      <w:r>
+        <w:rPr>
+          <w:rFonts w:ascii="Consolas" w:eastAsia="Times New Roman" w:hAnsi="Consolas" w:cs="Times New Roman"/>
+          <w:color w:val="B5CEA8"/>
+          <w:sz w:val="21"/>
+          <w:szCs w:val="21"/>
+        </w:rPr>
+        <w:t>4</w:t>
+      </w:r>
+      <w:r>
+        <w:rPr>
+          <w:rFonts w:ascii="Consolas" w:eastAsia="Times New Roman" w:hAnsi="Consolas" w:cs="Times New Roman"/>
+          <w:color w:val="D4D4D4"/>
+          <w:sz w:val="21"/>
+          <w:szCs w:val="21"/>
+        </w:rPr>
+        <w:t>,</w:t>
+      </w:r>
+    </w:p>
+    <w:p>
+      <w:pPr>
+        <w:shd w:val="clear" w:color="auto" w:fill="121314"/>
+        <w:spacing w:after="0" w:line="285" w:lineRule="atLeast"/>
+        <w:rPr>
+          <w:rFonts w:ascii="Consolas" w:eastAsia="Times New Roman" w:hAnsi="Consolas" w:cs="Times New Roman"/>
+          <w:color w:val="BBBEBF"/>
+          <w:sz w:val="21"/>
+          <w:szCs w:val="21"/>
+        </w:rPr>
+      </w:pPr>
+      <w:r>
+        <w:rPr>
+          <w:rFonts w:ascii="Consolas" w:eastAsia="Times New Roman" w:hAnsi="Consolas" w:cs="Times New Roman"/>
+          <w:color w:val="D4D4D4"/>
+          <w:sz w:val="21"/>
+          <w:szCs w:val="21"/>
+        </w:rPr>
+        <w:t>      });</w:t>
+      </w:r>
+    </w:p>
+    <w:p>
+      <w:pPr>
+        <w:shd w:val="clear" w:color="auto" w:fill="121314"/>
+        <w:spacing w:after="0" w:line="285" w:lineRule="atLeast"/>
+        <w:rPr>
+          <w:rFonts w:ascii="Consolas" w:eastAsia="Times New Roman" w:hAnsi="Consolas" w:cs="Times New Roman"/>
+          <w:color w:val="BBBEBF"/>
+          <w:sz w:val="21"/>
+          <w:szCs w:val="21"/>
+        </w:rPr>
+      </w:pPr>
+      <w:r>
+        <w:rPr>
+          <w:rFonts w:ascii="Consolas" w:eastAsia="Times New Roman" w:hAnsi="Consolas" w:cs="Times New Roman"/>
+          <w:color w:val="D4D4D4"/>
+          <w:sz w:val="21"/>
+          <w:szCs w:val="21"/>
+        </w:rPr>
+        <w:t xml:space="preserve">      </w:t>
+      </w:r>
+      <w:proofErr w:type="gramStart"/>
+      <w:r>
+        <w:rPr>
+          <w:rFonts w:ascii="Consolas" w:eastAsia="Times New Roman" w:hAnsi="Consolas" w:cs="Times New Roman"/>
+          <w:color w:val="79C0FF"/>
+          <w:sz w:val="21"/>
+          <w:szCs w:val="21"/>
+        </w:rPr>
+        <w:t>tl</w:t>
+      </w:r>
+      <w:r>
+        <w:rPr>
+          <w:rFonts w:ascii="Consolas" w:eastAsia="Times New Roman" w:hAnsi="Consolas" w:cs="Times New Roman"/>
+          <w:color w:val="D4D4D4"/>
+          <w:sz w:val="21"/>
+          <w:szCs w:val="21"/>
+        </w:rPr>
+        <w:t>.</w:t>
+      </w:r>
+      <w:r>
+        <w:rPr>
+          <w:rFonts w:ascii="Consolas" w:eastAsia="Times New Roman" w:hAnsi="Consolas" w:cs="Times New Roman"/>
+          <w:color w:val="D2A8FF"/>
+          <w:sz w:val="21"/>
+          <w:szCs w:val="21"/>
+        </w:rPr>
+        <w:t>to</w:t>
+      </w:r>
+      <w:r>
+        <w:rPr>
+          <w:rFonts w:ascii="Consolas" w:eastAsia="Times New Roman" w:hAnsi="Consolas" w:cs="Times New Roman"/>
+          <w:color w:val="D4D4D4"/>
+          <w:sz w:val="21"/>
+          <w:szCs w:val="21"/>
+        </w:rPr>
+        <w:t>(</w:t>
+      </w:r>
+      <w:proofErr w:type="gramEnd"/>
+    </w:p>
+    <w:p>
+      <w:pPr>
+        <w:shd w:val="clear" w:color="auto" w:fill="121314"/>
+        <w:spacing w:after="0" w:line="285" w:lineRule="atLeast"/>
+        <w:rPr>
+          <w:rFonts w:ascii="Consolas" w:eastAsia="Times New Roman" w:hAnsi="Consolas" w:cs="Times New Roman"/>
+          <w:color w:val="BBBEBF"/>
+          <w:sz w:val="21"/>
+          <w:szCs w:val="21"/>
+        </w:rPr>
+      </w:pPr>
+      <w:r>
+        <w:rPr>
+          <w:rFonts w:ascii="Consolas" w:eastAsia="Times New Roman" w:hAnsi="Consolas" w:cs="Times New Roman"/>
+          <w:color w:val="D4D4D4"/>
+          <w:sz w:val="21"/>
+          <w:szCs w:val="21"/>
+        </w:rPr>
+        <w:t xml:space="preserve">        </w:t>
+      </w:r>
+      <w:r>
+        <w:rPr>
+          <w:rFonts w:ascii="Consolas" w:eastAsia="Times New Roman" w:hAnsi="Consolas" w:cs="Times New Roman"/>
+          <w:color w:val="A5D6FF"/>
+          <w:sz w:val="21"/>
+          <w:szCs w:val="21"/>
+        </w:rPr>
+        <w:t>".b2"</w:t>
+      </w:r>
+      <w:r>
+        <w:rPr>
+          <w:rFonts w:ascii="Consolas" w:eastAsia="Times New Roman" w:hAnsi="Consolas" w:cs="Times New Roman"/>
+          <w:color w:val="D4D4D4"/>
+          <w:sz w:val="21"/>
+          <w:szCs w:val="21"/>
+        </w:rPr>
+        <w:t>,</w:t>
+      </w:r>
+    </w:p>
+    <w:p>
+      <w:pPr>
+        <w:shd w:val="clear" w:color="auto" w:fill="121314"/>
+        <w:spacing w:after="0" w:line="285" w:lineRule="atLeast"/>
+        <w:rPr>
+          <w:rFonts w:ascii="Consolas" w:eastAsia="Times New Roman" w:hAnsi="Consolas" w:cs="Times New Roman"/>
+          <w:color w:val="BBBEBF"/>
+          <w:sz w:val="21"/>
+          <w:szCs w:val="21"/>
+        </w:rPr>
+      </w:pPr>
+      <w:r>
+        <w:rPr>
+          <w:rFonts w:ascii="Consolas" w:eastAsia="Times New Roman" w:hAnsi="Consolas" w:cs="Times New Roman"/>
+          <w:color w:val="D4D4D4"/>
+          <w:sz w:val="21"/>
+          <w:szCs w:val="21"/>
+        </w:rPr>
+        <w:t>        {</w:t>
+      </w:r>
+    </w:p>
+    <w:p>
+      <w:pPr>
+        <w:shd w:val="clear" w:color="auto" w:fill="121314"/>
+        <w:spacing w:after="0" w:line="285" w:lineRule="atLeast"/>
+        <w:rPr>
+          <w:rFonts w:ascii="Consolas" w:eastAsia="Times New Roman" w:hAnsi="Consolas" w:cs="Times New Roman"/>
+          <w:color w:val="BBBEBF"/>
+          <w:sz w:val="21"/>
+          <w:szCs w:val="21"/>
+        </w:rPr>
+      </w:pPr>
+      <w:r>
+        <w:rPr>
+          <w:rFonts w:ascii="Consolas" w:eastAsia="Times New Roman" w:hAnsi="Consolas" w:cs="Times New Roman"/>
+          <w:color w:val="D4D4D4"/>
+          <w:sz w:val="21"/>
+          <w:szCs w:val="21"/>
+        </w:rPr>
+        <w:t xml:space="preserve">          </w:t>
+      </w:r>
+      <w:proofErr w:type="gramStart"/>
+      <w:r>
+        <w:rPr>
+          <w:rFonts w:ascii="Consolas" w:eastAsia="Times New Roman" w:hAnsi="Consolas" w:cs="Times New Roman"/>
+          <w:color w:val="C9D1D9"/>
+          <w:sz w:val="21"/>
+          <w:szCs w:val="21"/>
+        </w:rPr>
+        <w:t>x</w:t>
+      </w:r>
+      <w:proofErr w:type="gramEnd"/>
+      <w:r>
+        <w:rPr>
+          <w:rFonts w:ascii="Consolas" w:eastAsia="Times New Roman" w:hAnsi="Consolas" w:cs="Times New Roman"/>
+          <w:color w:val="9CDCFE"/>
+          <w:sz w:val="21"/>
+          <w:szCs w:val="21"/>
+        </w:rPr>
+        <w:t>:</w:t>
+      </w:r>
+      <w:r>
+        <w:rPr>
+          <w:rFonts w:ascii="Consolas" w:eastAsia="Times New Roman" w:hAnsi="Consolas" w:cs="Times New Roman"/>
+          <w:color w:val="C9D1D9"/>
+          <w:sz w:val="21"/>
+          <w:szCs w:val="21"/>
+        </w:rPr>
+        <w:t xml:space="preserve"> </w:t>
+      </w:r>
+      <w:r>
+        <w:rPr>
+          <w:rFonts w:ascii="Consolas" w:eastAsia="Times New Roman" w:hAnsi="Consolas" w:cs="Times New Roman"/>
+          <w:color w:val="B5CEA8"/>
+          <w:sz w:val="21"/>
+          <w:szCs w:val="21"/>
+        </w:rPr>
+        <w:t>500</w:t>
+      </w:r>
+      <w:r>
+        <w:rPr>
+          <w:rFonts w:ascii="Consolas" w:eastAsia="Times New Roman" w:hAnsi="Consolas" w:cs="Times New Roman"/>
+          <w:color w:val="D4D4D4"/>
+          <w:sz w:val="21"/>
+          <w:szCs w:val="21"/>
+        </w:rPr>
+        <w:t>,</w:t>
+      </w:r>
+    </w:p>
+    <w:p>
+      <w:pPr>
+        <w:shd w:val="clear" w:color="auto" w:fill="121314"/>
+        <w:spacing w:after="0" w:line="285" w:lineRule="atLeast"/>
+        <w:rPr>
+          <w:rFonts w:ascii="Consolas" w:eastAsia="Times New Roman" w:hAnsi="Consolas" w:cs="Times New Roman"/>
+          <w:color w:val="BBBEBF"/>
+          <w:sz w:val="21"/>
+          <w:szCs w:val="21"/>
+        </w:rPr>
+      </w:pPr>
+      <w:r>
+        <w:rPr>
+          <w:rFonts w:ascii="Consolas" w:eastAsia="Times New Roman" w:hAnsi="Consolas" w:cs="Times New Roman"/>
+          <w:color w:val="D4D4D4"/>
+          <w:sz w:val="21"/>
+          <w:szCs w:val="21"/>
+        </w:rPr>
+        <w:lastRenderedPageBreak/>
+        <w:t xml:space="preserve">          </w:t>
+      </w:r>
+      <w:proofErr w:type="gramStart"/>
+      <w:r>
+        <w:rPr>
+          <w:rFonts w:ascii="Consolas" w:eastAsia="Times New Roman" w:hAnsi="Consolas" w:cs="Times New Roman"/>
+          <w:color w:val="C9D1D9"/>
+          <w:sz w:val="21"/>
+          <w:szCs w:val="21"/>
+        </w:rPr>
+        <w:t>duration</w:t>
+      </w:r>
+      <w:proofErr w:type="gramEnd"/>
+      <w:r>
+        <w:rPr>
+          <w:rFonts w:ascii="Consolas" w:eastAsia="Times New Roman" w:hAnsi="Consolas" w:cs="Times New Roman"/>
+          <w:color w:val="9CDCFE"/>
+          <w:sz w:val="21"/>
+          <w:szCs w:val="21"/>
+        </w:rPr>
+        <w:t>:</w:t>
+      </w:r>
+      <w:r>
+        <w:rPr>
+          <w:rFonts w:ascii="Consolas" w:eastAsia="Times New Roman" w:hAnsi="Consolas" w:cs="Times New Roman"/>
+          <w:color w:val="C9D1D9"/>
+          <w:sz w:val="21"/>
+          <w:szCs w:val="21"/>
+        </w:rPr>
+        <w:t xml:space="preserve"> </w:t>
+      </w:r>
+      <w:r>
+        <w:rPr>
+          <w:rFonts w:ascii="Consolas" w:eastAsia="Times New Roman" w:hAnsi="Consolas" w:cs="Times New Roman"/>
+          <w:color w:val="B5CEA8"/>
+          <w:sz w:val="21"/>
+          <w:szCs w:val="21"/>
+        </w:rPr>
+        <w:t>2</w:t>
+      </w:r>
+      <w:r>
+        <w:rPr>
+          <w:rFonts w:ascii="Consolas" w:eastAsia="Times New Roman" w:hAnsi="Consolas" w:cs="Times New Roman"/>
+          <w:color w:val="D4D4D4"/>
+          <w:sz w:val="21"/>
+          <w:szCs w:val="21"/>
+        </w:rPr>
+        <w:t>,</w:t>
+      </w:r>
+    </w:p>
+    <w:p>
+      <w:pPr>
+        <w:shd w:val="clear" w:color="auto" w:fill="121314"/>
+        <w:spacing w:after="0" w:line="285" w:lineRule="atLeast"/>
+        <w:rPr>
+          <w:rFonts w:ascii="Consolas" w:eastAsia="Times New Roman" w:hAnsi="Consolas" w:cs="Times New Roman"/>
+          <w:color w:val="BBBEBF"/>
+          <w:sz w:val="21"/>
+          <w:szCs w:val="21"/>
+        </w:rPr>
+      </w:pPr>
+      <w:r>
+        <w:rPr>
+          <w:rFonts w:ascii="Consolas" w:eastAsia="Times New Roman" w:hAnsi="Consolas" w:cs="Times New Roman"/>
+          <w:color w:val="D4D4D4"/>
+          <w:sz w:val="21"/>
+          <w:szCs w:val="21"/>
+        </w:rPr>
+        <w:t>        },</w:t>
+      </w:r>
+    </w:p>
+    <w:p>
+      <w:pPr>
+        <w:shd w:val="clear" w:color="auto" w:fill="121314"/>
+        <w:spacing w:after="0" w:line="285" w:lineRule="atLeast"/>
+        <w:rPr>
+          <w:rFonts w:ascii="Consolas" w:eastAsia="Times New Roman" w:hAnsi="Consolas" w:cs="Times New Roman"/>
+          <w:color w:val="BBBEBF"/>
+          <w:sz w:val="21"/>
+          <w:szCs w:val="21"/>
+        </w:rPr>
+      </w:pPr>
+      <w:r>
+        <w:rPr>
+          <w:rFonts w:ascii="Consolas" w:eastAsia="Times New Roman" w:hAnsi="Consolas" w:cs="Times New Roman"/>
+          <w:color w:val="D4D4D4"/>
+          <w:sz w:val="21"/>
+          <w:szCs w:val="21"/>
+        </w:rPr>
+        <w:t xml:space="preserve">        </w:t>
+      </w:r>
+      <w:r>
+        <w:rPr>
+          <w:rFonts w:ascii="Consolas" w:eastAsia="Times New Roman" w:hAnsi="Consolas" w:cs="Times New Roman"/>
+          <w:color w:val="A5D6FF"/>
+          <w:sz w:val="21"/>
+          <w:szCs w:val="21"/>
+        </w:rPr>
+        <w:t>'-=1'</w:t>
+      </w:r>
+      <w:r>
+        <w:rPr>
+          <w:rFonts w:ascii="Consolas" w:eastAsia="Times New Roman" w:hAnsi="Consolas" w:cs="Times New Roman"/>
+          <w:color w:val="D4D4D4"/>
+          <w:sz w:val="21"/>
+          <w:szCs w:val="21"/>
+        </w:rPr>
+        <w:t>,</w:t>
+      </w:r>
+    </w:p>
+    <w:p>
+      <w:pPr>
+        <w:shd w:val="clear" w:color="auto" w:fill="121314"/>
+        <w:spacing w:after="0" w:line="285" w:lineRule="atLeast"/>
+        <w:rPr>
+          <w:rFonts w:ascii="Consolas" w:eastAsia="Times New Roman" w:hAnsi="Consolas" w:cs="Times New Roman"/>
+          <w:color w:val="BBBEBF"/>
+          <w:sz w:val="21"/>
+          <w:szCs w:val="21"/>
+        </w:rPr>
+      </w:pPr>
+      <w:r>
+        <w:rPr>
+          <w:rFonts w:ascii="Consolas" w:eastAsia="Times New Roman" w:hAnsi="Consolas" w:cs="Times New Roman"/>
+          <w:color w:val="D4D4D4"/>
+          <w:sz w:val="21"/>
+          <w:szCs w:val="21"/>
+        </w:rPr>
+        <w:t>      );</w:t>
+      </w:r>
+    </w:p>
+    <w:p>
+      <w:pPr>
+        <w:shd w:val="clear" w:color="auto" w:fill="121314"/>
+        <w:spacing w:after="0" w:line="285" w:lineRule="atLeast"/>
+        <w:rPr>
+          <w:rFonts w:ascii="Consolas" w:eastAsia="Times New Roman" w:hAnsi="Consolas" w:cs="Times New Roman"/>
+          <w:color w:val="BBBEBF"/>
+          <w:sz w:val="21"/>
+          <w:szCs w:val="21"/>
+        </w:rPr>
+      </w:pPr>
+      <w:r>
+        <w:rPr>
+          <w:rFonts w:ascii="Consolas" w:eastAsia="Times New Roman" w:hAnsi="Consolas" w:cs="Times New Roman"/>
+          <w:color w:val="D4D4D4"/>
+          <w:sz w:val="21"/>
+          <w:szCs w:val="21"/>
+        </w:rPr>
+        <w:t xml:space="preserve">      </w:t>
+      </w:r>
+      <w:proofErr w:type="gramStart"/>
+      <w:r>
+        <w:rPr>
+          <w:rFonts w:ascii="Consolas" w:eastAsia="Times New Roman" w:hAnsi="Consolas" w:cs="Times New Roman"/>
+          <w:color w:val="79C0FF"/>
+          <w:sz w:val="21"/>
+          <w:szCs w:val="21"/>
+        </w:rPr>
+        <w:t>tl</w:t>
+      </w:r>
+      <w:r>
+        <w:rPr>
+          <w:rFonts w:ascii="Consolas" w:eastAsia="Times New Roman" w:hAnsi="Consolas" w:cs="Times New Roman"/>
+          <w:color w:val="D4D4D4"/>
+          <w:sz w:val="21"/>
+          <w:szCs w:val="21"/>
+        </w:rPr>
+        <w:t>.</w:t>
+      </w:r>
+      <w:r>
+        <w:rPr>
+          <w:rFonts w:ascii="Consolas" w:eastAsia="Times New Roman" w:hAnsi="Consolas" w:cs="Times New Roman"/>
+          <w:color w:val="D2A8FF"/>
+          <w:sz w:val="21"/>
+          <w:szCs w:val="21"/>
+        </w:rPr>
+        <w:t>to</w:t>
+      </w:r>
+      <w:r>
+        <w:rPr>
+          <w:rFonts w:ascii="Consolas" w:eastAsia="Times New Roman" w:hAnsi="Consolas" w:cs="Times New Roman"/>
+          <w:color w:val="D4D4D4"/>
+          <w:sz w:val="21"/>
+          <w:szCs w:val="21"/>
+        </w:rPr>
+        <w:t>(</w:t>
+      </w:r>
+      <w:proofErr w:type="gramEnd"/>
+      <w:r>
+        <w:rPr>
+          <w:rFonts w:ascii="Consolas" w:eastAsia="Times New Roman" w:hAnsi="Consolas" w:cs="Times New Roman"/>
+          <w:color w:val="A5D6FF"/>
+          <w:sz w:val="21"/>
+          <w:szCs w:val="21"/>
+        </w:rPr>
+        <w:t>".b3"</w:t>
+      </w:r>
+      <w:r>
+        <w:rPr>
+          <w:rFonts w:ascii="Consolas" w:eastAsia="Times New Roman" w:hAnsi="Consolas" w:cs="Times New Roman"/>
+          <w:color w:val="D4D4D4"/>
+          <w:sz w:val="21"/>
+          <w:szCs w:val="21"/>
+        </w:rPr>
+        <w:t>, {</w:t>
+      </w:r>
+    </w:p>
+    <w:p>
+      <w:pPr>
+        <w:shd w:val="clear" w:color="auto" w:fill="121314"/>
+        <w:spacing w:after="0" w:line="285" w:lineRule="atLeast"/>
+        <w:rPr>
+          <w:rFonts w:ascii="Consolas" w:eastAsia="Times New Roman" w:hAnsi="Consolas" w:cs="Times New Roman"/>
+          <w:color w:val="BBBEBF"/>
+          <w:sz w:val="21"/>
+          <w:szCs w:val="21"/>
+        </w:rPr>
+      </w:pPr>
+      <w:r>
+        <w:rPr>
+          <w:rFonts w:ascii="Consolas" w:eastAsia="Times New Roman" w:hAnsi="Consolas" w:cs="Times New Roman"/>
+          <w:color w:val="D4D4D4"/>
+          <w:sz w:val="21"/>
+          <w:szCs w:val="21"/>
+        </w:rPr>
+        <w:t xml:space="preserve">        </w:t>
+      </w:r>
+      <w:proofErr w:type="gramStart"/>
+      <w:r>
+        <w:rPr>
+          <w:rFonts w:ascii="Consolas" w:eastAsia="Times New Roman" w:hAnsi="Consolas" w:cs="Times New Roman"/>
+          <w:color w:val="C9D1D9"/>
+          <w:sz w:val="21"/>
+          <w:szCs w:val="21"/>
+        </w:rPr>
+        <w:t>x</w:t>
+      </w:r>
+      <w:proofErr w:type="gramEnd"/>
+      <w:r>
+        <w:rPr>
+          <w:rFonts w:ascii="Consolas" w:eastAsia="Times New Roman" w:hAnsi="Consolas" w:cs="Times New Roman"/>
+          <w:color w:val="9CDCFE"/>
+          <w:sz w:val="21"/>
+          <w:szCs w:val="21"/>
+        </w:rPr>
+        <w:t>:</w:t>
+      </w:r>
+      <w:r>
+        <w:rPr>
+          <w:rFonts w:ascii="Consolas" w:eastAsia="Times New Roman" w:hAnsi="Consolas" w:cs="Times New Roman"/>
+          <w:color w:val="C9D1D9"/>
+          <w:sz w:val="21"/>
+          <w:szCs w:val="21"/>
+        </w:rPr>
+        <w:t xml:space="preserve"> </w:t>
+      </w:r>
+      <w:r>
+        <w:rPr>
+          <w:rFonts w:ascii="Consolas" w:eastAsia="Times New Roman" w:hAnsi="Consolas" w:cs="Times New Roman"/>
+          <w:color w:val="B5CEA8"/>
+          <w:sz w:val="21"/>
+          <w:szCs w:val="21"/>
+        </w:rPr>
+        <w:t>500</w:t>
+      </w:r>
+      <w:r>
+        <w:rPr>
+          <w:rFonts w:ascii="Consolas" w:eastAsia="Times New Roman" w:hAnsi="Consolas" w:cs="Times New Roman"/>
+          <w:color w:val="D4D4D4"/>
+          <w:sz w:val="21"/>
+          <w:szCs w:val="21"/>
+        </w:rPr>
+        <w:t>,</w:t>
+      </w:r>
+    </w:p>
+    <w:p>
+      <w:pPr>
+        <w:shd w:val="clear" w:color="auto" w:fill="121314"/>
+        <w:spacing w:after="0" w:line="285" w:lineRule="atLeast"/>
+        <w:rPr>
+          <w:rFonts w:ascii="Consolas" w:eastAsia="Times New Roman" w:hAnsi="Consolas" w:cs="Times New Roman"/>
+          <w:color w:val="BBBEBF"/>
+          <w:sz w:val="21"/>
+          <w:szCs w:val="21"/>
+        </w:rPr>
+      </w:pPr>
+      <w:r>
+        <w:rPr>
+          <w:rFonts w:ascii="Consolas" w:eastAsia="Times New Roman" w:hAnsi="Consolas" w:cs="Times New Roman"/>
+          <w:color w:val="D4D4D4"/>
+          <w:sz w:val="21"/>
+          <w:szCs w:val="21"/>
+        </w:rPr>
+        <w:t xml:space="preserve">        </w:t>
+      </w:r>
+      <w:proofErr w:type="gramStart"/>
+      <w:r>
+        <w:rPr>
+          <w:rFonts w:ascii="Consolas" w:eastAsia="Times New Roman" w:hAnsi="Consolas" w:cs="Times New Roman"/>
+          <w:color w:val="C9D1D9"/>
+          <w:sz w:val="21"/>
+          <w:szCs w:val="21"/>
+        </w:rPr>
+        <w:t>duration</w:t>
+      </w:r>
+      <w:proofErr w:type="gramEnd"/>
+      <w:r>
+        <w:rPr>
+          <w:rFonts w:ascii="Consolas" w:eastAsia="Times New Roman" w:hAnsi="Consolas" w:cs="Times New Roman"/>
+          <w:color w:val="9CDCFE"/>
+          <w:sz w:val="21"/>
+          <w:szCs w:val="21"/>
+        </w:rPr>
+        <w:t>:</w:t>
+      </w:r>
+      <w:r>
+        <w:rPr>
+          <w:rFonts w:ascii="Consolas" w:eastAsia="Times New Roman" w:hAnsi="Consolas" w:cs="Times New Roman"/>
+          <w:color w:val="C9D1D9"/>
+          <w:sz w:val="21"/>
+          <w:szCs w:val="21"/>
+        </w:rPr>
+        <w:t xml:space="preserve"> </w:t>
+      </w:r>
+      <w:r>
+        <w:rPr>
+          <w:rFonts w:ascii="Consolas" w:eastAsia="Times New Roman" w:hAnsi="Consolas" w:cs="Times New Roman"/>
+          <w:color w:val="B5CEA8"/>
+          <w:sz w:val="21"/>
+          <w:szCs w:val="21"/>
+        </w:rPr>
+        <w:t>2</w:t>
+      </w:r>
+      <w:r>
+        <w:rPr>
+          <w:rFonts w:ascii="Consolas" w:eastAsia="Times New Roman" w:hAnsi="Consolas" w:cs="Times New Roman"/>
+          <w:color w:val="D4D4D4"/>
+          <w:sz w:val="21"/>
+          <w:szCs w:val="21"/>
+        </w:rPr>
+        <w:t>,</w:t>
+      </w:r>
+    </w:p>
+    <w:p>
+      <w:pPr>
+        <w:shd w:val="clear" w:color="auto" w:fill="121314"/>
+        <w:spacing w:after="0" w:line="285" w:lineRule="atLeast"/>
+        <w:rPr>
+          <w:rFonts w:ascii="Consolas" w:eastAsia="Times New Roman" w:hAnsi="Consolas" w:cs="Times New Roman"/>
+          <w:color w:val="BBBEBF"/>
+          <w:sz w:val="21"/>
+          <w:szCs w:val="21"/>
+        </w:rPr>
+      </w:pPr>
+      <w:r>
+        <w:rPr>
+          <w:rFonts w:ascii="Consolas" w:eastAsia="Times New Roman" w:hAnsi="Consolas" w:cs="Times New Roman"/>
+          <w:color w:val="D4D4D4"/>
+          <w:sz w:val="21"/>
+          <w:szCs w:val="21"/>
+        </w:rPr>
+        <w:t>      });</w:t>
+      </w:r>
+    </w:p>
+    <w:p>
+      <w:pPr>
+        <w:sectPr>
+          <w:type w:val="continuous"/>
+          <w:pgSz w:w="12240" w:h="15840"/>
+          <w:pgMar w:top="1440" w:right="1440" w:bottom="1440" w:left="1440" w:header="720" w:footer="720" w:gutter="0"/>
+          <w:cols w:num="2" w:space="720"/>
+          <w:docGrid w:linePitch="360"/>
+        </w:sectPr>
+      </w:pPr>
+    </w:p>
+    <w:p/>
+    <w:p>
+      <w:r>
+        <w:t xml:space="preserve">If b1 have 5 sec </w:t>
+      </w:r>
+      <w:proofErr w:type="spellStart"/>
+      <w:r>
+        <w:t>animatin</w:t>
+      </w:r>
+      <w:proofErr w:type="spellEnd"/>
+      <w:r>
+        <w:t>. - },</w:t>
+      </w:r>
+      <w:r>
+        <w:t>’-=</w:t>
+      </w:r>
+      <w:r>
+        <w:t>1</w:t>
+      </w:r>
+      <w:r>
+        <w:t>’</w:t>
+      </w:r>
+      <w:r>
+        <w:t xml:space="preserve">,); - it mean b1 have 5 sec animation and b2 have 2 sec animation, b2 animation start after b1 </w:t>
+      </w:r>
+      <w:r>
+        <w:t>4</w:t>
+      </w:r>
+      <w:r>
+        <w:t xml:space="preserve"> sec animation.</w:t>
+      </w:r>
+      <w:r>
+        <w:t xml:space="preserve"> It mean it start animation before b1 </w:t>
+      </w:r>
+      <w:proofErr w:type="spellStart"/>
+      <w:r>
+        <w:t>animaton</w:t>
+      </w:r>
+      <w:proofErr w:type="spellEnd"/>
+      <w:r>
+        <w:t xml:space="preserve"> end 1 sec</w:t>
+      </w:r>
+    </w:p>
+    <w:p/>
+    <w:p>
+      <w:pPr>
+        <w:spacing w:after="0"/>
+      </w:pPr>
+      <w:r>
+        <w:lastRenderedPageBreak/>
+        <w:t>B1 = _ _ _ _ _ this is our time</w:t>
+      </w:r>
+    </w:p>
+    <w:p>
+      <w:pPr>
+        <w:spacing w:after="0"/>
+      </w:pPr>
+      <w:r>
+        <w:t xml:space="preserve">B2 =   </w:t>
+      </w:r>
+      <w:r>
+        <w:t xml:space="preserve">           </w:t>
+      </w:r>
+      <w:r>
+        <w:t xml:space="preserve">_ _         animation like this – if </w:t>
+      </w:r>
+      <w:proofErr w:type="gramStart"/>
+      <w:r>
+        <w:t>b2  have</w:t>
+      </w:r>
+      <w:proofErr w:type="gramEnd"/>
+      <w:r>
+        <w:t xml:space="preserve"> 1</w:t>
+      </w:r>
+    </w:p>
+    <w:p>
+      <w:pPr>
+        <w:spacing w:after="0"/>
+      </w:pPr>
+      <w:r>
+        <w:t xml:space="preserve">B2 =       </w:t>
+      </w:r>
+      <w:r>
+        <w:t xml:space="preserve">   </w:t>
+      </w:r>
+      <w:r>
+        <w:t xml:space="preserve"> _ _    if b2 have 2 – it start </w:t>
+      </w:r>
+      <w:r>
+        <w:t>before</w:t>
+      </w:r>
+      <w:r>
+        <w:t xml:space="preserve"> 2 sec b1 animation happen.</w:t>
+      </w:r>
+    </w:p>
+    <w:p>
+      <w:pPr>
+        <w:spacing w:after="0"/>
+      </w:pPr>
+    </w:p>
+    <w:p>
+      <w:pPr>
+        <w:shd w:val="clear" w:color="auto" w:fill="121314"/>
+        <w:spacing w:after="0" w:line="285" w:lineRule="atLeast"/>
+        <w:rPr>
+          <w:rFonts w:ascii="Consolas" w:eastAsia="Times New Roman" w:hAnsi="Consolas" w:cs="Times New Roman"/>
+          <w:color w:val="FF7B72"/>
+          <w:sz w:val="21"/>
+          <w:szCs w:val="21"/>
+        </w:rPr>
+        <w:sectPr>
+          <w:type w:val="continuous"/>
+          <w:pgSz w:w="12240" w:h="15840"/>
+          <w:pgMar w:top="1440" w:right="1440" w:bottom="1440" w:left="1440" w:header="720" w:footer="720" w:gutter="0"/>
+          <w:cols w:space="720"/>
+          <w:docGrid w:linePitch="360"/>
+        </w:sectPr>
+      </w:pPr>
+    </w:p>
+    <w:p>
+      <w:pPr>
+        <w:shd w:val="clear" w:color="auto" w:fill="121314"/>
+        <w:spacing w:after="0" w:line="285" w:lineRule="atLeast"/>
+        <w:rPr>
+          <w:rFonts w:ascii="Consolas" w:eastAsia="Times New Roman" w:hAnsi="Consolas" w:cs="Times New Roman"/>
+          <w:color w:val="BBBEBF"/>
+          <w:sz w:val="21"/>
+          <w:szCs w:val="21"/>
+        </w:rPr>
+      </w:pPr>
+      <w:proofErr w:type="spellStart"/>
+      <w:proofErr w:type="gramStart"/>
+      <w:r>
+        <w:rPr>
+          <w:rFonts w:ascii="Consolas" w:eastAsia="Times New Roman" w:hAnsi="Consolas" w:cs="Times New Roman"/>
+          <w:color w:val="FF7B72"/>
+          <w:sz w:val="21"/>
+          <w:szCs w:val="21"/>
+        </w:rPr>
+        <w:lastRenderedPageBreak/>
+        <w:t>const</w:t>
+      </w:r>
+      <w:proofErr w:type="spellEnd"/>
+      <w:proofErr w:type="gramEnd"/>
+      <w:r>
+        <w:rPr>
+          <w:rFonts w:ascii="Consolas" w:eastAsia="Times New Roman" w:hAnsi="Consolas" w:cs="Times New Roman"/>
+          <w:color w:val="D4D4D4"/>
+          <w:sz w:val="21"/>
+          <w:szCs w:val="21"/>
+        </w:rPr>
+        <w:t xml:space="preserve"> </w:t>
+      </w:r>
+      <w:proofErr w:type="spellStart"/>
+      <w:r>
+        <w:rPr>
+          <w:rFonts w:ascii="Consolas" w:eastAsia="Times New Roman" w:hAnsi="Consolas" w:cs="Times New Roman"/>
+          <w:color w:val="79C0FF"/>
+          <w:sz w:val="21"/>
+          <w:szCs w:val="21"/>
+        </w:rPr>
+        <w:t>tl</w:t>
+      </w:r>
+      <w:proofErr w:type="spellEnd"/>
+      <w:r>
+        <w:rPr>
+          <w:rFonts w:ascii="Consolas" w:eastAsia="Times New Roman" w:hAnsi="Consolas" w:cs="Times New Roman"/>
+          <w:color w:val="D4D4D4"/>
+          <w:sz w:val="21"/>
+          <w:szCs w:val="21"/>
+        </w:rPr>
+        <w:t xml:space="preserve"> = </w:t>
+      </w:r>
+      <w:proofErr w:type="spellStart"/>
+      <w:r>
+        <w:rPr>
+          <w:rFonts w:ascii="Consolas" w:eastAsia="Times New Roman" w:hAnsi="Consolas" w:cs="Times New Roman"/>
+          <w:color w:val="C9D1D9"/>
+          <w:sz w:val="21"/>
+          <w:szCs w:val="21"/>
+        </w:rPr>
+        <w:t>gsap</w:t>
+      </w:r>
+      <w:r>
+        <w:rPr>
+          <w:rFonts w:ascii="Consolas" w:eastAsia="Times New Roman" w:hAnsi="Consolas" w:cs="Times New Roman"/>
+          <w:color w:val="D4D4D4"/>
+          <w:sz w:val="21"/>
+          <w:szCs w:val="21"/>
+        </w:rPr>
+        <w:t>.</w:t>
+      </w:r>
+      <w:r>
+        <w:rPr>
+          <w:rFonts w:ascii="Consolas" w:eastAsia="Times New Roman" w:hAnsi="Consolas" w:cs="Times New Roman"/>
+          <w:color w:val="D2A8FF"/>
+          <w:sz w:val="21"/>
+          <w:szCs w:val="21"/>
+        </w:rPr>
+        <w:t>timeline</w:t>
+      </w:r>
+      <w:proofErr w:type="spellEnd"/>
+      <w:r>
+        <w:rPr>
+          <w:rFonts w:ascii="Consolas" w:eastAsia="Times New Roman" w:hAnsi="Consolas" w:cs="Times New Roman"/>
+          <w:color w:val="D4D4D4"/>
+          <w:sz w:val="21"/>
+          <w:szCs w:val="21"/>
+        </w:rPr>
+        <w:t>();</w:t>
+      </w:r>
+    </w:p>
+    <w:p>
+      <w:pPr>
+        <w:shd w:val="clear" w:color="auto" w:fill="121314"/>
+        <w:spacing w:after="0" w:line="285" w:lineRule="atLeast"/>
+        <w:rPr>
+          <w:rFonts w:ascii="Consolas" w:eastAsia="Times New Roman" w:hAnsi="Consolas" w:cs="Times New Roman"/>
+          <w:color w:val="BBBEBF"/>
+          <w:sz w:val="21"/>
+          <w:szCs w:val="21"/>
+        </w:rPr>
+      </w:pPr>
+      <w:r>
+        <w:rPr>
+          <w:rFonts w:ascii="Consolas" w:eastAsia="Times New Roman" w:hAnsi="Consolas" w:cs="Times New Roman"/>
+          <w:color w:val="D4D4D4"/>
+          <w:sz w:val="21"/>
+          <w:szCs w:val="21"/>
+        </w:rPr>
+        <w:t xml:space="preserve">      </w:t>
+      </w:r>
+      <w:proofErr w:type="gramStart"/>
+      <w:r>
+        <w:rPr>
+          <w:rFonts w:ascii="Consolas" w:eastAsia="Times New Roman" w:hAnsi="Consolas" w:cs="Times New Roman"/>
+          <w:color w:val="79C0FF"/>
+          <w:sz w:val="21"/>
+          <w:szCs w:val="21"/>
+        </w:rPr>
+        <w:t>tl</w:t>
+      </w:r>
+      <w:r>
+        <w:rPr>
+          <w:rFonts w:ascii="Consolas" w:eastAsia="Times New Roman" w:hAnsi="Consolas" w:cs="Times New Roman"/>
+          <w:color w:val="D4D4D4"/>
+          <w:sz w:val="21"/>
+          <w:szCs w:val="21"/>
+        </w:rPr>
+        <w:t>.</w:t>
+      </w:r>
+      <w:r>
+        <w:rPr>
+          <w:rFonts w:ascii="Consolas" w:eastAsia="Times New Roman" w:hAnsi="Consolas" w:cs="Times New Roman"/>
+          <w:color w:val="D2A8FF"/>
+          <w:sz w:val="21"/>
+          <w:szCs w:val="21"/>
+        </w:rPr>
+        <w:t>to</w:t>
+      </w:r>
+      <w:r>
+        <w:rPr>
+          <w:rFonts w:ascii="Consolas" w:eastAsia="Times New Roman" w:hAnsi="Consolas" w:cs="Times New Roman"/>
+          <w:color w:val="D4D4D4"/>
+          <w:sz w:val="21"/>
+          <w:szCs w:val="21"/>
+        </w:rPr>
+        <w:t>(</w:t>
+      </w:r>
+      <w:proofErr w:type="gramEnd"/>
+      <w:r>
+        <w:rPr>
+          <w:rFonts w:ascii="Consolas" w:eastAsia="Times New Roman" w:hAnsi="Consolas" w:cs="Times New Roman"/>
+          <w:color w:val="A5D6FF"/>
+          <w:sz w:val="21"/>
+          <w:szCs w:val="21"/>
+        </w:rPr>
+        <w:t>".b1"</w:t>
+      </w:r>
+      <w:r>
+        <w:rPr>
+          <w:rFonts w:ascii="Consolas" w:eastAsia="Times New Roman" w:hAnsi="Consolas" w:cs="Times New Roman"/>
+          <w:color w:val="D4D4D4"/>
+          <w:sz w:val="21"/>
+          <w:szCs w:val="21"/>
+        </w:rPr>
+        <w:t>, {</w:t>
+      </w:r>
+    </w:p>
+    <w:p>
+      <w:pPr>
+        <w:shd w:val="clear" w:color="auto" w:fill="121314"/>
+        <w:spacing w:after="0" w:line="285" w:lineRule="atLeast"/>
+        <w:rPr>
+          <w:rFonts w:ascii="Consolas" w:eastAsia="Times New Roman" w:hAnsi="Consolas" w:cs="Times New Roman"/>
+          <w:color w:val="BBBEBF"/>
+          <w:sz w:val="21"/>
+          <w:szCs w:val="21"/>
+        </w:rPr>
+      </w:pPr>
+      <w:r>
+        <w:rPr>
+          <w:rFonts w:ascii="Consolas" w:eastAsia="Times New Roman" w:hAnsi="Consolas" w:cs="Times New Roman"/>
+          <w:color w:val="D4D4D4"/>
+          <w:sz w:val="21"/>
+          <w:szCs w:val="21"/>
+        </w:rPr>
+        <w:t xml:space="preserve">        </w:t>
+      </w:r>
+      <w:proofErr w:type="gramStart"/>
+      <w:r>
+        <w:rPr>
+          <w:rFonts w:ascii="Consolas" w:eastAsia="Times New Roman" w:hAnsi="Consolas" w:cs="Times New Roman"/>
+          <w:color w:val="C9D1D9"/>
+          <w:sz w:val="21"/>
+          <w:szCs w:val="21"/>
+        </w:rPr>
+        <w:t>x</w:t>
+      </w:r>
+      <w:proofErr w:type="gramEnd"/>
+      <w:r>
+        <w:rPr>
+          <w:rFonts w:ascii="Consolas" w:eastAsia="Times New Roman" w:hAnsi="Consolas" w:cs="Times New Roman"/>
+          <w:color w:val="9CDCFE"/>
+          <w:sz w:val="21"/>
+          <w:szCs w:val="21"/>
+        </w:rPr>
+        <w:t>:</w:t>
+      </w:r>
+      <w:r>
+        <w:rPr>
+          <w:rFonts w:ascii="Consolas" w:eastAsia="Times New Roman" w:hAnsi="Consolas" w:cs="Times New Roman"/>
+          <w:color w:val="C9D1D9"/>
+          <w:sz w:val="21"/>
+          <w:szCs w:val="21"/>
+        </w:rPr>
+        <w:t xml:space="preserve"> </w:t>
+      </w:r>
+      <w:r>
+        <w:rPr>
+          <w:rFonts w:ascii="Consolas" w:eastAsia="Times New Roman" w:hAnsi="Consolas" w:cs="Times New Roman"/>
+          <w:color w:val="B5CEA8"/>
+          <w:sz w:val="21"/>
+          <w:szCs w:val="21"/>
+        </w:rPr>
+        <w:t>500</w:t>
+      </w:r>
+      <w:r>
+        <w:rPr>
+          <w:rFonts w:ascii="Consolas" w:eastAsia="Times New Roman" w:hAnsi="Consolas" w:cs="Times New Roman"/>
+          <w:color w:val="D4D4D4"/>
+          <w:sz w:val="21"/>
+          <w:szCs w:val="21"/>
+        </w:rPr>
+        <w:t>,</w:t>
+      </w:r>
+    </w:p>
+    <w:p>
+      <w:pPr>
+        <w:shd w:val="clear" w:color="auto" w:fill="121314"/>
+        <w:spacing w:after="0" w:line="285" w:lineRule="atLeast"/>
+        <w:rPr>
+          <w:rFonts w:ascii="Consolas" w:eastAsia="Times New Roman" w:hAnsi="Consolas" w:cs="Times New Roman"/>
+          <w:color w:val="BBBEBF"/>
+          <w:sz w:val="21"/>
+          <w:szCs w:val="21"/>
+        </w:rPr>
+      </w:pPr>
+      <w:r>
+        <w:rPr>
+          <w:rFonts w:ascii="Consolas" w:eastAsia="Times New Roman" w:hAnsi="Consolas" w:cs="Times New Roman"/>
+          <w:color w:val="D4D4D4"/>
+          <w:sz w:val="21"/>
+          <w:szCs w:val="21"/>
+        </w:rPr>
+        <w:t xml:space="preserve">        </w:t>
+      </w:r>
+      <w:proofErr w:type="gramStart"/>
+      <w:r>
+        <w:rPr>
+          <w:rFonts w:ascii="Consolas" w:eastAsia="Times New Roman" w:hAnsi="Consolas" w:cs="Times New Roman"/>
+          <w:color w:val="C9D1D9"/>
+          <w:sz w:val="21"/>
+          <w:szCs w:val="21"/>
+        </w:rPr>
+        <w:t>duration</w:t>
+      </w:r>
+      <w:proofErr w:type="gramEnd"/>
+      <w:r>
+        <w:rPr>
+          <w:rFonts w:ascii="Consolas" w:eastAsia="Times New Roman" w:hAnsi="Consolas" w:cs="Times New Roman"/>
+          <w:color w:val="9CDCFE"/>
+          <w:sz w:val="21"/>
+          <w:szCs w:val="21"/>
+        </w:rPr>
+        <w:t>:</w:t>
+      </w:r>
+      <w:r>
+        <w:rPr>
+          <w:rFonts w:ascii="Consolas" w:eastAsia="Times New Roman" w:hAnsi="Consolas" w:cs="Times New Roman"/>
+          <w:color w:val="C9D1D9"/>
+          <w:sz w:val="21"/>
+          <w:szCs w:val="21"/>
+        </w:rPr>
+        <w:t xml:space="preserve"> </w:t>
+      </w:r>
+      <w:r>
+        <w:rPr>
+          <w:rFonts w:ascii="Consolas" w:eastAsia="Times New Roman" w:hAnsi="Consolas" w:cs="Times New Roman"/>
+          <w:color w:val="B5CEA8"/>
+          <w:sz w:val="21"/>
+          <w:szCs w:val="21"/>
+        </w:rPr>
+        <w:t>4</w:t>
+      </w:r>
+      <w:r>
+        <w:rPr>
+          <w:rFonts w:ascii="Consolas" w:eastAsia="Times New Roman" w:hAnsi="Consolas" w:cs="Times New Roman"/>
+          <w:color w:val="D4D4D4"/>
+          <w:sz w:val="21"/>
+          <w:szCs w:val="21"/>
+        </w:rPr>
+        <w:t>,</w:t>
+      </w:r>
+    </w:p>
+    <w:p>
+      <w:pPr>
+        <w:shd w:val="clear" w:color="auto" w:fill="121314"/>
+        <w:spacing w:after="0" w:line="285" w:lineRule="atLeast"/>
+        <w:rPr>
+          <w:rFonts w:ascii="Consolas" w:eastAsia="Times New Roman" w:hAnsi="Consolas" w:cs="Times New Roman"/>
+          <w:color w:val="BBBEBF"/>
+          <w:sz w:val="21"/>
+          <w:szCs w:val="21"/>
+        </w:rPr>
+      </w:pPr>
+      <w:r>
+        <w:rPr>
+          <w:rFonts w:ascii="Consolas" w:eastAsia="Times New Roman" w:hAnsi="Consolas" w:cs="Times New Roman"/>
+          <w:color w:val="D4D4D4"/>
+          <w:sz w:val="21"/>
+          <w:szCs w:val="21"/>
+        </w:rPr>
+        <w:t>      });</w:t>
+      </w:r>
+    </w:p>
+    <w:p>
+      <w:pPr>
+        <w:shd w:val="clear" w:color="auto" w:fill="121314"/>
+        <w:spacing w:after="0" w:line="285" w:lineRule="atLeast"/>
+        <w:rPr>
+          <w:rFonts w:ascii="Consolas" w:eastAsia="Times New Roman" w:hAnsi="Consolas" w:cs="Times New Roman"/>
+          <w:color w:val="BBBEBF"/>
+          <w:sz w:val="21"/>
+          <w:szCs w:val="21"/>
+        </w:rPr>
+      </w:pPr>
+      <w:r>
+        <w:rPr>
+          <w:rFonts w:ascii="Consolas" w:eastAsia="Times New Roman" w:hAnsi="Consolas" w:cs="Times New Roman"/>
+          <w:color w:val="D4D4D4"/>
+          <w:sz w:val="21"/>
+          <w:szCs w:val="21"/>
+        </w:rPr>
+        <w:t xml:space="preserve">      </w:t>
+      </w:r>
+      <w:proofErr w:type="gramStart"/>
+      <w:r>
+        <w:rPr>
+          <w:rFonts w:ascii="Consolas" w:eastAsia="Times New Roman" w:hAnsi="Consolas" w:cs="Times New Roman"/>
+          <w:color w:val="79C0FF"/>
+          <w:sz w:val="21"/>
+          <w:szCs w:val="21"/>
+        </w:rPr>
+        <w:t>tl</w:t>
+      </w:r>
+      <w:r>
+        <w:rPr>
+          <w:rFonts w:ascii="Consolas" w:eastAsia="Times New Roman" w:hAnsi="Consolas" w:cs="Times New Roman"/>
+          <w:color w:val="D4D4D4"/>
+          <w:sz w:val="21"/>
+          <w:szCs w:val="21"/>
+        </w:rPr>
+        <w:t>.</w:t>
+      </w:r>
+      <w:r>
+        <w:rPr>
+          <w:rFonts w:ascii="Consolas" w:eastAsia="Times New Roman" w:hAnsi="Consolas" w:cs="Times New Roman"/>
+          <w:color w:val="D2A8FF"/>
+          <w:sz w:val="21"/>
+          <w:szCs w:val="21"/>
+        </w:rPr>
+        <w:t>to</w:t>
+      </w:r>
+      <w:r>
+        <w:rPr>
+          <w:rFonts w:ascii="Consolas" w:eastAsia="Times New Roman" w:hAnsi="Consolas" w:cs="Times New Roman"/>
+          <w:color w:val="D4D4D4"/>
+          <w:sz w:val="21"/>
+          <w:szCs w:val="21"/>
+        </w:rPr>
+        <w:t>(</w:t>
+      </w:r>
+      <w:proofErr w:type="gramEnd"/>
+    </w:p>
+    <w:p>
+      <w:pPr>
+        <w:shd w:val="clear" w:color="auto" w:fill="121314"/>
+        <w:spacing w:after="0" w:line="285" w:lineRule="atLeast"/>
+        <w:rPr>
+          <w:rFonts w:ascii="Consolas" w:eastAsia="Times New Roman" w:hAnsi="Consolas" w:cs="Times New Roman"/>
+          <w:color w:val="BBBEBF"/>
+          <w:sz w:val="21"/>
+          <w:szCs w:val="21"/>
+        </w:rPr>
+      </w:pPr>
+      <w:r>
+        <w:rPr>
+          <w:rFonts w:ascii="Consolas" w:eastAsia="Times New Roman" w:hAnsi="Consolas" w:cs="Times New Roman"/>
+          <w:color w:val="D4D4D4"/>
+          <w:sz w:val="21"/>
+          <w:szCs w:val="21"/>
+        </w:rPr>
+        <w:t xml:space="preserve">        </w:t>
+      </w:r>
+      <w:r>
+        <w:rPr>
+          <w:rFonts w:ascii="Consolas" w:eastAsia="Times New Roman" w:hAnsi="Consolas" w:cs="Times New Roman"/>
+          <w:color w:val="A5D6FF"/>
+          <w:sz w:val="21"/>
+          <w:szCs w:val="21"/>
+        </w:rPr>
+        <w:t>".b2"</w:t>
+      </w:r>
+      <w:r>
+        <w:rPr>
+          <w:rFonts w:ascii="Consolas" w:eastAsia="Times New Roman" w:hAnsi="Consolas" w:cs="Times New Roman"/>
+          <w:color w:val="D4D4D4"/>
+          <w:sz w:val="21"/>
+          <w:szCs w:val="21"/>
+        </w:rPr>
+        <w:t>,</w:t>
+      </w:r>
+    </w:p>
+    <w:p>
+      <w:pPr>
+        <w:shd w:val="clear" w:color="auto" w:fill="121314"/>
+        <w:spacing w:after="0" w:line="285" w:lineRule="atLeast"/>
+        <w:rPr>
+          <w:rFonts w:ascii="Consolas" w:eastAsia="Times New Roman" w:hAnsi="Consolas" w:cs="Times New Roman"/>
+          <w:color w:val="BBBEBF"/>
+          <w:sz w:val="21"/>
+          <w:szCs w:val="21"/>
+        </w:rPr>
+      </w:pPr>
+      <w:r>
+        <w:rPr>
+          <w:rFonts w:ascii="Consolas" w:eastAsia="Times New Roman" w:hAnsi="Consolas" w:cs="Times New Roman"/>
+          <w:color w:val="D4D4D4"/>
+          <w:sz w:val="21"/>
+          <w:szCs w:val="21"/>
+        </w:rPr>
+        <w:t>        {</w:t>
+      </w:r>
+    </w:p>
+    <w:p>
+      <w:pPr>
+        <w:shd w:val="clear" w:color="auto" w:fill="121314"/>
+        <w:spacing w:after="0" w:line="285" w:lineRule="atLeast"/>
+        <w:rPr>
+          <w:rFonts w:ascii="Consolas" w:eastAsia="Times New Roman" w:hAnsi="Consolas" w:cs="Times New Roman"/>
+          <w:color w:val="BBBEBF"/>
+          <w:sz w:val="21"/>
+          <w:szCs w:val="21"/>
+        </w:rPr>
+      </w:pPr>
+      <w:r>
+        <w:rPr>
+          <w:rFonts w:ascii="Consolas" w:eastAsia="Times New Roman" w:hAnsi="Consolas" w:cs="Times New Roman"/>
+          <w:color w:val="D4D4D4"/>
+          <w:sz w:val="21"/>
+          <w:szCs w:val="21"/>
+        </w:rPr>
+        <w:t xml:space="preserve">          </w:t>
+      </w:r>
+      <w:proofErr w:type="gramStart"/>
+      <w:r>
+        <w:rPr>
+          <w:rFonts w:ascii="Consolas" w:eastAsia="Times New Roman" w:hAnsi="Consolas" w:cs="Times New Roman"/>
+          <w:color w:val="C9D1D9"/>
+          <w:sz w:val="21"/>
+          <w:szCs w:val="21"/>
+        </w:rPr>
+        <w:t>x</w:t>
+      </w:r>
+      <w:proofErr w:type="gramEnd"/>
+      <w:r>
+        <w:rPr>
+          <w:rFonts w:ascii="Consolas" w:eastAsia="Times New Roman" w:hAnsi="Consolas" w:cs="Times New Roman"/>
+          <w:color w:val="9CDCFE"/>
+          <w:sz w:val="21"/>
+          <w:szCs w:val="21"/>
+        </w:rPr>
+        <w:t>:</w:t>
+      </w:r>
+      <w:r>
+        <w:rPr>
+          <w:rFonts w:ascii="Consolas" w:eastAsia="Times New Roman" w:hAnsi="Consolas" w:cs="Times New Roman"/>
+          <w:color w:val="C9D1D9"/>
+          <w:sz w:val="21"/>
+          <w:szCs w:val="21"/>
+        </w:rPr>
+        <w:t xml:space="preserve"> </w:t>
+      </w:r>
+      <w:r>
+        <w:rPr>
+          <w:rFonts w:ascii="Consolas" w:eastAsia="Times New Roman" w:hAnsi="Consolas" w:cs="Times New Roman"/>
+          <w:color w:val="B5CEA8"/>
+          <w:sz w:val="21"/>
+          <w:szCs w:val="21"/>
+        </w:rPr>
+        <w:t>500</w:t>
+      </w:r>
+      <w:r>
+        <w:rPr>
+          <w:rFonts w:ascii="Consolas" w:eastAsia="Times New Roman" w:hAnsi="Consolas" w:cs="Times New Roman"/>
+          <w:color w:val="D4D4D4"/>
+          <w:sz w:val="21"/>
+          <w:szCs w:val="21"/>
+        </w:rPr>
+        <w:t>,</w:t>
+      </w:r>
+    </w:p>
+    <w:p>
+      <w:pPr>
+        <w:shd w:val="clear" w:color="auto" w:fill="121314"/>
+        <w:spacing w:after="0" w:line="285" w:lineRule="atLeast"/>
+        <w:rPr>
+          <w:rFonts w:ascii="Consolas" w:eastAsia="Times New Roman" w:hAnsi="Consolas" w:cs="Times New Roman"/>
+          <w:color w:val="BBBEBF"/>
+          <w:sz w:val="21"/>
+          <w:szCs w:val="21"/>
+        </w:rPr>
+      </w:pPr>
+      <w:r>
+        <w:rPr>
+          <w:rFonts w:ascii="Consolas" w:eastAsia="Times New Roman" w:hAnsi="Consolas" w:cs="Times New Roman"/>
+          <w:color w:val="D4D4D4"/>
+          <w:sz w:val="21"/>
+          <w:szCs w:val="21"/>
+        </w:rPr>
+        <w:lastRenderedPageBreak/>
+        <w:t xml:space="preserve">          </w:t>
+      </w:r>
+      <w:proofErr w:type="gramStart"/>
+      <w:r>
+        <w:rPr>
+          <w:rFonts w:ascii="Consolas" w:eastAsia="Times New Roman" w:hAnsi="Consolas" w:cs="Times New Roman"/>
+          <w:color w:val="C9D1D9"/>
+          <w:sz w:val="21"/>
+          <w:szCs w:val="21"/>
+        </w:rPr>
+        <w:t>duration</w:t>
+      </w:r>
+      <w:proofErr w:type="gramEnd"/>
+      <w:r>
+        <w:rPr>
+          <w:rFonts w:ascii="Consolas" w:eastAsia="Times New Roman" w:hAnsi="Consolas" w:cs="Times New Roman"/>
+          <w:color w:val="9CDCFE"/>
+          <w:sz w:val="21"/>
+          <w:szCs w:val="21"/>
+        </w:rPr>
+        <w:t>:</w:t>
+      </w:r>
+      <w:r>
+        <w:rPr>
+          <w:rFonts w:ascii="Consolas" w:eastAsia="Times New Roman" w:hAnsi="Consolas" w:cs="Times New Roman"/>
+          <w:color w:val="C9D1D9"/>
+          <w:sz w:val="21"/>
+          <w:szCs w:val="21"/>
+        </w:rPr>
+        <w:t xml:space="preserve"> </w:t>
+      </w:r>
+      <w:r>
+        <w:rPr>
+          <w:rFonts w:ascii="Consolas" w:eastAsia="Times New Roman" w:hAnsi="Consolas" w:cs="Times New Roman"/>
+          <w:color w:val="B5CEA8"/>
+          <w:sz w:val="21"/>
+          <w:szCs w:val="21"/>
+        </w:rPr>
+        <w:t>2</w:t>
+      </w:r>
+      <w:r>
+        <w:rPr>
+          <w:rFonts w:ascii="Consolas" w:eastAsia="Times New Roman" w:hAnsi="Consolas" w:cs="Times New Roman"/>
+          <w:color w:val="D4D4D4"/>
+          <w:sz w:val="21"/>
+          <w:szCs w:val="21"/>
+        </w:rPr>
+        <w:t>,</w:t>
+      </w:r>
+    </w:p>
+    <w:p>
+      <w:pPr>
+        <w:shd w:val="clear" w:color="auto" w:fill="121314"/>
+        <w:spacing w:after="0" w:line="285" w:lineRule="atLeast"/>
+        <w:rPr>
+          <w:rFonts w:ascii="Consolas" w:eastAsia="Times New Roman" w:hAnsi="Consolas" w:cs="Times New Roman"/>
+          <w:color w:val="BBBEBF"/>
+          <w:sz w:val="21"/>
+          <w:szCs w:val="21"/>
+        </w:rPr>
+      </w:pPr>
+      <w:r>
+        <w:rPr>
+          <w:rFonts w:ascii="Consolas" w:eastAsia="Times New Roman" w:hAnsi="Consolas" w:cs="Times New Roman"/>
+          <w:color w:val="D4D4D4"/>
+          <w:sz w:val="21"/>
+          <w:szCs w:val="21"/>
+        </w:rPr>
+        <w:t>        },</w:t>
+      </w:r>
+    </w:p>
+    <w:p>
+      <w:pPr>
+        <w:shd w:val="clear" w:color="auto" w:fill="121314"/>
+        <w:spacing w:after="0" w:line="285" w:lineRule="atLeast"/>
+        <w:rPr>
+          <w:rFonts w:ascii="Consolas" w:eastAsia="Times New Roman" w:hAnsi="Consolas" w:cs="Times New Roman"/>
+          <w:color w:val="BBBEBF"/>
+          <w:sz w:val="21"/>
+          <w:szCs w:val="21"/>
+        </w:rPr>
+      </w:pPr>
+      <w:r>
+        <w:rPr>
+          <w:rFonts w:ascii="Consolas" w:eastAsia="Times New Roman" w:hAnsi="Consolas" w:cs="Times New Roman"/>
+          <w:color w:val="D4D4D4"/>
+          <w:sz w:val="21"/>
+          <w:szCs w:val="21"/>
+        </w:rPr>
+        <w:t xml:space="preserve">        </w:t>
+      </w:r>
+      <w:r>
+        <w:rPr>
+          <w:rFonts w:ascii="Consolas" w:eastAsia="Times New Roman" w:hAnsi="Consolas" w:cs="Times New Roman"/>
+          <w:color w:val="A5D6FF"/>
+          <w:sz w:val="21"/>
+          <w:szCs w:val="21"/>
+        </w:rPr>
+        <w:t>'+=1'</w:t>
+      </w:r>
+      <w:r>
+        <w:rPr>
+          <w:rFonts w:ascii="Consolas" w:eastAsia="Times New Roman" w:hAnsi="Consolas" w:cs="Times New Roman"/>
+          <w:color w:val="D4D4D4"/>
+          <w:sz w:val="21"/>
+          <w:szCs w:val="21"/>
+        </w:rPr>
+        <w:t>,</w:t>
+      </w:r>
+    </w:p>
+    <w:p>
+      <w:pPr>
+        <w:shd w:val="clear" w:color="auto" w:fill="121314"/>
+        <w:spacing w:after="0" w:line="285" w:lineRule="atLeast"/>
+        <w:rPr>
+          <w:rFonts w:ascii="Consolas" w:eastAsia="Times New Roman" w:hAnsi="Consolas" w:cs="Times New Roman"/>
+          <w:color w:val="BBBEBF"/>
+          <w:sz w:val="21"/>
+          <w:szCs w:val="21"/>
+        </w:rPr>
+      </w:pPr>
+      <w:r>
+        <w:rPr>
+          <w:rFonts w:ascii="Consolas" w:eastAsia="Times New Roman" w:hAnsi="Consolas" w:cs="Times New Roman"/>
+          <w:color w:val="D4D4D4"/>
+          <w:sz w:val="21"/>
+          <w:szCs w:val="21"/>
+        </w:rPr>
+        <w:t>      );</w:t>
+      </w:r>
+    </w:p>
+    <w:p>
+      <w:pPr>
+        <w:shd w:val="clear" w:color="auto" w:fill="121314"/>
+        <w:spacing w:after="0" w:line="285" w:lineRule="atLeast"/>
+        <w:rPr>
+          <w:rFonts w:ascii="Consolas" w:eastAsia="Times New Roman" w:hAnsi="Consolas" w:cs="Times New Roman"/>
+          <w:color w:val="BBBEBF"/>
+          <w:sz w:val="21"/>
+          <w:szCs w:val="21"/>
+        </w:rPr>
+      </w:pPr>
+      <w:r>
+        <w:rPr>
+          <w:rFonts w:ascii="Consolas" w:eastAsia="Times New Roman" w:hAnsi="Consolas" w:cs="Times New Roman"/>
+          <w:color w:val="D4D4D4"/>
+          <w:sz w:val="21"/>
+          <w:szCs w:val="21"/>
+        </w:rPr>
+        <w:t xml:space="preserve">      </w:t>
+      </w:r>
+      <w:proofErr w:type="gramStart"/>
+      <w:r>
+        <w:rPr>
+          <w:rFonts w:ascii="Consolas" w:eastAsia="Times New Roman" w:hAnsi="Consolas" w:cs="Times New Roman"/>
+          <w:color w:val="79C0FF"/>
+          <w:sz w:val="21"/>
+          <w:szCs w:val="21"/>
+        </w:rPr>
+        <w:t>tl</w:t>
+      </w:r>
+      <w:r>
+        <w:rPr>
+          <w:rFonts w:ascii="Consolas" w:eastAsia="Times New Roman" w:hAnsi="Consolas" w:cs="Times New Roman"/>
+          <w:color w:val="D4D4D4"/>
+          <w:sz w:val="21"/>
+          <w:szCs w:val="21"/>
+        </w:rPr>
+        <w:t>.</w:t>
+      </w:r>
+      <w:r>
+        <w:rPr>
+          <w:rFonts w:ascii="Consolas" w:eastAsia="Times New Roman" w:hAnsi="Consolas" w:cs="Times New Roman"/>
+          <w:color w:val="D2A8FF"/>
+          <w:sz w:val="21"/>
+          <w:szCs w:val="21"/>
+        </w:rPr>
+        <w:t>to</w:t>
+      </w:r>
+      <w:r>
+        <w:rPr>
+          <w:rFonts w:ascii="Consolas" w:eastAsia="Times New Roman" w:hAnsi="Consolas" w:cs="Times New Roman"/>
+          <w:color w:val="D4D4D4"/>
+          <w:sz w:val="21"/>
+          <w:szCs w:val="21"/>
+        </w:rPr>
+        <w:t>(</w:t>
+      </w:r>
+      <w:proofErr w:type="gramEnd"/>
+      <w:r>
+        <w:rPr>
+          <w:rFonts w:ascii="Consolas" w:eastAsia="Times New Roman" w:hAnsi="Consolas" w:cs="Times New Roman"/>
+          <w:color w:val="A5D6FF"/>
+          <w:sz w:val="21"/>
+          <w:szCs w:val="21"/>
+        </w:rPr>
+        <w:t>".b3"</w:t>
+      </w:r>
+      <w:r>
+        <w:rPr>
+          <w:rFonts w:ascii="Consolas" w:eastAsia="Times New Roman" w:hAnsi="Consolas" w:cs="Times New Roman"/>
+          <w:color w:val="D4D4D4"/>
+          <w:sz w:val="21"/>
+          <w:szCs w:val="21"/>
+        </w:rPr>
+        <w:t>, {</w:t>
+      </w:r>
+    </w:p>
+    <w:p>
+      <w:pPr>
+        <w:shd w:val="clear" w:color="auto" w:fill="121314"/>
+        <w:spacing w:after="0" w:line="285" w:lineRule="atLeast"/>
+        <w:rPr>
+          <w:rFonts w:ascii="Consolas" w:eastAsia="Times New Roman" w:hAnsi="Consolas" w:cs="Times New Roman"/>
+          <w:color w:val="BBBEBF"/>
+          <w:sz w:val="21"/>
+          <w:szCs w:val="21"/>
+        </w:rPr>
+      </w:pPr>
+      <w:r>
+        <w:rPr>
+          <w:rFonts w:ascii="Consolas" w:eastAsia="Times New Roman" w:hAnsi="Consolas" w:cs="Times New Roman"/>
+          <w:color w:val="D4D4D4"/>
+          <w:sz w:val="21"/>
+          <w:szCs w:val="21"/>
+        </w:rPr>
+        <w:t xml:space="preserve">        </w:t>
+      </w:r>
+      <w:proofErr w:type="gramStart"/>
+      <w:r>
+        <w:rPr>
+          <w:rFonts w:ascii="Consolas" w:eastAsia="Times New Roman" w:hAnsi="Consolas" w:cs="Times New Roman"/>
+          <w:color w:val="C9D1D9"/>
+          <w:sz w:val="21"/>
+          <w:szCs w:val="21"/>
+        </w:rPr>
+        <w:t>x</w:t>
+      </w:r>
+      <w:proofErr w:type="gramEnd"/>
+      <w:r>
+        <w:rPr>
+          <w:rFonts w:ascii="Consolas" w:eastAsia="Times New Roman" w:hAnsi="Consolas" w:cs="Times New Roman"/>
+          <w:color w:val="9CDCFE"/>
+          <w:sz w:val="21"/>
+          <w:szCs w:val="21"/>
+        </w:rPr>
+        <w:t>:</w:t>
+      </w:r>
+      <w:r>
+        <w:rPr>
+          <w:rFonts w:ascii="Consolas" w:eastAsia="Times New Roman" w:hAnsi="Consolas" w:cs="Times New Roman"/>
+          <w:color w:val="C9D1D9"/>
+          <w:sz w:val="21"/>
+          <w:szCs w:val="21"/>
+        </w:rPr>
+        <w:t xml:space="preserve"> </w:t>
+      </w:r>
+      <w:r>
+        <w:rPr>
+          <w:rFonts w:ascii="Consolas" w:eastAsia="Times New Roman" w:hAnsi="Consolas" w:cs="Times New Roman"/>
+          <w:color w:val="B5CEA8"/>
+          <w:sz w:val="21"/>
+          <w:szCs w:val="21"/>
+        </w:rPr>
+        <w:t>500</w:t>
+      </w:r>
+      <w:r>
+        <w:rPr>
+          <w:rFonts w:ascii="Consolas" w:eastAsia="Times New Roman" w:hAnsi="Consolas" w:cs="Times New Roman"/>
+          <w:color w:val="D4D4D4"/>
+          <w:sz w:val="21"/>
+          <w:szCs w:val="21"/>
+        </w:rPr>
+        <w:t>,</w:t>
+      </w:r>
+    </w:p>
+    <w:p>
+      <w:pPr>
+        <w:shd w:val="clear" w:color="auto" w:fill="121314"/>
+        <w:spacing w:after="0" w:line="285" w:lineRule="atLeast"/>
+        <w:rPr>
+          <w:rFonts w:ascii="Consolas" w:eastAsia="Times New Roman" w:hAnsi="Consolas" w:cs="Times New Roman"/>
+          <w:color w:val="BBBEBF"/>
+          <w:sz w:val="21"/>
+          <w:szCs w:val="21"/>
+        </w:rPr>
+      </w:pPr>
+      <w:r>
+        <w:rPr>
+          <w:rFonts w:ascii="Consolas" w:eastAsia="Times New Roman" w:hAnsi="Consolas" w:cs="Times New Roman"/>
+          <w:color w:val="D4D4D4"/>
+          <w:sz w:val="21"/>
+          <w:szCs w:val="21"/>
+        </w:rPr>
+        <w:t xml:space="preserve">        </w:t>
+      </w:r>
+      <w:proofErr w:type="gramStart"/>
+      <w:r>
+        <w:rPr>
+          <w:rFonts w:ascii="Consolas" w:eastAsia="Times New Roman" w:hAnsi="Consolas" w:cs="Times New Roman"/>
+          <w:color w:val="C9D1D9"/>
+          <w:sz w:val="21"/>
+          <w:szCs w:val="21"/>
+        </w:rPr>
+        <w:t>duration</w:t>
+      </w:r>
+      <w:proofErr w:type="gramEnd"/>
+      <w:r>
+        <w:rPr>
+          <w:rFonts w:ascii="Consolas" w:eastAsia="Times New Roman" w:hAnsi="Consolas" w:cs="Times New Roman"/>
+          <w:color w:val="9CDCFE"/>
+          <w:sz w:val="21"/>
+          <w:szCs w:val="21"/>
+        </w:rPr>
+        <w:t>:</w:t>
+      </w:r>
+      <w:r>
+        <w:rPr>
+          <w:rFonts w:ascii="Consolas" w:eastAsia="Times New Roman" w:hAnsi="Consolas" w:cs="Times New Roman"/>
+          <w:color w:val="C9D1D9"/>
+          <w:sz w:val="21"/>
+          <w:szCs w:val="21"/>
+        </w:rPr>
+        <w:t xml:space="preserve"> </w:t>
+      </w:r>
+      <w:r>
+        <w:rPr>
+          <w:rFonts w:ascii="Consolas" w:eastAsia="Times New Roman" w:hAnsi="Consolas" w:cs="Times New Roman"/>
+          <w:color w:val="B5CEA8"/>
+          <w:sz w:val="21"/>
+          <w:szCs w:val="21"/>
+        </w:rPr>
+        <w:t>2</w:t>
+      </w:r>
+      <w:r>
+        <w:rPr>
+          <w:rFonts w:ascii="Consolas" w:eastAsia="Times New Roman" w:hAnsi="Consolas" w:cs="Times New Roman"/>
+          <w:color w:val="D4D4D4"/>
+          <w:sz w:val="21"/>
+          <w:szCs w:val="21"/>
+        </w:rPr>
+        <w:t>,</w:t>
+      </w:r>
+    </w:p>
+    <w:p>
+      <w:pPr>
+        <w:shd w:val="clear" w:color="auto" w:fill="121314"/>
+        <w:spacing w:after="0" w:line="285" w:lineRule="atLeast"/>
+        <w:rPr>
+          <w:rFonts w:ascii="Consolas" w:eastAsia="Times New Roman" w:hAnsi="Consolas" w:cs="Times New Roman"/>
+          <w:color w:val="BBBEBF"/>
+          <w:sz w:val="21"/>
+          <w:szCs w:val="21"/>
+        </w:rPr>
+      </w:pPr>
+      <w:r>
+        <w:rPr>
+          <w:rFonts w:ascii="Consolas" w:eastAsia="Times New Roman" w:hAnsi="Consolas" w:cs="Times New Roman"/>
+          <w:color w:val="D4D4D4"/>
+          <w:sz w:val="21"/>
+          <w:szCs w:val="21"/>
+        </w:rPr>
+        <w:t>      });</w:t>
+      </w:r>
+    </w:p>
+    <w:p>
+      <w:pPr>
+        <w:spacing w:after="0"/>
+        <w:sectPr>
+          <w:type w:val="continuous"/>
+          <w:pgSz w:w="12240" w:h="15840"/>
+          <w:pgMar w:top="1440" w:right="1440" w:bottom="1440" w:left="1440" w:header="720" w:footer="720" w:gutter="0"/>
+          <w:cols w:num="2" w:space="720"/>
+          <w:docGrid w:linePitch="360"/>
+        </w:sectPr>
+      </w:pPr>
+    </w:p>
+    <w:p>
+      <w:pPr>
+        <w:spacing w:after="0"/>
+      </w:pPr>
+    </w:p>
+    <w:p>
+      <w:pPr>
+        <w:spacing w:after="0"/>
+      </w:pPr>
+      <w:r>
+        <w:t>B1 = _ _ _ _ _ this is our time</w:t>
+      </w:r>
+    </w:p>
+    <w:p>
+      <w:pPr>
+        <w:spacing w:after="0"/>
+      </w:pPr>
+      <w:r>
+        <w:t xml:space="preserve">B2 =              </w:t>
+      </w:r>
+      <w:r>
+        <w:t xml:space="preserve">     </w:t>
+      </w:r>
+      <w:r>
+        <w:t xml:space="preserve">_ _         animation like this – if </w:t>
+      </w:r>
+      <w:proofErr w:type="gramStart"/>
+      <w:r>
+        <w:t>b2  have</w:t>
+      </w:r>
+      <w:proofErr w:type="gramEnd"/>
+      <w:r>
+        <w:t xml:space="preserve"> 1</w:t>
+      </w:r>
+    </w:p>
+    <w:p>
+      <w:pPr>
+        <w:spacing w:after="0"/>
+      </w:pPr>
+      <w:r>
+        <w:t xml:space="preserve">B2 =           </w:t>
+      </w:r>
+      <w:r>
+        <w:t xml:space="preserve">            </w:t>
+      </w:r>
+      <w:r>
+        <w:t xml:space="preserve">_ _    if b2 have 2 – it start </w:t>
+      </w:r>
+      <w:r>
+        <w:t>after finish b1 animation then wait 2 sec and start – it is just like b2 have 2 sec delay</w:t>
+      </w:r>
+      <w:r>
+        <w:t>.</w:t>
+      </w:r>
+    </w:p>
+    <w:p>
+      <w:pPr>
+        <w:spacing w:after="0"/>
+      </w:pPr>
+      <w:r>
+        <w:t xml:space="preserve"> </w:t>
+      </w:r>
+    </w:p>
+    <w:p>
+      <w:pPr>
+        <w:spacing w:after="0"/>
+      </w:pPr>
+    </w:p>
+    <w:p>
+      <w:pPr>
+        <w:spacing w:after="0"/>
+      </w:pPr>
+      <w:r>
+        <w:rPr>
+          <w:rStyle w:val="t"/>
+        </w:rPr>
+        <w:t>tl</w:t>
+      </w:r>
+      <w:r>
+        <w:rPr>
+          <w:rStyle w:val="n"/>
+        </w:rPr>
+        <w:t>.</w:t>
+      </w:r>
+      <w:r>
+        <w:t>to(</w:t>
+      </w:r>
+      <w:r>
+        <w:rPr>
+          <w:rStyle w:val="r"/>
+        </w:rPr>
+        <w:t>".b1"</w:t>
+      </w:r>
+      <w:r>
+        <w:t xml:space="preserve">, { duration: </w:t>
+      </w:r>
+      <w:r>
+        <w:rPr>
+          <w:rStyle w:val="q"/>
+        </w:rPr>
+        <w:t>5</w:t>
+      </w:r>
+      <w:r>
+        <w:t xml:space="preserve"> });</w:t>
+      </w:r>
+      <w:r>
+        <w:br/>
+      </w:r>
+      <w:r>
+        <w:rPr>
+          <w:rStyle w:val="t"/>
+        </w:rPr>
+        <w:t>tl</w:t>
+      </w:r>
+      <w:r>
+        <w:rPr>
+          <w:rStyle w:val="n"/>
+        </w:rPr>
+        <w:t>.</w:t>
+      </w:r>
+      <w:r>
+        <w:t>to(</w:t>
+      </w:r>
+      <w:r>
+        <w:rPr>
+          <w:rStyle w:val="r"/>
+        </w:rPr>
+        <w:t>".b2"</w:t>
+      </w:r>
+      <w:r>
+        <w:t xml:space="preserve">, { duration: </w:t>
+      </w:r>
+      <w:r>
+        <w:rPr>
+          <w:rStyle w:val="q"/>
+        </w:rPr>
+        <w:t>2</w:t>
+      </w:r>
+      <w:r>
+        <w:t xml:space="preserve"> }, </w:t>
+      </w:r>
+      <w:r>
+        <w:rPr>
+          <w:rStyle w:val="r"/>
+        </w:rPr>
+        <w:t>"-=3"</w:t>
+      </w:r>
+      <w:r>
+        <w:t xml:space="preserve">); </w:t>
+      </w:r>
+      <w:r>
+        <w:rPr>
+          <w:rStyle w:val="l"/>
+        </w:rPr>
+        <w:t>// overlaps → ends at 5</w:t>
+      </w:r>
+      <w:r>
+        <w:br/>
+      </w:r>
+      <w:r>
+        <w:rPr>
+          <w:rStyle w:val="t"/>
+        </w:rPr>
+        <w:t>tl</w:t>
+      </w:r>
+      <w:r>
+        <w:rPr>
+          <w:rStyle w:val="n"/>
+        </w:rPr>
+        <w:t>.</w:t>
+      </w:r>
+      <w:r>
+        <w:t>to(</w:t>
+      </w:r>
+      <w:r>
+        <w:rPr>
+          <w:rStyle w:val="r"/>
+        </w:rPr>
+        <w:t>".b3"</w:t>
+      </w:r>
+      <w:r>
+        <w:t xml:space="preserve">, { duration: </w:t>
+      </w:r>
+      <w:r>
+        <w:rPr>
+          <w:rStyle w:val="q"/>
+        </w:rPr>
+        <w:t>2</w:t>
+      </w:r>
+      <w:r>
+        <w:t xml:space="preserve"> }, </w:t>
+      </w:r>
+      <w:r>
+        <w:rPr>
+          <w:rStyle w:val="r"/>
+        </w:rPr>
+        <w:t>"+=1"</w:t>
+      </w:r>
+      <w:r>
+        <w:t xml:space="preserve">); </w:t>
+      </w:r>
+      <w:r>
+        <w:rPr>
+          <w:rStyle w:val="l"/>
+        </w:rPr>
+        <w:t>// based on timeline end</w:t>
+      </w:r>
+      <w:r>
+        <w:br/>
+      </w:r>
+      <w:r>
+        <w:rPr>
+          <w:rStyle w:val="t"/>
+        </w:rPr>
+        <w:t>tl</w:t>
+      </w:r>
+      <w:r>
+        <w:rPr>
+          <w:rStyle w:val="n"/>
+        </w:rPr>
+        <w:t>.</w:t>
+      </w:r>
+      <w:r>
+        <w:t>to(</w:t>
+      </w:r>
+      <w:r>
+        <w:rPr>
+          <w:rStyle w:val="r"/>
+        </w:rPr>
+        <w:t>".b4"</w:t>
+      </w:r>
+      <w:r>
+        <w:t xml:space="preserve">, { duration: </w:t>
+      </w:r>
+      <w:r>
+        <w:rPr>
+          <w:rStyle w:val="q"/>
+        </w:rPr>
+        <w:t>2</w:t>
+      </w:r>
+      <w:r>
+        <w:t xml:space="preserve"> }, </w:t>
+      </w:r>
+      <w:r>
+        <w:rPr>
+          <w:rStyle w:val="r"/>
+        </w:rPr>
+        <w:t>"&gt;+=1"</w:t>
+      </w:r>
+      <w:r>
+        <w:t xml:space="preserve">); </w:t>
+      </w:r>
+      <w:r>
+        <w:rPr>
+          <w:rStyle w:val="l"/>
+        </w:rPr>
+        <w:t>// based on previous end</w:t>
+      </w:r>
+    </w:p>
+    <w:p>
+      <w:pPr>
+        <w:spacing w:after="0"/>
+      </w:pPr>
+    </w:p>
+    <w:p>
+      <w:pPr>
+        <w:spacing w:after="0"/>
+      </w:pPr>
+    </w:p>
+    <w:p/>
+    <w:p>
+      <w:r>
+        <w:br w:type="page"/>
+      </w:r>
+    </w:p>
+    <w:p/>
     <w:p>
       <w:pPr>
         <w:shd w:val="clear" w:color="auto" w:fill="0F0F0F"/>
@@ -5821,7 +9497,6 @@
           <w:sz w:val="30"/>
           <w:szCs w:val="30"/>
         </w:rPr>
-        <w:lastRenderedPageBreak/>
         <w:t>ScrollTrigger</w:t>
       </w:r>
       <w:proofErr w:type="spellEnd"/>
@@ -7528,10 +11203,13 @@
         </w:rPr>
         <w:t>});</w:t>
       </w:r>
+      <w:bookmarkStart w:id="0" w:name="_GoBack"/>
+      <w:bookmarkEnd w:id="0"/>
     </w:p>
     <w:sectPr>
+      <w:type w:val="continuous"/>
       <w:pgSz w:w="12240" w:h="15840"/>
-      <w:pgMar w:top="1440" w:right="1440" w:bottom="1440" w:left="1440" w:header="720" w:footer="720" w:gutter="0"/>
+      <w:pgMar w:top="144" w:right="1440" w:bottom="144" w:left="1440" w:header="720" w:footer="720" w:gutter="0"/>
       <w:cols w:space="720"/>
       <w:docGrid w:linePitch="360"/>
     </w:sectPr>
@@ -7932,6 +11610,7 @@
   <w:style w:type="paragraph" w:default="1" w:styleId="Normal">
     <w:name w:val="Normal"/>
     <w:qFormat/>
+    <w:rsid w:val="006B7D80"/>
   </w:style>
   <w:style w:type="paragraph" w:styleId="Heading1">
     <w:name w:val="heading 1"/>
@@ -7979,7 +11658,6 @@
   <w:style w:type="character" w:default="1" w:styleId="DefaultParagraphFont">
     <w:name w:val="Default Paragraph Font"/>
     <w:uiPriority w:val="1"/>
-    <w:semiHidden/>
     <w:unhideWhenUsed/>
   </w:style>
   <w:style w:type="table" w:default="1" w:styleId="TableNormal">
@@ -8084,6 +11762,44 @@
       <w:sz w:val="20"/>
       <w:szCs w:val="20"/>
     </w:rPr>
+  </w:style>
+  <w:style w:type="character" w:styleId="HTMLCode">
+    <w:name w:val="HTML Code"/>
+    <w:basedOn w:val="DefaultParagraphFont"/>
+    <w:uiPriority w:val="99"/>
+    <w:semiHidden/>
+    <w:unhideWhenUsed/>
+    <w:rsid w:val="00063E11"/>
+    <w:rPr>
+      <w:rFonts w:ascii="Courier New" w:eastAsia="Times New Roman" w:hAnsi="Courier New" w:cs="Courier New"/>
+      <w:sz w:val="20"/>
+      <w:szCs w:val="20"/>
+    </w:rPr>
+  </w:style>
+  <w:style w:type="character" w:customStyle="1" w:styleId="t">
+    <w:name w:val="ͼt"/>
+    <w:basedOn w:val="DefaultParagraphFont"/>
+    <w:rsid w:val="003E277F"/>
+  </w:style>
+  <w:style w:type="character" w:customStyle="1" w:styleId="n">
+    <w:name w:val="ͼn"/>
+    <w:basedOn w:val="DefaultParagraphFont"/>
+    <w:rsid w:val="003E277F"/>
+  </w:style>
+  <w:style w:type="character" w:customStyle="1" w:styleId="r">
+    <w:name w:val="ͼr"/>
+    <w:basedOn w:val="DefaultParagraphFont"/>
+    <w:rsid w:val="003E277F"/>
+  </w:style>
+  <w:style w:type="character" w:customStyle="1" w:styleId="q">
+    <w:name w:val="ͼq"/>
+    <w:basedOn w:val="DefaultParagraphFont"/>
+    <w:rsid w:val="003E277F"/>
+  </w:style>
+  <w:style w:type="character" w:customStyle="1" w:styleId="l">
+    <w:name w:val="ͼl"/>
+    <w:basedOn w:val="DefaultParagraphFont"/>
+    <w:rsid w:val="003E277F"/>
   </w:style>
 </w:styles>
 </file>

</xml_diff>

<commit_message>
gsap-1 - 1 finish
</commit_message>
<xml_diff>
--- a/gsap/GSAP.docx
+++ b/gsap/GSAP.docx
@@ -728,8 +728,10 @@
         <w:t>. It go and come back</w:t>
       </w:r>
     </w:p>
-    <w:p/>
-    <w:p>
+    <w:p>
+      <w:pPr>
+        <w:pStyle w:val="Heading1"/>
+      </w:pPr>
       <w:r>
         <w:t>Timeline</w:t>
       </w:r>
@@ -821,6 +823,7 @@
         <w:t xml:space="preserve"> </w:t>
       </w:r>
       <w:proofErr w:type="spellStart"/>
+      <w:proofErr w:type="gramStart"/>
       <w:r>
         <w:rPr>
           <w:rStyle w:val="token"/>
@@ -856,7 +859,17 @@
           <w:color w:val="C792EA"/>
           <w:shd w:val="clear" w:color="auto" w:fill="28292B"/>
         </w:rPr>
-        <w:t>();</w:t>
+        <w:t>(</w:t>
+      </w:r>
+      <w:proofErr w:type="gramEnd"/>
+      <w:r>
+        <w:rPr>
+          <w:rStyle w:val="token"/>
+          <w:rFonts w:ascii="Fraktion Mono" w:hAnsi="Fraktion Mono"/>
+          <w:color w:val="C792EA"/>
+          <w:shd w:val="clear" w:color="auto" w:fill="28292B"/>
+        </w:rPr>
+        <w:t>);</w:t>
       </w:r>
       <w:r>
         <w:rPr>
@@ -1378,6 +1391,63 @@
           <w:shd w:val="clear" w:color="auto" w:fill="28292B"/>
         </w:rPr>
       </w:pPr>
+      <w:proofErr w:type="spellStart"/>
+      <w:proofErr w:type="gramStart"/>
+      <w:r>
+        <w:rPr>
+          <w:rStyle w:val="t"/>
+        </w:rPr>
+        <w:t>timeline</w:t>
+      </w:r>
+      <w:r>
+        <w:rPr>
+          <w:rStyle w:val="n"/>
+        </w:rPr>
+        <w:t>.</w:t>
+      </w:r>
+      <w:r>
+        <w:t>timeScale</w:t>
+      </w:r>
+      <w:proofErr w:type="spellEnd"/>
+      <w:r>
+        <w:t>(</w:t>
+      </w:r>
+      <w:proofErr w:type="gramEnd"/>
+      <w:r>
+        <w:rPr>
+          <w:rStyle w:val="q"/>
+        </w:rPr>
+        <w:t>3</w:t>
+      </w:r>
+      <w:r>
+        <w:t>)</w:t>
+      </w:r>
+      <w:r>
+        <w:t xml:space="preserve"> – it make 3x faster animation</w:t>
+      </w:r>
+      <w:r>
+        <w:br/>
+      </w:r>
+      <w:proofErr w:type="spellStart"/>
+      <w:r>
+        <w:rPr>
+          <w:rStyle w:val="t"/>
+        </w:rPr>
+        <w:t>timeline</w:t>
+      </w:r>
+      <w:r>
+        <w:rPr>
+          <w:rStyle w:val="n"/>
+        </w:rPr>
+        <w:t>.</w:t>
+      </w:r>
+      <w:r>
+        <w:t>reverse</w:t>
+      </w:r>
+      <w:proofErr w:type="spellEnd"/>
+      <w:r>
+        <w:t>()</w:t>
+      </w:r>
     </w:p>
     <w:p>
       <w:pPr>
@@ -1399,8 +1469,21 @@
           <w:color w:val="9C9C9C"/>
           <w:shd w:val="clear" w:color="auto" w:fill="28292B"/>
         </w:rPr>
-        <w:t>//starts at EXACTLY .5 seconds from the start of the Timeline:</w:t>
-      </w:r>
+        <w:t>//starts at EXACTLY .5 seconds from the start of the Timeline</w:t>
+      </w:r>
+      <w:proofErr w:type="gramStart"/>
+      <w:r>
+        <w:rPr>
+          <w:rStyle w:val="token"/>
+          <w:rFonts w:ascii="Fraktion Mono" w:hAnsi="Fraktion Mono"/>
+          <w:i/>
+          <w:iCs/>
+          <w:color w:val="9C9C9C"/>
+          <w:shd w:val="clear" w:color="auto" w:fill="28292B"/>
+        </w:rPr>
+        <w:t>:</w:t>
+      </w:r>
+      <w:proofErr w:type="gramEnd"/>
       <w:r>
         <w:rPr>
           <w:rFonts w:ascii="Fraktion Mono" w:hAnsi="Fraktion Mono"/>
@@ -8177,28 +8260,7 @@
       </w:r>
       <w:proofErr w:type="spellEnd"/>
       <w:r>
-        <w:t>. - },</w:t>
-      </w:r>
-      <w:r>
-        <w:t>’-=</w:t>
-      </w:r>
-      <w:r>
-        <w:t>1</w:t>
-      </w:r>
-      <w:r>
-        <w:t>’</w:t>
-      </w:r>
-      <w:r>
-        <w:t xml:space="preserve">,); - it mean b1 have 5 sec animation and b2 have 2 sec animation, b2 animation start after b1 </w:t>
-      </w:r>
-      <w:r>
-        <w:t>4</w:t>
-      </w:r>
-      <w:r>
-        <w:t xml:space="preserve"> sec animation.</w:t>
-      </w:r>
-      <w:r>
-        <w:t xml:space="preserve"> It mean it start animation before b1 </w:t>
+        <w:t xml:space="preserve">. - },’-=1’,); - it mean b1 have 5 sec animation and b2 have 2 sec animation, b2 animation start after b1 4 sec animation. It mean it start animation before b1 </w:t>
       </w:r>
       <w:proofErr w:type="spellStart"/>
       <w:r>
@@ -8224,13 +8286,7 @@
         <w:spacing w:after="0"/>
       </w:pPr>
       <w:r>
-        <w:t xml:space="preserve">B2 =   </w:t>
-      </w:r>
-      <w:r>
-        <w:t xml:space="preserve">           </w:t>
-      </w:r>
-      <w:r>
-        <w:t xml:space="preserve">_ _         animation like this – if </w:t>
+        <w:t xml:space="preserve">B2 =              _ _         animation like this – if </w:t>
       </w:r>
       <w:proofErr w:type="gramStart"/>
       <w:r>
@@ -8246,13 +8302,7 @@
         <w:spacing w:after="0"/>
       </w:pPr>
       <w:r>
-        <w:t xml:space="preserve">B2 =       </w:t>
-      </w:r>
-      <w:r>
-        <w:t xml:space="preserve">   </w:t>
-      </w:r>
-      <w:r>
-        <w:t xml:space="preserve"> _ _    if b2 have 2 – it start </w:t>
+        <w:t xml:space="preserve">B2 =           _ _    if b2 have 2 – it start </w:t>
       </w:r>
       <w:r>
         <w:t>before</w:t>
@@ -9213,13 +9263,7 @@
         <w:spacing w:after="0"/>
       </w:pPr>
       <w:r>
-        <w:t xml:space="preserve">B2 =              </w:t>
-      </w:r>
-      <w:r>
-        <w:t xml:space="preserve">     </w:t>
-      </w:r>
-      <w:r>
-        <w:t xml:space="preserve">_ _         animation like this – if </w:t>
+        <w:t xml:space="preserve">B2 =                   _ _         animation like this – if </w:t>
       </w:r>
       <w:proofErr w:type="gramStart"/>
       <w:r>
@@ -9235,19 +9279,7 @@
         <w:spacing w:after="0"/>
       </w:pPr>
       <w:r>
-        <w:t xml:space="preserve">B2 =           </w:t>
-      </w:r>
-      <w:r>
-        <w:t xml:space="preserve">            </w:t>
-      </w:r>
-      <w:r>
-        <w:t xml:space="preserve">_ _    if b2 have 2 – it start </w:t>
-      </w:r>
-      <w:r>
-        <w:t>after finish b1 animation then wait 2 sec and start – it is just like b2 have 2 sec delay</w:t>
-      </w:r>
-      <w:r>
-        <w:t>.</w:t>
+        <w:t>B2 =                       _ _    if b2 have 2 – it start after finish b1 animation then wait 2 sec and start – it is just like b2 have 2 sec delay.</w:t>
       </w:r>
     </w:p>
     <w:p>
@@ -9473,43 +9505,14 @@
     <w:p/>
     <w:p>
       <w:pPr>
-        <w:shd w:val="clear" w:color="auto" w:fill="0F0F0F"/>
-        <w:spacing w:after="0" w:line="420" w:lineRule="atLeast"/>
-        <w:outlineLvl w:val="0"/>
-        <w:rPr>
-          <w:rFonts w:ascii="Arial" w:eastAsia="Times New Roman" w:hAnsi="Arial" w:cs="Arial"/>
-          <w:b/>
-          <w:bCs/>
-          <w:color w:val="F1F1F1"/>
-          <w:kern w:val="36"/>
-          <w:sz w:val="30"/>
-          <w:szCs w:val="30"/>
-        </w:rPr>
+        <w:pStyle w:val="Heading1"/>
       </w:pPr>
       <w:proofErr w:type="spellStart"/>
       <w:r>
-        <w:rPr>
-          <w:rFonts w:ascii="Arial" w:eastAsia="Times New Roman" w:hAnsi="Arial" w:cs="Arial"/>
-          <w:b/>
-          <w:bCs/>
-          <w:color w:val="F1F1F1"/>
-          <w:kern w:val="36"/>
-          <w:sz w:val="30"/>
-          <w:szCs w:val="30"/>
-        </w:rPr>
         <w:t>ScrollTrigger</w:t>
       </w:r>
       <w:proofErr w:type="spellEnd"/>
       <w:r>
-        <w:rPr>
-          <w:rFonts w:ascii="Arial" w:eastAsia="Times New Roman" w:hAnsi="Arial" w:cs="Arial"/>
-          <w:b/>
-          <w:bCs/>
-          <w:color w:val="F1F1F1"/>
-          <w:kern w:val="36"/>
-          <w:sz w:val="30"/>
-          <w:szCs w:val="30"/>
-        </w:rPr>
         <w:t> </w:t>
       </w:r>
     </w:p>
@@ -9790,23 +9793,17 @@
     <w:p>
       <w:pPr>
         <w:pStyle w:val="Heading2"/>
-        <w:shd w:val="clear" w:color="auto" w:fill="0E100F"/>
-        <w:spacing w:before="600" w:after="300"/>
-        <w:rPr>
-          <w:rFonts w:ascii="Arial" w:hAnsi="Arial" w:cs="Arial"/>
-          <w:color w:val="FFFCE1"/>
-          <w:sz w:val="41"/>
-          <w:szCs w:val="41"/>
-        </w:rPr>
       </w:pPr>
       <w:r>
-        <w:rPr>
-          <w:rFonts w:ascii="Arial" w:hAnsi="Arial" w:cs="Arial"/>
-          <w:color w:val="FFFCE1"/>
-          <w:sz w:val="41"/>
-          <w:szCs w:val="41"/>
-        </w:rPr>
-        <w:t>Simple example</w:t>
+        <w:t xml:space="preserve">Simple </w:t>
+      </w:r>
+      <w:r>
+        <w:t>exam</w:t>
+      </w:r>
+      <w:bookmarkStart w:id="0" w:name="_GoBack"/>
+      <w:bookmarkEnd w:id="0"/>
+      <w:r>
+        <w:t>ple</w:t>
       </w:r>
     </w:p>
     <w:p>
@@ -11203,8 +11200,6 @@
         </w:rPr>
         <w:t>});</w:t>
       </w:r>
-      <w:bookmarkStart w:id="0" w:name="_GoBack"/>
-      <w:bookmarkEnd w:id="0"/>
     </w:p>
     <w:sectPr>
       <w:type w:val="continuous"/>
@@ -11618,9 +11613,9 @@
     <w:link w:val="Heading1Char"/>
     <w:uiPriority w:val="9"/>
     <w:qFormat/>
-    <w:rsid w:val="000E7A53"/>
+    <w:rsid w:val="00DE3DB2"/>
     <w:pPr>
-      <w:spacing w:before="100" w:beforeAutospacing="1" w:after="100" w:afterAutospacing="1" w:line="240" w:lineRule="auto"/>
+      <w:spacing w:after="0" w:line="240" w:lineRule="auto"/>
       <w:outlineLvl w:val="0"/>
     </w:pPr>
     <w:rPr>
@@ -11628,7 +11623,7 @@
       <w:b/>
       <w:bCs/>
       <w:kern w:val="36"/>
-      <w:sz w:val="48"/>
+      <w:sz w:val="36"/>
       <w:szCs w:val="48"/>
     </w:rPr>
   </w:style>
@@ -11638,7 +11633,6 @@
     <w:next w:val="Normal"/>
     <w:link w:val="Heading2Char"/>
     <w:uiPriority w:val="9"/>
-    <w:semiHidden/>
     <w:unhideWhenUsed/>
     <w:qFormat/>
     <w:rsid w:val="00931962"/>
@@ -11658,6 +11652,7 @@
   <w:style w:type="character" w:default="1" w:styleId="DefaultParagraphFont">
     <w:name w:val="Default Paragraph Font"/>
     <w:uiPriority w:val="1"/>
+    <w:semiHidden/>
     <w:unhideWhenUsed/>
   </w:style>
   <w:style w:type="table" w:default="1" w:styleId="TableNormal">
@@ -11691,13 +11686,13 @@
     <w:basedOn w:val="DefaultParagraphFont"/>
     <w:link w:val="Heading1"/>
     <w:uiPriority w:val="9"/>
-    <w:rsid w:val="000E7A53"/>
+    <w:rsid w:val="00DE3DB2"/>
     <w:rPr>
       <w:rFonts w:ascii="Times New Roman" w:eastAsia="Times New Roman" w:hAnsi="Times New Roman" w:cs="Times New Roman"/>
       <w:b/>
       <w:bCs/>
       <w:kern w:val="36"/>
-      <w:sz w:val="48"/>
+      <w:sz w:val="36"/>
       <w:szCs w:val="48"/>
     </w:rPr>
   </w:style>
@@ -11706,7 +11701,6 @@
     <w:basedOn w:val="DefaultParagraphFont"/>
     <w:link w:val="Heading2"/>
     <w:uiPriority w:val="9"/>
-    <w:semiHidden/>
     <w:rsid w:val="00931962"/>
     <w:rPr>
       <w:rFonts w:asciiTheme="majorHAnsi" w:eastAsiaTheme="majorEastAsia" w:hAnsiTheme="majorHAnsi" w:cstheme="majorBidi"/>

</xml_diff>